<commit_message>
Add department QR codes and links
</commit_message>
<xml_diff>
--- a/Отделения/ԱՆՈԹԱՅԻՆ/ԱՆՈԹԱՅԻՆ շարժ.docx
+++ b/Отделения/ԱՆՈԹԱՅԻՆ/ԱՆՈԹԱՅԻՆ շարժ.docx
@@ -39,7 +39,34 @@
           <w:szCs w:val="18"/>
           <w:lang w:val="hy-AM" w:bidi="hy-AM"/>
         </w:rPr>
-        <w:t>Ամսաթիվ ____________________        Հերթապահ ____________________</w:t>
+        <w:t>Ամսաթիվ</w:t>
+      </w:r>
+      <w:r>
+        <w:rPr>
+          <w:rFonts w:ascii="Sylfaen" w:eastAsia="Sylfaen" w:hAnsi="Sylfaen" w:cs="Sylfaen"/>
+          <w:sz w:val="18"/>
+          <w:szCs w:val="18"/>
+          <w:lang w:val="hy-AM" w:bidi="hy-AM"/>
+        </w:rPr>
+        <w:t xml:space="preserve"> ____________________        </w:t>
+      </w:r>
+      <w:r>
+        <w:rPr>
+          <w:rFonts w:ascii="Sylfaen" w:eastAsia="Sylfaen" w:hAnsi="Sylfaen" w:cs="Sylfaen"/>
+          <w:sz w:val="18"/>
+          <w:szCs w:val="18"/>
+          <w:lang w:val="hy-AM" w:bidi="hy-AM"/>
+        </w:rPr>
+        <w:t>Հերթապահ</w:t>
+      </w:r>
+      <w:r>
+        <w:rPr>
+          <w:rFonts w:ascii="Sylfaen" w:eastAsia="Sylfaen" w:hAnsi="Sylfaen" w:cs="Sylfaen"/>
+          <w:sz w:val="18"/>
+          <w:szCs w:val="18"/>
+          <w:lang w:val="hy-AM" w:bidi="hy-AM"/>
+        </w:rPr>
+        <w:t xml:space="preserve"> ____________________</w:t>
       </w:r>
     </w:p>
     <w:tbl>
@@ -118,7 +145,29 @@
                 <w:szCs w:val="18"/>
                 <w:lang w:val="hy-AM" w:bidi="hy-AM"/>
               </w:rPr>
-              <w:t>Եղել է</w:t>
+              <w:t>Եղել</w:t>
+            </w:r>
+            <w:r>
+              <w:rPr>
+                <w:rFonts w:ascii="Sylfaen" w:eastAsia="Sylfaen" w:hAnsi="Sylfaen" w:cs="Sylfaen"/>
+                <w:b/>
+                <w:bCs/>
+                <w:sz w:val="18"/>
+                <w:szCs w:val="18"/>
+                <w:lang w:val="hy-AM" w:bidi="hy-AM"/>
+              </w:rPr>
+              <w:t xml:space="preserve"> </w:t>
+            </w:r>
+            <w:r>
+              <w:rPr>
+                <w:rFonts w:ascii="Sylfaen" w:eastAsia="Sylfaen" w:hAnsi="Sylfaen" w:cs="Sylfaen"/>
+                <w:b/>
+                <w:bCs/>
+                <w:sz w:val="18"/>
+                <w:szCs w:val="18"/>
+                <w:lang w:val="hy-AM" w:bidi="hy-AM"/>
+              </w:rPr>
+              <w:t>է</w:t>
             </w:r>
           </w:p>
         </w:tc>
@@ -146,7 +195,29 @@
                 <w:szCs w:val="18"/>
                 <w:lang w:val="hy-AM" w:bidi="hy-AM"/>
               </w:rPr>
-              <w:t>Ընդունվել է</w:t>
+              <w:t>Ընդունվել</w:t>
+            </w:r>
+            <w:r>
+              <w:rPr>
+                <w:rFonts w:ascii="Sylfaen" w:eastAsia="Sylfaen" w:hAnsi="Sylfaen" w:cs="Sylfaen"/>
+                <w:b/>
+                <w:bCs/>
+                <w:sz w:val="18"/>
+                <w:szCs w:val="18"/>
+                <w:lang w:val="hy-AM" w:bidi="hy-AM"/>
+              </w:rPr>
+              <w:t xml:space="preserve"> </w:t>
+            </w:r>
+            <w:r>
+              <w:rPr>
+                <w:rFonts w:ascii="Sylfaen" w:eastAsia="Sylfaen" w:hAnsi="Sylfaen" w:cs="Sylfaen"/>
+                <w:b/>
+                <w:bCs/>
+                <w:sz w:val="18"/>
+                <w:szCs w:val="18"/>
+                <w:lang w:val="hy-AM" w:bidi="hy-AM"/>
+              </w:rPr>
+              <w:t>է</w:t>
             </w:r>
           </w:p>
         </w:tc>
@@ -174,7 +245,29 @@
                 <w:szCs w:val="18"/>
                 <w:lang w:val="hy-AM" w:bidi="hy-AM"/>
               </w:rPr>
-              <w:t>Դ/Գ</w:t>
+              <w:t>Դ</w:t>
+            </w:r>
+            <w:r>
+              <w:rPr>
+                <w:rFonts w:ascii="Sylfaen" w:eastAsia="Sylfaen" w:hAnsi="Sylfaen" w:cs="Sylfaen"/>
+                <w:b/>
+                <w:bCs/>
+                <w:sz w:val="18"/>
+                <w:szCs w:val="18"/>
+                <w:lang w:val="hy-AM" w:bidi="hy-AM"/>
+              </w:rPr>
+              <w:t>/</w:t>
+            </w:r>
+            <w:r>
+              <w:rPr>
+                <w:rFonts w:ascii="Sylfaen" w:eastAsia="Sylfaen" w:hAnsi="Sylfaen" w:cs="Sylfaen"/>
+                <w:b/>
+                <w:bCs/>
+                <w:sz w:val="18"/>
+                <w:szCs w:val="18"/>
+                <w:lang w:val="hy-AM" w:bidi="hy-AM"/>
+              </w:rPr>
+              <w:t>Գ</w:t>
             </w:r>
           </w:p>
         </w:tc>
@@ -230,7 +323,29 @@
                 <w:szCs w:val="18"/>
                 <w:lang w:val="hy-AM" w:bidi="hy-AM"/>
               </w:rPr>
-              <w:t>Առկա է</w:t>
+              <w:t>Առկա</w:t>
+            </w:r>
+            <w:r>
+              <w:rPr>
+                <w:rFonts w:ascii="Sylfaen" w:eastAsia="Sylfaen" w:hAnsi="Sylfaen" w:cs="Sylfaen"/>
+                <w:b/>
+                <w:bCs/>
+                <w:sz w:val="18"/>
+                <w:szCs w:val="18"/>
+                <w:lang w:val="hy-AM" w:bidi="hy-AM"/>
+              </w:rPr>
+              <w:t xml:space="preserve"> </w:t>
+            </w:r>
+            <w:r>
+              <w:rPr>
+                <w:rFonts w:ascii="Sylfaen" w:eastAsia="Sylfaen" w:hAnsi="Sylfaen" w:cs="Sylfaen"/>
+                <w:b/>
+                <w:bCs/>
+                <w:sz w:val="18"/>
+                <w:szCs w:val="18"/>
+                <w:lang w:val="hy-AM" w:bidi="hy-AM"/>
+              </w:rPr>
+              <w:t>է</w:t>
             </w:r>
           </w:p>
         </w:tc>
@@ -258,7 +373,18 @@
                 <w:szCs w:val="18"/>
                 <w:lang w:val="hy-AM" w:bidi="hy-AM"/>
               </w:rPr>
-              <w:t xml:space="preserve">Բուժական </w:t>
+              <w:t>Բուժական</w:t>
+            </w:r>
+            <w:r>
+              <w:rPr>
+                <w:rFonts w:ascii="Sylfaen" w:eastAsia="Sylfaen" w:hAnsi="Sylfaen" w:cs="Sylfaen"/>
+                <w:b/>
+                <w:bCs/>
+                <w:sz w:val="18"/>
+                <w:szCs w:val="18"/>
+                <w:lang w:val="hy-AM" w:bidi="hy-AM"/>
+              </w:rPr>
+              <w:t xml:space="preserve"> </w:t>
             </w:r>
             <w:r>
               <w:rPr>
@@ -2406,7 +2532,25 @@
                 <w:bCs/>
                 <w:lang w:val="hy-AM" w:bidi="hy-AM"/>
               </w:rPr>
-              <w:t>Ընդունված հիվանդներ</w:t>
+              <w:t>Ընդունված</w:t>
+            </w:r>
+            <w:r>
+              <w:rPr>
+                <w:rFonts w:ascii="Sylfaen" w:eastAsia="Sylfaen" w:hAnsi="Sylfaen" w:cs="Sylfaen"/>
+                <w:b/>
+                <w:bCs/>
+                <w:lang w:val="hy-AM" w:bidi="hy-AM"/>
+              </w:rPr>
+              <w:t xml:space="preserve"> </w:t>
+            </w:r>
+            <w:r>
+              <w:rPr>
+                <w:rFonts w:ascii="Sylfaen" w:eastAsia="Sylfaen" w:hAnsi="Sylfaen" w:cs="Sylfaen"/>
+                <w:b/>
+                <w:bCs/>
+                <w:lang w:val="hy-AM" w:bidi="hy-AM"/>
+              </w:rPr>
+              <w:t>հիվանդներ</w:t>
             </w:r>
           </w:p>
           <w:p>
@@ -2485,7 +2629,43 @@
                 <w:bCs/>
                 <w:lang w:val="hy-AM" w:bidi="hy-AM"/>
               </w:rPr>
-              <w:t>Դուրս գրված հիվանդներ</w:t>
+              <w:t>Դուրս</w:t>
+            </w:r>
+            <w:r>
+              <w:rPr>
+                <w:rFonts w:ascii="Sylfaen" w:eastAsia="Sylfaen" w:hAnsi="Sylfaen" w:cs="Sylfaen"/>
+                <w:b/>
+                <w:bCs/>
+                <w:lang w:val="hy-AM" w:bidi="hy-AM"/>
+              </w:rPr>
+              <w:t xml:space="preserve"> </w:t>
+            </w:r>
+            <w:r>
+              <w:rPr>
+                <w:rFonts w:ascii="Sylfaen" w:eastAsia="Sylfaen" w:hAnsi="Sylfaen" w:cs="Sylfaen"/>
+                <w:b/>
+                <w:bCs/>
+                <w:lang w:val="hy-AM" w:bidi="hy-AM"/>
+              </w:rPr>
+              <w:t>գրված</w:t>
+            </w:r>
+            <w:r>
+              <w:rPr>
+                <w:rFonts w:ascii="Sylfaen" w:eastAsia="Sylfaen" w:hAnsi="Sylfaen" w:cs="Sylfaen"/>
+                <w:b/>
+                <w:bCs/>
+                <w:lang w:val="hy-AM" w:bidi="hy-AM"/>
+              </w:rPr>
+              <w:t xml:space="preserve"> </w:t>
+            </w:r>
+            <w:r>
+              <w:rPr>
+                <w:rFonts w:ascii="Sylfaen" w:eastAsia="Sylfaen" w:hAnsi="Sylfaen" w:cs="Sylfaen"/>
+                <w:b/>
+                <w:bCs/>
+                <w:lang w:val="hy-AM" w:bidi="hy-AM"/>
+              </w:rPr>
+              <w:t>հիվանդներ</w:t>
             </w:r>
           </w:p>
           <w:p>
@@ -2581,7 +2761,25 @@
                 <w:bCs/>
                 <w:lang w:val="hy-AM" w:bidi="hy-AM"/>
               </w:rPr>
-              <w:t>Տեղափոխված հիվանդներ</w:t>
+              <w:t>Տեղափոխված</w:t>
+            </w:r>
+            <w:r>
+              <w:rPr>
+                <w:rFonts w:ascii="Sylfaen" w:eastAsia="Sylfaen" w:hAnsi="Sylfaen" w:cs="Sylfaen"/>
+                <w:b/>
+                <w:bCs/>
+                <w:lang w:val="hy-AM" w:bidi="hy-AM"/>
+              </w:rPr>
+              <w:t xml:space="preserve"> </w:t>
+            </w:r>
+            <w:r>
+              <w:rPr>
+                <w:rFonts w:ascii="Sylfaen" w:eastAsia="Sylfaen" w:hAnsi="Sylfaen" w:cs="Sylfaen"/>
+                <w:b/>
+                <w:bCs/>
+                <w:lang w:val="hy-AM" w:bidi="hy-AM"/>
+              </w:rPr>
+              <w:t>հիվանդներ</w:t>
             </w:r>
           </w:p>
           <w:p>
@@ -2660,7 +2858,43 @@
                 <w:bCs/>
                 <w:lang w:val="hy-AM" w:bidi="hy-AM"/>
               </w:rPr>
-              <w:t>Վերադարձել են արձակուրդից</w:t>
+              <w:t>Վերադարձել</w:t>
+            </w:r>
+            <w:r>
+              <w:rPr>
+                <w:rFonts w:ascii="Sylfaen" w:eastAsia="Sylfaen" w:hAnsi="Sylfaen" w:cs="Sylfaen"/>
+                <w:b/>
+                <w:bCs/>
+                <w:lang w:val="hy-AM" w:bidi="hy-AM"/>
+              </w:rPr>
+              <w:t xml:space="preserve"> </w:t>
+            </w:r>
+            <w:r>
+              <w:rPr>
+                <w:rFonts w:ascii="Sylfaen" w:eastAsia="Sylfaen" w:hAnsi="Sylfaen" w:cs="Sylfaen"/>
+                <w:b/>
+                <w:bCs/>
+                <w:lang w:val="hy-AM" w:bidi="hy-AM"/>
+              </w:rPr>
+              <w:t>են</w:t>
+            </w:r>
+            <w:r>
+              <w:rPr>
+                <w:rFonts w:ascii="Sylfaen" w:eastAsia="Sylfaen" w:hAnsi="Sylfaen" w:cs="Sylfaen"/>
+                <w:b/>
+                <w:bCs/>
+                <w:lang w:val="hy-AM" w:bidi="hy-AM"/>
+              </w:rPr>
+              <w:t xml:space="preserve"> </w:t>
+            </w:r>
+            <w:r>
+              <w:rPr>
+                <w:rFonts w:ascii="Sylfaen" w:eastAsia="Sylfaen" w:hAnsi="Sylfaen" w:cs="Sylfaen"/>
+                <w:b/>
+                <w:bCs/>
+                <w:lang w:val="hy-AM" w:bidi="hy-AM"/>
+              </w:rPr>
+              <w:t>արձակուրդից</w:t>
             </w:r>
           </w:p>
           <w:p>
@@ -2744,7 +2978,34 @@
                 <w:bCs/>
                 <w:lang w:val="hy-AM" w:bidi="hy-AM"/>
               </w:rPr>
-              <w:t xml:space="preserve">Դուրս գրված </w:t>
+              <w:t>Դուրս</w:t>
+            </w:r>
+            <w:r>
+              <w:rPr>
+                <w:rFonts w:ascii="Sylfaen" w:eastAsia="Sylfaen" w:hAnsi="Sylfaen" w:cs="Sylfaen"/>
+                <w:b/>
+                <w:bCs/>
+                <w:lang w:val="hy-AM" w:bidi="hy-AM"/>
+              </w:rPr>
+              <w:t xml:space="preserve"> </w:t>
+            </w:r>
+            <w:r>
+              <w:rPr>
+                <w:rFonts w:ascii="Sylfaen" w:eastAsia="Sylfaen" w:hAnsi="Sylfaen" w:cs="Sylfaen"/>
+                <w:b/>
+                <w:bCs/>
+                <w:lang w:val="hy-AM" w:bidi="hy-AM"/>
+              </w:rPr>
+              <w:t>գրված</w:t>
+            </w:r>
+            <w:r>
+              <w:rPr>
+                <w:rFonts w:ascii="Sylfaen" w:eastAsia="Sylfaen" w:hAnsi="Sylfaen" w:cs="Sylfaen"/>
+                <w:b/>
+                <w:bCs/>
+                <w:lang w:val="hy-AM" w:bidi="hy-AM"/>
+              </w:rPr>
+              <w:t xml:space="preserve"> </w:t>
             </w:r>
             <w:r>
               <w:rPr>
@@ -2834,6 +3095,7 @@
                 <w:rFonts w:ascii="Sylfaen" w:eastAsia="Sylfaen" w:hAnsi="Sylfaen" w:cs="Sylfaen"/>
                 <w:lang w:val="hy-AM" w:bidi="hy-AM"/>
               </w:rPr>
+              <w:lastRenderedPageBreak/>
               <w:t>3. ________________________________________________</w:t>
             </w:r>
           </w:p>
@@ -2877,7 +3139,44 @@
                 <w:bCs/>
                 <w:lang w:val="hy-AM" w:bidi="hy-AM"/>
               </w:rPr>
-              <w:t>Գնացել են արձակուրդ</w:t>
+              <w:lastRenderedPageBreak/>
+              <w:t>Գնացել</w:t>
+            </w:r>
+            <w:r>
+              <w:rPr>
+                <w:rFonts w:ascii="Sylfaen" w:eastAsia="Sylfaen" w:hAnsi="Sylfaen" w:cs="Sylfaen"/>
+                <w:b/>
+                <w:bCs/>
+                <w:lang w:val="hy-AM" w:bidi="hy-AM"/>
+              </w:rPr>
+              <w:t xml:space="preserve"> </w:t>
+            </w:r>
+            <w:r>
+              <w:rPr>
+                <w:rFonts w:ascii="Sylfaen" w:eastAsia="Sylfaen" w:hAnsi="Sylfaen" w:cs="Sylfaen"/>
+                <w:b/>
+                <w:bCs/>
+                <w:lang w:val="hy-AM" w:bidi="hy-AM"/>
+              </w:rPr>
+              <w:t>են</w:t>
+            </w:r>
+            <w:r>
+              <w:rPr>
+                <w:rFonts w:ascii="Sylfaen" w:eastAsia="Sylfaen" w:hAnsi="Sylfaen" w:cs="Sylfaen"/>
+                <w:b/>
+                <w:bCs/>
+                <w:lang w:val="hy-AM" w:bidi="hy-AM"/>
+              </w:rPr>
+              <w:t xml:space="preserve"> </w:t>
+            </w:r>
+            <w:r>
+              <w:rPr>
+                <w:rFonts w:ascii="Sylfaen" w:eastAsia="Sylfaen" w:hAnsi="Sylfaen" w:cs="Sylfaen"/>
+                <w:b/>
+                <w:bCs/>
+                <w:lang w:val="hy-AM" w:bidi="hy-AM"/>
+              </w:rPr>
+              <w:t>արձակուրդ</w:t>
             </w:r>
           </w:p>
           <w:p>
@@ -2913,6 +3212,7 @@
                 <w:rFonts w:ascii="Sylfaen" w:eastAsia="Sylfaen" w:hAnsi="Sylfaen" w:cs="Sylfaen"/>
                 <w:lang w:val="hy-AM" w:bidi="hy-AM"/>
               </w:rPr>
+              <w:lastRenderedPageBreak/>
               <w:t>3. ________________________________________________</w:t>
             </w:r>
           </w:p>
@@ -2952,12 +3252,174 @@
       </w:pPr>
     </w:p>
     <w:sectPr>
+      <w:headerReference w:type="even" r:id="rId6"/>
+      <w:headerReference w:type="default" r:id="rId7"/>
+      <w:footerReference w:type="even" r:id="rId8"/>
+      <w:footerReference w:type="default" r:id="rId9"/>
+      <w:headerReference w:type="first" r:id="rId10"/>
+      <w:footerReference w:type="first" r:id="rId11"/>
       <w:pgSz w:w="16838" w:h="11906" w:orient="landscape"/>
       <w:pgMar w:top="360" w:right="540" w:bottom="360" w:left="540" w:header="240" w:footer="240" w:gutter="0"/>
       <w:cols w:space="720"/>
+      <w:docGrid w:linePitch="326"/>
     </w:sectPr>
   </w:body>
 </w:document>
+</file>
+
+<file path=word/endnotes.xml><?xml version="1.0" encoding="utf-8"?>
+<w:endnotes xmlns:wpc="http://schemas.microsoft.com/office/word/2010/wordprocessingCanvas" xmlns:cx="http://schemas.microsoft.com/office/drawing/2014/chartex" xmlns:cx1="http://schemas.microsoft.com/office/drawing/2015/9/8/chartex" xmlns:cx2="http://schemas.microsoft.com/office/drawing/2015/10/21/chartex" xmlns:cx3="http://schemas.microsoft.com/office/drawing/2016/5/9/chartex" xmlns:cx4="http://schemas.microsoft.com/office/drawing/2016/5/10/chartex" xmlns:cx5="http://schemas.microsoft.com/office/drawing/2016/5/11/chartex" xmlns:cx6="http://schemas.microsoft.com/office/drawing/2016/5/12/chartex" xmlns:cx7="http://schemas.microsoft.com/office/drawing/2016/5/13/chartex" xmlns:cx8="http://schemas.microsoft.com/office/drawing/2016/5/14/chartex" xmlns:mc="http://schemas.openxmlformats.org/markup-compatibility/2006" xmlns:aink="http://schemas.microsoft.com/office/drawing/2016/ink" xmlns:am3d="http://schemas.microsoft.com/office/drawing/2017/model3d" xmlns:o="urn:schemas-microsoft-com:office:office" xmlns:oel="http://schemas.microsoft.com/office/2019/extlst" xmlns:r="http://schemas.openxmlformats.org/officeDocument/2006/relationships" xmlns:m="http://schemas.openxmlformats.org/officeDocument/2006/math" xmlns:v="urn:schemas-microsoft-com:vml" xmlns:wp14="http://schemas.microsoft.com/office/word/2010/wordprocessingDrawing" xmlns:wp="http://schemas.openxmlformats.org/drawingml/2006/wordprocessingDrawing" xmlns:w10="urn:schemas-microsoft-com:office:word" xmlns:w="http://schemas.openxmlformats.org/wordprocessingml/2006/main" xmlns:w14="http://schemas.microsoft.com/office/word/2010/wordml" xmlns:w15="http://schemas.microsoft.com/office/word/2012/wordml" xmlns:w16cex="http://schemas.microsoft.com/office/word/2018/wordml/cex" xmlns:w16cid="http://schemas.microsoft.com/office/word/2016/wordml/cid" xmlns:w16="http://schemas.microsoft.com/office/word/2018/wordml" xmlns:w16du="http://schemas.microsoft.com/office/word/2023/wordml/word16du" xmlns:w16sdtdh="http://schemas.microsoft.com/office/word/2020/wordml/sdtdatahash" xmlns:w16sdtfl="http://schemas.microsoft.com/office/word/2024/wordml/sdtformatlock" xmlns:w16se="http://schemas.microsoft.com/office/word/2015/wordml/symex" xmlns:wpg="http://schemas.microsoft.com/office/word/2010/wordprocessingGroup" xmlns:wpi="http://schemas.microsoft.com/office/word/2010/wordprocessingInk" xmlns:wne="http://schemas.microsoft.com/office/word/2006/wordml" xmlns:wps="http://schemas.microsoft.com/office/word/2010/wordprocessingShape" mc:Ignorable="w14 w15 w16se w16cid w16 w16cex w16sdtdh w16sdtfl w16du wp14">
+  <w:endnote w:type="separator" w:id="-1">
+    <w:p>
+      <w:pPr>
+        <w:spacing w:after="0" w:line="240" w:lineRule="auto"/>
+      </w:pPr>
+      <w:r>
+        <w:separator/>
+      </w:r>
+    </w:p>
+  </w:endnote>
+  <w:endnote w:type="continuationSeparator" w:id="0">
+    <w:p>
+      <w:pPr>
+        <w:spacing w:after="0" w:line="240" w:lineRule="auto"/>
+      </w:pPr>
+      <w:r>
+        <w:continuationSeparator/>
+      </w:r>
+    </w:p>
+  </w:endnote>
+</w:endnotes>
+</file>
+
+<file path=word/footer1.xml><?xml version="1.0" encoding="utf-8"?>
+<w:ftr xmlns:wpc="http://schemas.microsoft.com/office/word/2010/wordprocessingCanvas" xmlns:cx="http://schemas.microsoft.com/office/drawing/2014/chartex" xmlns:cx1="http://schemas.microsoft.com/office/drawing/2015/9/8/chartex" xmlns:cx2="http://schemas.microsoft.com/office/drawing/2015/10/21/chartex" xmlns:cx3="http://schemas.microsoft.com/office/drawing/2016/5/9/chartex" xmlns:cx4="http://schemas.microsoft.com/office/drawing/2016/5/10/chartex" xmlns:cx5="http://schemas.microsoft.com/office/drawing/2016/5/11/chartex" xmlns:cx6="http://schemas.microsoft.com/office/drawing/2016/5/12/chartex" xmlns:cx7="http://schemas.microsoft.com/office/drawing/2016/5/13/chartex" xmlns:cx8="http://schemas.microsoft.com/office/drawing/2016/5/14/chartex" xmlns:mc="http://schemas.openxmlformats.org/markup-compatibility/2006" xmlns:aink="http://schemas.microsoft.com/office/drawing/2016/ink" xmlns:am3d="http://schemas.microsoft.com/office/drawing/2017/model3d" xmlns:o="urn:schemas-microsoft-com:office:office" xmlns:oel="http://schemas.microsoft.com/office/2019/extlst" xmlns:r="http://schemas.openxmlformats.org/officeDocument/2006/relationships" xmlns:m="http://schemas.openxmlformats.org/officeDocument/2006/math" xmlns:v="urn:schemas-microsoft-com:vml" xmlns:wp14="http://schemas.microsoft.com/office/word/2010/wordprocessingDrawing" xmlns:wp="http://schemas.openxmlformats.org/drawingml/2006/wordprocessingDrawing" xmlns:w10="urn:schemas-microsoft-com:office:word" xmlns:w="http://schemas.openxmlformats.org/wordprocessingml/2006/main" xmlns:w14="http://schemas.microsoft.com/office/word/2010/wordml" xmlns:w15="http://schemas.microsoft.com/office/word/2012/wordml" xmlns:w16cex="http://schemas.microsoft.com/office/word/2018/wordml/cex" xmlns:w16cid="http://schemas.microsoft.com/office/word/2016/wordml/cid" xmlns:w16="http://schemas.microsoft.com/office/word/2018/wordml" xmlns:w16du="http://schemas.microsoft.com/office/word/2023/wordml/word16du" xmlns:w16sdtdh="http://schemas.microsoft.com/office/word/2020/wordml/sdtdatahash" xmlns:w16sdtfl="http://schemas.microsoft.com/office/word/2024/wordml/sdtformatlock" xmlns:w16se="http://schemas.microsoft.com/office/word/2015/wordml/symex" xmlns:wpg="http://schemas.microsoft.com/office/word/2010/wordprocessingGroup" xmlns:wpi="http://schemas.microsoft.com/office/word/2010/wordprocessingInk" xmlns:wne="http://schemas.microsoft.com/office/word/2006/wordml" xmlns:wps="http://schemas.microsoft.com/office/word/2010/wordprocessingShape" mc:Ignorable="w14 w15 w16se w16cid w16 w16cex w16sdtdh w16sdtfl w16du wp14">
+  <w:p>
+    <w:pPr>
+      <w:pStyle w:val="a5"/>
+    </w:pPr>
+  </w:p>
+</w:ftr>
+</file>
+
+<file path=word/footer2.xml><?xml version="1.0" encoding="utf-8"?>
+<w:ftr xmlns:wpc="http://schemas.microsoft.com/office/word/2010/wordprocessingCanvas" xmlns:cx="http://schemas.microsoft.com/office/drawing/2014/chartex" xmlns:cx1="http://schemas.microsoft.com/office/drawing/2015/9/8/chartex" xmlns:cx2="http://schemas.microsoft.com/office/drawing/2015/10/21/chartex" xmlns:cx3="http://schemas.microsoft.com/office/drawing/2016/5/9/chartex" xmlns:cx4="http://schemas.microsoft.com/office/drawing/2016/5/10/chartex" xmlns:cx5="http://schemas.microsoft.com/office/drawing/2016/5/11/chartex" xmlns:cx6="http://schemas.microsoft.com/office/drawing/2016/5/12/chartex" xmlns:cx7="http://schemas.microsoft.com/office/drawing/2016/5/13/chartex" xmlns:cx8="http://schemas.microsoft.com/office/drawing/2016/5/14/chartex" xmlns:mc="http://schemas.openxmlformats.org/markup-compatibility/2006" xmlns:aink="http://schemas.microsoft.com/office/drawing/2016/ink" xmlns:am3d="http://schemas.microsoft.com/office/drawing/2017/model3d" xmlns:o="urn:schemas-microsoft-com:office:office" xmlns:oel="http://schemas.microsoft.com/office/2019/extlst" xmlns:r="http://schemas.openxmlformats.org/officeDocument/2006/relationships" xmlns:m="http://schemas.openxmlformats.org/officeDocument/2006/math" xmlns:v="urn:schemas-microsoft-com:vml" xmlns:wp14="http://schemas.microsoft.com/office/word/2010/wordprocessingDrawing" xmlns:wp="http://schemas.openxmlformats.org/drawingml/2006/wordprocessingDrawing" xmlns:w10="urn:schemas-microsoft-com:office:word" xmlns:w="http://schemas.openxmlformats.org/wordprocessingml/2006/main" xmlns:w14="http://schemas.microsoft.com/office/word/2010/wordml" xmlns:w15="http://schemas.microsoft.com/office/word/2012/wordml" xmlns:w16cex="http://schemas.microsoft.com/office/word/2018/wordml/cex" xmlns:w16cid="http://schemas.microsoft.com/office/word/2016/wordml/cid" xmlns:w16="http://schemas.microsoft.com/office/word/2018/wordml" xmlns:w16du="http://schemas.microsoft.com/office/word/2023/wordml/word16du" xmlns:w16sdtdh="http://schemas.microsoft.com/office/word/2020/wordml/sdtdatahash" xmlns:w16sdtfl="http://schemas.microsoft.com/office/word/2024/wordml/sdtformatlock" xmlns:w16se="http://schemas.microsoft.com/office/word/2015/wordml/symex" xmlns:wpg="http://schemas.microsoft.com/office/word/2010/wordprocessingGroup" xmlns:wpi="http://schemas.microsoft.com/office/word/2010/wordprocessingInk" xmlns:wne="http://schemas.microsoft.com/office/word/2006/wordml" xmlns:wps="http://schemas.microsoft.com/office/word/2010/wordprocessingShape" mc:Ignorable="w14 w15 w16se w16cid w16 w16cex w16sdtdh w16sdtfl w16du wp14">
+  <w:p>
+    <w:pPr>
+      <w:pStyle w:val="a5"/>
+    </w:pPr>
+  </w:p>
+</w:ftr>
+</file>
+
+<file path=word/footer3.xml><?xml version="1.0" encoding="utf-8"?>
+<w:ftr xmlns:wpc="http://schemas.microsoft.com/office/word/2010/wordprocessingCanvas" xmlns:cx="http://schemas.microsoft.com/office/drawing/2014/chartex" xmlns:cx1="http://schemas.microsoft.com/office/drawing/2015/9/8/chartex" xmlns:cx2="http://schemas.microsoft.com/office/drawing/2015/10/21/chartex" xmlns:cx3="http://schemas.microsoft.com/office/drawing/2016/5/9/chartex" xmlns:cx4="http://schemas.microsoft.com/office/drawing/2016/5/10/chartex" xmlns:cx5="http://schemas.microsoft.com/office/drawing/2016/5/11/chartex" xmlns:cx6="http://schemas.microsoft.com/office/drawing/2016/5/12/chartex" xmlns:cx7="http://schemas.microsoft.com/office/drawing/2016/5/13/chartex" xmlns:cx8="http://schemas.microsoft.com/office/drawing/2016/5/14/chartex" xmlns:mc="http://schemas.openxmlformats.org/markup-compatibility/2006" xmlns:aink="http://schemas.microsoft.com/office/drawing/2016/ink" xmlns:am3d="http://schemas.microsoft.com/office/drawing/2017/model3d" xmlns:o="urn:schemas-microsoft-com:office:office" xmlns:oel="http://schemas.microsoft.com/office/2019/extlst" xmlns:r="http://schemas.openxmlformats.org/officeDocument/2006/relationships" xmlns:m="http://schemas.openxmlformats.org/officeDocument/2006/math" xmlns:v="urn:schemas-microsoft-com:vml" xmlns:wp14="http://schemas.microsoft.com/office/word/2010/wordprocessingDrawing" xmlns:wp="http://schemas.openxmlformats.org/drawingml/2006/wordprocessingDrawing" xmlns:w10="urn:schemas-microsoft-com:office:word" xmlns:w="http://schemas.openxmlformats.org/wordprocessingml/2006/main" xmlns:w14="http://schemas.microsoft.com/office/word/2010/wordml" xmlns:w15="http://schemas.microsoft.com/office/word/2012/wordml" xmlns:w16cex="http://schemas.microsoft.com/office/word/2018/wordml/cex" xmlns:w16cid="http://schemas.microsoft.com/office/word/2016/wordml/cid" xmlns:w16="http://schemas.microsoft.com/office/word/2018/wordml" xmlns:w16du="http://schemas.microsoft.com/office/word/2023/wordml/word16du" xmlns:w16sdtdh="http://schemas.microsoft.com/office/word/2020/wordml/sdtdatahash" xmlns:w16sdtfl="http://schemas.microsoft.com/office/word/2024/wordml/sdtformatlock" xmlns:w16se="http://schemas.microsoft.com/office/word/2015/wordml/symex" xmlns:wpg="http://schemas.microsoft.com/office/word/2010/wordprocessingGroup" xmlns:wpi="http://schemas.microsoft.com/office/word/2010/wordprocessingInk" xmlns:wne="http://schemas.microsoft.com/office/word/2006/wordml" xmlns:wps="http://schemas.microsoft.com/office/word/2010/wordprocessingShape" mc:Ignorable="w14 w15 w16se w16cid w16 w16cex w16sdtdh w16sdtfl w16du wp14">
+  <w:p>
+    <w:pPr>
+      <w:pStyle w:val="a5"/>
+    </w:pPr>
+  </w:p>
+</w:ftr>
+</file>
+
+<file path=word/footnotes.xml><?xml version="1.0" encoding="utf-8"?>
+<w:footnotes xmlns:wpc="http://schemas.microsoft.com/office/word/2010/wordprocessingCanvas" xmlns:cx="http://schemas.microsoft.com/office/drawing/2014/chartex" xmlns:cx1="http://schemas.microsoft.com/office/drawing/2015/9/8/chartex" xmlns:cx2="http://schemas.microsoft.com/office/drawing/2015/10/21/chartex" xmlns:cx3="http://schemas.microsoft.com/office/drawing/2016/5/9/chartex" xmlns:cx4="http://schemas.microsoft.com/office/drawing/2016/5/10/chartex" xmlns:cx5="http://schemas.microsoft.com/office/drawing/2016/5/11/chartex" xmlns:cx6="http://schemas.microsoft.com/office/drawing/2016/5/12/chartex" xmlns:cx7="http://schemas.microsoft.com/office/drawing/2016/5/13/chartex" xmlns:cx8="http://schemas.microsoft.com/office/drawing/2016/5/14/chartex" xmlns:mc="http://schemas.openxmlformats.org/markup-compatibility/2006" xmlns:aink="http://schemas.microsoft.com/office/drawing/2016/ink" xmlns:am3d="http://schemas.microsoft.com/office/drawing/2017/model3d" xmlns:o="urn:schemas-microsoft-com:office:office" xmlns:oel="http://schemas.microsoft.com/office/2019/extlst" xmlns:r="http://schemas.openxmlformats.org/officeDocument/2006/relationships" xmlns:m="http://schemas.openxmlformats.org/officeDocument/2006/math" xmlns:v="urn:schemas-microsoft-com:vml" xmlns:wp14="http://schemas.microsoft.com/office/word/2010/wordprocessingDrawing" xmlns:wp="http://schemas.openxmlformats.org/drawingml/2006/wordprocessingDrawing" xmlns:w10="urn:schemas-microsoft-com:office:word" xmlns:w="http://schemas.openxmlformats.org/wordprocessingml/2006/main" xmlns:w14="http://schemas.microsoft.com/office/word/2010/wordml" xmlns:w15="http://schemas.microsoft.com/office/word/2012/wordml" xmlns:w16cex="http://schemas.microsoft.com/office/word/2018/wordml/cex" xmlns:w16cid="http://schemas.microsoft.com/office/word/2016/wordml/cid" xmlns:w16="http://schemas.microsoft.com/office/word/2018/wordml" xmlns:w16du="http://schemas.microsoft.com/office/word/2023/wordml/word16du" xmlns:w16sdtdh="http://schemas.microsoft.com/office/word/2020/wordml/sdtdatahash" xmlns:w16sdtfl="http://schemas.microsoft.com/office/word/2024/wordml/sdtformatlock" xmlns:w16se="http://schemas.microsoft.com/office/word/2015/wordml/symex" xmlns:wpg="http://schemas.microsoft.com/office/word/2010/wordprocessingGroup" xmlns:wpi="http://schemas.microsoft.com/office/word/2010/wordprocessingInk" xmlns:wne="http://schemas.microsoft.com/office/word/2006/wordml" xmlns:wps="http://schemas.microsoft.com/office/word/2010/wordprocessingShape" mc:Ignorable="w14 w15 w16se w16cid w16 w16cex w16sdtdh w16sdtfl w16du wp14">
+  <w:footnote w:type="separator" w:id="-1">
+    <w:p>
+      <w:pPr>
+        <w:spacing w:after="0" w:line="240" w:lineRule="auto"/>
+      </w:pPr>
+      <w:r>
+        <w:separator/>
+      </w:r>
+    </w:p>
+  </w:footnote>
+  <w:footnote w:type="continuationSeparator" w:id="0">
+    <w:p>
+      <w:pPr>
+        <w:spacing w:after="0" w:line="240" w:lineRule="auto"/>
+      </w:pPr>
+      <w:r>
+        <w:continuationSeparator/>
+      </w:r>
+    </w:p>
+  </w:footnote>
+</w:footnotes>
+</file>
+
+<file path=word/header1.xml><?xml version="1.0" encoding="utf-8"?>
+<w:hdr xmlns:wpc="http://schemas.microsoft.com/office/word/2010/wordprocessingCanvas" xmlns:cx="http://schemas.microsoft.com/office/drawing/2014/chartex" xmlns:cx1="http://schemas.microsoft.com/office/drawing/2015/9/8/chartex" xmlns:cx2="http://schemas.microsoft.com/office/drawing/2015/10/21/chartex" xmlns:cx3="http://schemas.microsoft.com/office/drawing/2016/5/9/chartex" xmlns:cx4="http://schemas.microsoft.com/office/drawing/2016/5/10/chartex" xmlns:cx5="http://schemas.microsoft.com/office/drawing/2016/5/11/chartex" xmlns:cx6="http://schemas.microsoft.com/office/drawing/2016/5/12/chartex" xmlns:cx7="http://schemas.microsoft.com/office/drawing/2016/5/13/chartex" xmlns:cx8="http://schemas.microsoft.com/office/drawing/2016/5/14/chartex" xmlns:mc="http://schemas.openxmlformats.org/markup-compatibility/2006" xmlns:aink="http://schemas.microsoft.com/office/drawing/2016/ink" xmlns:am3d="http://schemas.microsoft.com/office/drawing/2017/model3d" xmlns:o="urn:schemas-microsoft-com:office:office" xmlns:oel="http://schemas.microsoft.com/office/2019/extlst" xmlns:r="http://schemas.openxmlformats.org/officeDocument/2006/relationships" xmlns:m="http://schemas.openxmlformats.org/officeDocument/2006/math" xmlns:v="urn:schemas-microsoft-com:vml" xmlns:wp14="http://schemas.microsoft.com/office/word/2010/wordprocessingDrawing" xmlns:wp="http://schemas.openxmlformats.org/drawingml/2006/wordprocessingDrawing" xmlns:w10="urn:schemas-microsoft-com:office:word" xmlns:w="http://schemas.openxmlformats.org/wordprocessingml/2006/main" xmlns:w14="http://schemas.microsoft.com/office/word/2010/wordml" xmlns:w15="http://schemas.microsoft.com/office/word/2012/wordml" xmlns:w16cex="http://schemas.microsoft.com/office/word/2018/wordml/cex" xmlns:w16cid="http://schemas.microsoft.com/office/word/2016/wordml/cid" xmlns:w16="http://schemas.microsoft.com/office/word/2018/wordml" xmlns:w16du="http://schemas.microsoft.com/office/word/2023/wordml/word16du" xmlns:w16sdtdh="http://schemas.microsoft.com/office/word/2020/wordml/sdtdatahash" xmlns:w16sdtfl="http://schemas.microsoft.com/office/word/2024/wordml/sdtformatlock" xmlns:w16se="http://schemas.microsoft.com/office/word/2015/wordml/symex" xmlns:wpg="http://schemas.microsoft.com/office/word/2010/wordprocessingGroup" xmlns:wpi="http://schemas.microsoft.com/office/word/2010/wordprocessingInk" xmlns:wne="http://schemas.microsoft.com/office/word/2006/wordml" xmlns:wps="http://schemas.microsoft.com/office/word/2010/wordprocessingShape" mc:Ignorable="w14 w15 w16se w16cid w16 w16cex w16sdtdh w16sdtfl w16du wp14">
+  <w:p>
+    <w:pPr>
+      <w:pStyle w:val="a3"/>
+    </w:pPr>
+  </w:p>
+</w:hdr>
+</file>
+
+<file path=word/header2.xml><?xml version="1.0" encoding="utf-8"?>
+<w:hdr xmlns:wpc="http://schemas.microsoft.com/office/word/2010/wordprocessingCanvas" xmlns:cx="http://schemas.microsoft.com/office/drawing/2014/chartex" xmlns:cx1="http://schemas.microsoft.com/office/drawing/2015/9/8/chartex" xmlns:cx2="http://schemas.microsoft.com/office/drawing/2015/10/21/chartex" xmlns:cx3="http://schemas.microsoft.com/office/drawing/2016/5/9/chartex" xmlns:cx4="http://schemas.microsoft.com/office/drawing/2016/5/10/chartex" xmlns:cx5="http://schemas.microsoft.com/office/drawing/2016/5/11/chartex" xmlns:cx6="http://schemas.microsoft.com/office/drawing/2016/5/12/chartex" xmlns:cx7="http://schemas.microsoft.com/office/drawing/2016/5/13/chartex" xmlns:cx8="http://schemas.microsoft.com/office/drawing/2016/5/14/chartex" xmlns:mc="http://schemas.openxmlformats.org/markup-compatibility/2006" xmlns:aink="http://schemas.microsoft.com/office/drawing/2016/ink" xmlns:am3d="http://schemas.microsoft.com/office/drawing/2017/model3d" xmlns:o="urn:schemas-microsoft-com:office:office" xmlns:oel="http://schemas.microsoft.com/office/2019/extlst" xmlns:r="http://schemas.openxmlformats.org/officeDocument/2006/relationships" xmlns:m="http://schemas.openxmlformats.org/officeDocument/2006/math" xmlns:v="urn:schemas-microsoft-com:vml" xmlns:wp14="http://schemas.microsoft.com/office/word/2010/wordprocessingDrawing" xmlns:wp="http://schemas.openxmlformats.org/drawingml/2006/wordprocessingDrawing" xmlns:w10="urn:schemas-microsoft-com:office:word" xmlns:w="http://schemas.openxmlformats.org/wordprocessingml/2006/main" xmlns:w14="http://schemas.microsoft.com/office/word/2010/wordml" xmlns:w15="http://schemas.microsoft.com/office/word/2012/wordml" xmlns:w16cex="http://schemas.microsoft.com/office/word/2018/wordml/cex" xmlns:w16cid="http://schemas.microsoft.com/office/word/2016/wordml/cid" xmlns:w16="http://schemas.microsoft.com/office/word/2018/wordml" xmlns:w16du="http://schemas.microsoft.com/office/word/2023/wordml/word16du" xmlns:w16sdtdh="http://schemas.microsoft.com/office/word/2020/wordml/sdtdatahash" xmlns:w16sdtfl="http://schemas.microsoft.com/office/word/2024/wordml/sdtformatlock" xmlns:w16se="http://schemas.microsoft.com/office/word/2015/wordml/symex" xmlns:wpg="http://schemas.microsoft.com/office/word/2010/wordprocessingGroup" xmlns:wpi="http://schemas.microsoft.com/office/word/2010/wordprocessingInk" xmlns:wne="http://schemas.microsoft.com/office/word/2006/wordml" xmlns:wps="http://schemas.microsoft.com/office/word/2010/wordprocessingShape" mc:Ignorable="w14 w15 w16se w16cid w16 w16cex w16sdtdh w16sdtfl w16du wp14">
+  <w:p>
+    <w:pPr>
+      <w:pStyle w:val="a3"/>
+      <w:jc w:val="right"/>
+    </w:pPr>
+    <w:r>
+      <w:rPr>
+        <w:noProof/>
+      </w:rPr>
+      <w:drawing>
+        <wp:inline distT="0" distB="0" distL="0" distR="0" wp14:anchorId="0AD6C575" wp14:editId="492B642D">
+          <wp:extent cx="787505" cy="787505"/>
+          <wp:effectExtent l="0" t="0" r="0" b="0"/>
+          <wp:docPr id="1058137855" name="Рисунок 1" descr="SARSH_KKZH_QR"/>
+          <wp:cNvGraphicFramePr/>
+          <a:graphic xmlns:a="http://schemas.openxmlformats.org/drawingml/2006/main">
+            <a:graphicData uri="http://schemas.openxmlformats.org/drawingml/2006/picture">
+              <pic:pic xmlns:pic="http://schemas.openxmlformats.org/drawingml/2006/picture">
+                <pic:nvPicPr>
+                  <pic:cNvPr id="1058137855" name="Рисунок 1" descr="SARSH_KKZH_QR"/>
+                  <pic:cNvPicPr/>
+                </pic:nvPicPr>
+                <pic:blipFill>
+                  <a:blip r:embed="rId1">
+                    <a:extLst>
+                      <a:ext uri="{28A0092B-C50C-407E-A947-70E740481C1C}">
+                        <a14:useLocalDpi xmlns:a14="http://schemas.microsoft.com/office/drawing/2010/main" val="0"/>
+                      </a:ext>
+                    </a:extLst>
+                  </a:blip>
+                  <a:stretch>
+                    <a:fillRect/>
+                  </a:stretch>
+                </pic:blipFill>
+                <pic:spPr>
+                  <a:xfrm>
+                    <a:off x="0" y="0"/>
+                    <a:ext cx="787505" cy="787505"/>
+                  </a:xfrm>
+                  <a:prstGeom prst="rect">
+                    <a:avLst/>
+                  </a:prstGeom>
+                </pic:spPr>
+              </pic:pic>
+            </a:graphicData>
+          </a:graphic>
+        </wp:inline>
+      </w:drawing>
+    </w:r>
+  </w:p>
+</w:hdr>
+</file>
+
+<file path=word/header3.xml><?xml version="1.0" encoding="utf-8"?>
+<w:hdr xmlns:wpc="http://schemas.microsoft.com/office/word/2010/wordprocessingCanvas" xmlns:cx="http://schemas.microsoft.com/office/drawing/2014/chartex" xmlns:cx1="http://schemas.microsoft.com/office/drawing/2015/9/8/chartex" xmlns:cx2="http://schemas.microsoft.com/office/drawing/2015/10/21/chartex" xmlns:cx3="http://schemas.microsoft.com/office/drawing/2016/5/9/chartex" xmlns:cx4="http://schemas.microsoft.com/office/drawing/2016/5/10/chartex" xmlns:cx5="http://schemas.microsoft.com/office/drawing/2016/5/11/chartex" xmlns:cx6="http://schemas.microsoft.com/office/drawing/2016/5/12/chartex" xmlns:cx7="http://schemas.microsoft.com/office/drawing/2016/5/13/chartex" xmlns:cx8="http://schemas.microsoft.com/office/drawing/2016/5/14/chartex" xmlns:mc="http://schemas.openxmlformats.org/markup-compatibility/2006" xmlns:aink="http://schemas.microsoft.com/office/drawing/2016/ink" xmlns:am3d="http://schemas.microsoft.com/office/drawing/2017/model3d" xmlns:o="urn:schemas-microsoft-com:office:office" xmlns:oel="http://schemas.microsoft.com/office/2019/extlst" xmlns:r="http://schemas.openxmlformats.org/officeDocument/2006/relationships" xmlns:m="http://schemas.openxmlformats.org/officeDocument/2006/math" xmlns:v="urn:schemas-microsoft-com:vml" xmlns:wp14="http://schemas.microsoft.com/office/word/2010/wordprocessingDrawing" xmlns:wp="http://schemas.openxmlformats.org/drawingml/2006/wordprocessingDrawing" xmlns:w10="urn:schemas-microsoft-com:office:word" xmlns:w="http://schemas.openxmlformats.org/wordprocessingml/2006/main" xmlns:w14="http://schemas.microsoft.com/office/word/2010/wordml" xmlns:w15="http://schemas.microsoft.com/office/word/2012/wordml" xmlns:w16cex="http://schemas.microsoft.com/office/word/2018/wordml/cex" xmlns:w16cid="http://schemas.microsoft.com/office/word/2016/wordml/cid" xmlns:w16="http://schemas.microsoft.com/office/word/2018/wordml" xmlns:w16du="http://schemas.microsoft.com/office/word/2023/wordml/word16du" xmlns:w16sdtdh="http://schemas.microsoft.com/office/word/2020/wordml/sdtdatahash" xmlns:w16sdtfl="http://schemas.microsoft.com/office/word/2024/wordml/sdtformatlock" xmlns:w16se="http://schemas.microsoft.com/office/word/2015/wordml/symex" xmlns:wpg="http://schemas.microsoft.com/office/word/2010/wordprocessingGroup" xmlns:wpi="http://schemas.microsoft.com/office/word/2010/wordprocessingInk" xmlns:wne="http://schemas.microsoft.com/office/word/2006/wordml" xmlns:wps="http://schemas.microsoft.com/office/word/2010/wordprocessingShape" mc:Ignorable="w14 w15 w16se w16cid w16 w16cex w16sdtdh w16sdtfl w16du wp14">
+  <w:p>
+    <w:pPr>
+      <w:pStyle w:val="a3"/>
+    </w:pPr>
+  </w:p>
+</w:hdr>
 </file>
 
 <file path=word/styles.xml><?xml version="1.0" encoding="utf-8"?>
@@ -3388,6 +3850,50 @@
     <w:semiHidden/>
     <w:unhideWhenUsed/>
   </w:style>
+  <w:style w:type="paragraph" w:styleId="a3">
+    <w:name w:val="header"/>
+    <w:basedOn w:val="a"/>
+    <w:link w:val="a4"/>
+    <w:uiPriority w:val="99"/>
+    <w:unhideWhenUsed/>
+    <w:rsid w:val="00177CC2"/>
+    <w:pPr>
+      <w:tabs>
+        <w:tab w:val="center" w:pos="4680"/>
+        <w:tab w:val="right" w:pos="9360"/>
+      </w:tabs>
+      <w:spacing w:after="0" w:line="240" w:lineRule="auto"/>
+    </w:pPr>
+  </w:style>
+  <w:style w:type="character" w:customStyle="1" w:styleId="a4">
+    <w:name w:val="Верхний колонтитул Знак"/>
+    <w:basedOn w:val="a0"/>
+    <w:link w:val="a3"/>
+    <w:uiPriority w:val="99"/>
+    <w:rsid w:val="00177CC2"/>
+  </w:style>
+  <w:style w:type="paragraph" w:styleId="a5">
+    <w:name w:val="footer"/>
+    <w:basedOn w:val="a"/>
+    <w:link w:val="a6"/>
+    <w:uiPriority w:val="99"/>
+    <w:unhideWhenUsed/>
+    <w:rsid w:val="00177CC2"/>
+    <w:pPr>
+      <w:tabs>
+        <w:tab w:val="center" w:pos="4680"/>
+        <w:tab w:val="right" w:pos="9360"/>
+      </w:tabs>
+      <w:spacing w:after="0" w:line="240" w:lineRule="auto"/>
+    </w:pPr>
+  </w:style>
+  <w:style w:type="character" w:customStyle="1" w:styleId="a6">
+    <w:name w:val="Нижний колонтитул Знак"/>
+    <w:basedOn w:val="a0"/>
+    <w:link w:val="a5"/>
+    <w:uiPriority w:val="99"/>
+    <w:rsid w:val="00177CC2"/>
+  </w:style>
 </w:styles>
 </file>
 

</xml_diff>

<commit_message>
Fix header overlap in department forms
</commit_message>
<xml_diff>
--- a/Отделения/ԱՆՈԹԱՅԻՆ/ԱՆՈԹԱՅԻՆ շարժ.docx
+++ b/Отделения/ԱՆՈԹԱՅԻՆ/ԱՆՈԹԱՅԻՆ շարժ.docx
@@ -4,11 +4,11 @@
   <w:body>
     <w:p>
       <w:pPr>
-        <w:spacing w:after="30"/>
+        <w:spacing w:after="0" w:line="240" w:lineRule="exact"/>
         <w:jc w:val="center"/>
         <w:rPr>
-          <w:sz w:val="36"/>
-          <w:szCs w:val="36"/>
+          <w:sz w:val="28"/>
+          <w:szCs w:val="28"/>
         </w:rPr>
       </w:pPr>
       <w:r>
@@ -16,8 +16,8 @@
           <w:rFonts w:ascii="Sylfaen" w:eastAsia="Sylfaen" w:hAnsi="Sylfaen" w:cs="Sylfaen"/>
           <w:b/>
           <w:bCs/>
-          <w:sz w:val="36"/>
-          <w:szCs w:val="36"/>
+          <w:sz w:val="28"/>
+          <w:szCs w:val="28"/>
           <w:lang w:val="hy-AM" w:bidi="hy-AM"/>
         </w:rPr>
         <w:t>ԱՆՈԹԱՅԻՆ</w:t>
@@ -25,7 +25,7 @@
     </w:p>
     <w:p>
       <w:pPr>
-        <w:spacing w:after="50"/>
+        <w:spacing w:after="0" w:line="240" w:lineRule="exact"/>
         <w:jc w:val="center"/>
         <w:rPr>
           <w:sz w:val="18"/>
@@ -39,34 +39,7 @@
           <w:szCs w:val="18"/>
           <w:lang w:val="hy-AM" w:bidi="hy-AM"/>
         </w:rPr>
-        <w:t>Ամսաթիվ</w:t>
-      </w:r>
-      <w:r>
-        <w:rPr>
-          <w:rFonts w:ascii="Sylfaen" w:eastAsia="Sylfaen" w:hAnsi="Sylfaen" w:cs="Sylfaen"/>
-          <w:sz w:val="18"/>
-          <w:szCs w:val="18"/>
-          <w:lang w:val="hy-AM" w:bidi="hy-AM"/>
-        </w:rPr>
-        <w:t xml:space="preserve"> ____________________        </w:t>
-      </w:r>
-      <w:r>
-        <w:rPr>
-          <w:rFonts w:ascii="Sylfaen" w:eastAsia="Sylfaen" w:hAnsi="Sylfaen" w:cs="Sylfaen"/>
-          <w:sz w:val="18"/>
-          <w:szCs w:val="18"/>
-          <w:lang w:val="hy-AM" w:bidi="hy-AM"/>
-        </w:rPr>
-        <w:t>Հերթապահ</w:t>
-      </w:r>
-      <w:r>
-        <w:rPr>
-          <w:rFonts w:ascii="Sylfaen" w:eastAsia="Sylfaen" w:hAnsi="Sylfaen" w:cs="Sylfaen"/>
-          <w:sz w:val="18"/>
-          <w:szCs w:val="18"/>
-          <w:lang w:val="hy-AM" w:bidi="hy-AM"/>
-        </w:rPr>
-        <w:t xml:space="preserve"> ____________________</w:t>
+        <w:t>Ամսաթիվ ____________________        Հերթապահ ____________________</w:t>
       </w:r>
     </w:p>
     <w:tbl>
@@ -129,45 +102,23 @@
           </w:tcPr>
           <w:p>
             <w:pPr>
-              <w:spacing w:after="0"/>
-              <w:jc w:val="center"/>
-              <w:rPr>
-                <w:sz w:val="18"/>
-                <w:szCs w:val="18"/>
-              </w:rPr>
-            </w:pPr>
-            <w:r>
-              <w:rPr>
-                <w:rFonts w:ascii="Sylfaen" w:eastAsia="Sylfaen" w:hAnsi="Sylfaen" w:cs="Sylfaen"/>
-                <w:b/>
-                <w:bCs/>
-                <w:sz w:val="18"/>
-                <w:szCs w:val="18"/>
-                <w:lang w:val="hy-AM" w:bidi="hy-AM"/>
-              </w:rPr>
-              <w:t>Եղել</w:t>
-            </w:r>
-            <w:r>
-              <w:rPr>
-                <w:rFonts w:ascii="Sylfaen" w:eastAsia="Sylfaen" w:hAnsi="Sylfaen" w:cs="Sylfaen"/>
-                <w:b/>
-                <w:bCs/>
-                <w:sz w:val="18"/>
-                <w:szCs w:val="18"/>
-                <w:lang w:val="hy-AM" w:bidi="hy-AM"/>
-              </w:rPr>
-              <w:t xml:space="preserve"> </w:t>
-            </w:r>
-            <w:r>
-              <w:rPr>
-                <w:rFonts w:ascii="Sylfaen" w:eastAsia="Sylfaen" w:hAnsi="Sylfaen" w:cs="Sylfaen"/>
-                <w:b/>
-                <w:bCs/>
-                <w:sz w:val="18"/>
-                <w:szCs w:val="18"/>
-                <w:lang w:val="hy-AM" w:bidi="hy-AM"/>
-              </w:rPr>
-              <w:t>է</w:t>
+              <w:spacing w:after="0" w:line="240" w:lineRule="exact"/>
+              <w:jc w:val="center"/>
+              <w:rPr>
+                <w:sz w:val="18"/>
+                <w:szCs w:val="18"/>
+              </w:rPr>
+            </w:pPr>
+            <w:r>
+              <w:rPr>
+                <w:rFonts w:ascii="Sylfaen" w:eastAsia="Sylfaen" w:hAnsi="Sylfaen" w:cs="Sylfaen"/>
+                <w:b/>
+                <w:bCs/>
+                <w:sz w:val="18"/>
+                <w:szCs w:val="18"/>
+                <w:lang w:val="hy-AM" w:bidi="hy-AM"/>
+              </w:rPr>
+              <w:t>Եղել է</w:t>
             </w:r>
           </w:p>
         </w:tc>
@@ -179,45 +130,23 @@
           </w:tcPr>
           <w:p>
             <w:pPr>
-              <w:spacing w:after="0"/>
-              <w:jc w:val="center"/>
-              <w:rPr>
-                <w:sz w:val="18"/>
-                <w:szCs w:val="18"/>
-              </w:rPr>
-            </w:pPr>
-            <w:r>
-              <w:rPr>
-                <w:rFonts w:ascii="Sylfaen" w:eastAsia="Sylfaen" w:hAnsi="Sylfaen" w:cs="Sylfaen"/>
-                <w:b/>
-                <w:bCs/>
-                <w:sz w:val="18"/>
-                <w:szCs w:val="18"/>
-                <w:lang w:val="hy-AM" w:bidi="hy-AM"/>
-              </w:rPr>
-              <w:t>Ընդունվել</w:t>
-            </w:r>
-            <w:r>
-              <w:rPr>
-                <w:rFonts w:ascii="Sylfaen" w:eastAsia="Sylfaen" w:hAnsi="Sylfaen" w:cs="Sylfaen"/>
-                <w:b/>
-                <w:bCs/>
-                <w:sz w:val="18"/>
-                <w:szCs w:val="18"/>
-                <w:lang w:val="hy-AM" w:bidi="hy-AM"/>
-              </w:rPr>
-              <w:t xml:space="preserve"> </w:t>
-            </w:r>
-            <w:r>
-              <w:rPr>
-                <w:rFonts w:ascii="Sylfaen" w:eastAsia="Sylfaen" w:hAnsi="Sylfaen" w:cs="Sylfaen"/>
-                <w:b/>
-                <w:bCs/>
-                <w:sz w:val="18"/>
-                <w:szCs w:val="18"/>
-                <w:lang w:val="hy-AM" w:bidi="hy-AM"/>
-              </w:rPr>
-              <w:t>է</w:t>
+              <w:spacing w:after="0" w:line="240" w:lineRule="exact"/>
+              <w:jc w:val="center"/>
+              <w:rPr>
+                <w:sz w:val="18"/>
+                <w:szCs w:val="18"/>
+              </w:rPr>
+            </w:pPr>
+            <w:r>
+              <w:rPr>
+                <w:rFonts w:ascii="Sylfaen" w:eastAsia="Sylfaen" w:hAnsi="Sylfaen" w:cs="Sylfaen"/>
+                <w:b/>
+                <w:bCs/>
+                <w:sz w:val="18"/>
+                <w:szCs w:val="18"/>
+                <w:lang w:val="hy-AM" w:bidi="hy-AM"/>
+              </w:rPr>
+              <w:t>Ընդունվել է</w:t>
             </w:r>
           </w:p>
         </w:tc>
@@ -229,45 +158,23 @@
           </w:tcPr>
           <w:p>
             <w:pPr>
-              <w:spacing w:after="0"/>
-              <w:jc w:val="center"/>
-              <w:rPr>
-                <w:sz w:val="18"/>
-                <w:szCs w:val="18"/>
-              </w:rPr>
-            </w:pPr>
-            <w:r>
-              <w:rPr>
-                <w:rFonts w:ascii="Sylfaen" w:eastAsia="Sylfaen" w:hAnsi="Sylfaen" w:cs="Sylfaen"/>
-                <w:b/>
-                <w:bCs/>
-                <w:sz w:val="18"/>
-                <w:szCs w:val="18"/>
-                <w:lang w:val="hy-AM" w:bidi="hy-AM"/>
-              </w:rPr>
-              <w:t>Դ</w:t>
-            </w:r>
-            <w:r>
-              <w:rPr>
-                <w:rFonts w:ascii="Sylfaen" w:eastAsia="Sylfaen" w:hAnsi="Sylfaen" w:cs="Sylfaen"/>
-                <w:b/>
-                <w:bCs/>
-                <w:sz w:val="18"/>
-                <w:szCs w:val="18"/>
-                <w:lang w:val="hy-AM" w:bidi="hy-AM"/>
-              </w:rPr>
-              <w:t>/</w:t>
-            </w:r>
-            <w:r>
-              <w:rPr>
-                <w:rFonts w:ascii="Sylfaen" w:eastAsia="Sylfaen" w:hAnsi="Sylfaen" w:cs="Sylfaen"/>
-                <w:b/>
-                <w:bCs/>
-                <w:sz w:val="18"/>
-                <w:szCs w:val="18"/>
-                <w:lang w:val="hy-AM" w:bidi="hy-AM"/>
-              </w:rPr>
-              <w:t>Գ</w:t>
+              <w:spacing w:after="0" w:line="240" w:lineRule="exact"/>
+              <w:jc w:val="center"/>
+              <w:rPr>
+                <w:sz w:val="18"/>
+                <w:szCs w:val="18"/>
+              </w:rPr>
+            </w:pPr>
+            <w:r>
+              <w:rPr>
+                <w:rFonts w:ascii="Sylfaen" w:eastAsia="Sylfaen" w:hAnsi="Sylfaen" w:cs="Sylfaen"/>
+                <w:b/>
+                <w:bCs/>
+                <w:sz w:val="18"/>
+                <w:szCs w:val="18"/>
+                <w:lang w:val="hy-AM" w:bidi="hy-AM"/>
+              </w:rPr>
+              <w:t>Դ/Գ</w:t>
             </w:r>
           </w:p>
         </w:tc>
@@ -279,7 +186,7 @@
           </w:tcPr>
           <w:p>
             <w:pPr>
-              <w:spacing w:after="0"/>
+              <w:spacing w:after="0" w:line="240" w:lineRule="exact"/>
               <w:jc w:val="center"/>
               <w:rPr>
                 <w:sz w:val="18"/>
@@ -307,45 +214,23 @@
           </w:tcPr>
           <w:p>
             <w:pPr>
-              <w:spacing w:after="0"/>
-              <w:jc w:val="center"/>
-              <w:rPr>
-                <w:sz w:val="18"/>
-                <w:szCs w:val="18"/>
-              </w:rPr>
-            </w:pPr>
-            <w:r>
-              <w:rPr>
-                <w:rFonts w:ascii="Sylfaen" w:eastAsia="Sylfaen" w:hAnsi="Sylfaen" w:cs="Sylfaen"/>
-                <w:b/>
-                <w:bCs/>
-                <w:sz w:val="18"/>
-                <w:szCs w:val="18"/>
-                <w:lang w:val="hy-AM" w:bidi="hy-AM"/>
-              </w:rPr>
-              <w:t>Առկա</w:t>
-            </w:r>
-            <w:r>
-              <w:rPr>
-                <w:rFonts w:ascii="Sylfaen" w:eastAsia="Sylfaen" w:hAnsi="Sylfaen" w:cs="Sylfaen"/>
-                <w:b/>
-                <w:bCs/>
-                <w:sz w:val="18"/>
-                <w:szCs w:val="18"/>
-                <w:lang w:val="hy-AM" w:bidi="hy-AM"/>
-              </w:rPr>
-              <w:t xml:space="preserve"> </w:t>
-            </w:r>
-            <w:r>
-              <w:rPr>
-                <w:rFonts w:ascii="Sylfaen" w:eastAsia="Sylfaen" w:hAnsi="Sylfaen" w:cs="Sylfaen"/>
-                <w:b/>
-                <w:bCs/>
-                <w:sz w:val="18"/>
-                <w:szCs w:val="18"/>
-                <w:lang w:val="hy-AM" w:bidi="hy-AM"/>
-              </w:rPr>
-              <w:t>է</w:t>
+              <w:spacing w:after="0" w:line="240" w:lineRule="exact"/>
+              <w:jc w:val="center"/>
+              <w:rPr>
+                <w:sz w:val="18"/>
+                <w:szCs w:val="18"/>
+              </w:rPr>
+            </w:pPr>
+            <w:r>
+              <w:rPr>
+                <w:rFonts w:ascii="Sylfaen" w:eastAsia="Sylfaen" w:hAnsi="Sylfaen" w:cs="Sylfaen"/>
+                <w:b/>
+                <w:bCs/>
+                <w:sz w:val="18"/>
+                <w:szCs w:val="18"/>
+                <w:lang w:val="hy-AM" w:bidi="hy-AM"/>
+              </w:rPr>
+              <w:t>Առկա է</w:t>
             </w:r>
           </w:p>
         </w:tc>
@@ -357,34 +242,23 @@
           </w:tcPr>
           <w:p>
             <w:pPr>
-              <w:spacing w:after="0"/>
-              <w:jc w:val="center"/>
-              <w:rPr>
-                <w:sz w:val="18"/>
-                <w:szCs w:val="18"/>
-              </w:rPr>
-            </w:pPr>
-            <w:r>
-              <w:rPr>
-                <w:rFonts w:ascii="Sylfaen" w:eastAsia="Sylfaen" w:hAnsi="Sylfaen" w:cs="Sylfaen"/>
-                <w:b/>
-                <w:bCs/>
-                <w:sz w:val="18"/>
-                <w:szCs w:val="18"/>
-                <w:lang w:val="hy-AM" w:bidi="hy-AM"/>
-              </w:rPr>
-              <w:t>Բուժական</w:t>
-            </w:r>
-            <w:r>
-              <w:rPr>
-                <w:rFonts w:ascii="Sylfaen" w:eastAsia="Sylfaen" w:hAnsi="Sylfaen" w:cs="Sylfaen"/>
-                <w:b/>
-                <w:bCs/>
-                <w:sz w:val="18"/>
-                <w:szCs w:val="18"/>
-                <w:lang w:val="hy-AM" w:bidi="hy-AM"/>
-              </w:rPr>
-              <w:t xml:space="preserve"> </w:t>
+              <w:spacing w:after="0" w:line="240" w:lineRule="exact"/>
+              <w:jc w:val="center"/>
+              <w:rPr>
+                <w:sz w:val="18"/>
+                <w:szCs w:val="18"/>
+              </w:rPr>
+            </w:pPr>
+            <w:r>
+              <w:rPr>
+                <w:rFonts w:ascii="Sylfaen" w:eastAsia="Sylfaen" w:hAnsi="Sylfaen" w:cs="Sylfaen"/>
+                <w:b/>
+                <w:bCs/>
+                <w:sz w:val="18"/>
+                <w:szCs w:val="18"/>
+                <w:lang w:val="hy-AM" w:bidi="hy-AM"/>
+              </w:rPr>
+              <w:t xml:space="preserve">Բուժական </w:t>
             </w:r>
             <w:r>
               <w:rPr>
@@ -424,7 +298,7 @@
           </w:tcPr>
           <w:p>
             <w:pPr>
-              <w:spacing w:after="0"/>
+              <w:spacing w:after="0" w:line="240" w:lineRule="exact"/>
               <w:jc w:val="center"/>
               <w:rPr>
                 <w:sz w:val="18"/>
@@ -459,7 +333,7 @@
           </w:tcPr>
           <w:p>
             <w:pPr>
-              <w:spacing w:after="0"/>
+              <w:spacing w:after="0" w:line="240" w:lineRule="exact"/>
               <w:jc w:val="center"/>
               <w:rPr>
                 <w:sz w:val="18"/>
@@ -486,7 +360,7 @@
           </w:tcPr>
           <w:p>
             <w:pPr>
-              <w:spacing w:after="0"/>
+              <w:spacing w:after="0" w:line="240" w:lineRule="exact"/>
               <w:jc w:val="center"/>
               <w:rPr>
                 <w:sz w:val="18"/>
@@ -512,7 +386,7 @@
           </w:tcPr>
           <w:p>
             <w:pPr>
-              <w:spacing w:after="0"/>
+              <w:spacing w:after="0" w:line="240" w:lineRule="exact"/>
               <w:jc w:val="center"/>
               <w:rPr>
                 <w:sz w:val="18"/>
@@ -547,7 +421,7 @@
           </w:tcPr>
           <w:p>
             <w:pPr>
-              <w:spacing w:after="0"/>
+              <w:spacing w:after="0" w:line="240" w:lineRule="exact"/>
               <w:jc w:val="center"/>
               <w:rPr>
                 <w:sz w:val="18"/>
@@ -573,7 +447,7 @@
           </w:tcPr>
           <w:p>
             <w:pPr>
-              <w:spacing w:after="0"/>
+              <w:spacing w:after="0" w:line="240" w:lineRule="exact"/>
               <w:jc w:val="center"/>
               <w:rPr>
                 <w:sz w:val="18"/>
@@ -599,7 +473,7 @@
           </w:tcPr>
           <w:p>
             <w:pPr>
-              <w:spacing w:after="0"/>
+              <w:spacing w:after="0" w:line="240" w:lineRule="exact"/>
               <w:jc w:val="center"/>
               <w:rPr>
                 <w:sz w:val="18"/>
@@ -634,7 +508,7 @@
           </w:tcPr>
           <w:p>
             <w:pPr>
-              <w:spacing w:after="0"/>
+              <w:spacing w:after="0" w:line="240" w:lineRule="exact"/>
               <w:jc w:val="center"/>
               <w:rPr>
                 <w:sz w:val="18"/>
@@ -660,7 +534,7 @@
           </w:tcPr>
           <w:p>
             <w:pPr>
-              <w:spacing w:after="0"/>
+              <w:spacing w:after="0" w:line="240" w:lineRule="exact"/>
               <w:jc w:val="center"/>
               <w:rPr>
                 <w:sz w:val="18"/>
@@ -686,7 +560,7 @@
           </w:tcPr>
           <w:p>
             <w:pPr>
-              <w:spacing w:after="0"/>
+              <w:spacing w:after="0" w:line="240" w:lineRule="exact"/>
               <w:jc w:val="center"/>
               <w:rPr>
                 <w:sz w:val="18"/>
@@ -712,7 +586,7 @@
           </w:tcPr>
           <w:p>
             <w:pPr>
-              <w:spacing w:after="0"/>
+              <w:spacing w:after="0" w:line="240" w:lineRule="exact"/>
               <w:jc w:val="center"/>
               <w:rPr>
                 <w:sz w:val="18"/>
@@ -738,7 +612,7 @@
           </w:tcPr>
           <w:p>
             <w:pPr>
-              <w:spacing w:after="0"/>
+              <w:spacing w:after="0" w:line="240" w:lineRule="exact"/>
               <w:jc w:val="center"/>
               <w:rPr>
                 <w:sz w:val="18"/>
@@ -764,7 +638,7 @@
           </w:tcPr>
           <w:p>
             <w:pPr>
-              <w:spacing w:after="0"/>
+              <w:spacing w:after="0" w:line="240" w:lineRule="exact"/>
               <w:jc w:val="center"/>
               <w:rPr>
                 <w:sz w:val="18"/>
@@ -792,7 +666,7 @@
           </w:tcPr>
           <w:p>
             <w:pPr>
-              <w:spacing w:after="0"/>
+              <w:spacing w:after="0" w:line="240" w:lineRule="exact"/>
               <w:jc w:val="center"/>
               <w:rPr>
                 <w:sz w:val="18"/>
@@ -818,7 +692,7 @@
           </w:tcPr>
           <w:p>
             <w:pPr>
-              <w:spacing w:after="0"/>
+              <w:spacing w:after="0" w:line="240" w:lineRule="exact"/>
               <w:jc w:val="center"/>
               <w:rPr>
                 <w:sz w:val="18"/>
@@ -842,7 +716,7 @@
           </w:tcPr>
           <w:p>
             <w:pPr>
-              <w:spacing w:after="0"/>
+              <w:spacing w:after="0" w:line="240" w:lineRule="exact"/>
               <w:jc w:val="center"/>
               <w:rPr>
                 <w:sz w:val="18"/>
@@ -886,7 +760,7 @@
           </w:tcPr>
           <w:p>
             <w:pPr>
-              <w:spacing w:after="0"/>
+              <w:spacing w:after="0" w:line="240" w:lineRule="exact"/>
               <w:jc w:val="center"/>
               <w:rPr>
                 <w:sz w:val="18"/>
@@ -912,7 +786,7 @@
           </w:tcPr>
           <w:p>
             <w:pPr>
-              <w:spacing w:after="0"/>
+              <w:spacing w:after="0" w:line="240" w:lineRule="exact"/>
               <w:jc w:val="center"/>
               <w:rPr>
                 <w:sz w:val="18"/>
@@ -947,7 +821,7 @@
           </w:tcPr>
           <w:p>
             <w:pPr>
-              <w:spacing w:after="0"/>
+              <w:spacing w:after="0" w:line="240" w:lineRule="exact"/>
               <w:jc w:val="center"/>
               <w:rPr>
                 <w:sz w:val="18"/>
@@ -973,7 +847,7 @@
           </w:tcPr>
           <w:p>
             <w:pPr>
-              <w:spacing w:after="0"/>
+              <w:spacing w:after="0" w:line="240" w:lineRule="exact"/>
               <w:jc w:val="center"/>
               <w:rPr>
                 <w:sz w:val="18"/>
@@ -999,7 +873,7 @@
           </w:tcPr>
           <w:p>
             <w:pPr>
-              <w:spacing w:after="0"/>
+              <w:spacing w:after="0" w:line="240" w:lineRule="exact"/>
               <w:jc w:val="center"/>
               <w:rPr>
                 <w:sz w:val="18"/>
@@ -1031,7 +905,7 @@
           </w:tcPr>
           <w:p>
             <w:pPr>
-              <w:spacing w:after="0"/>
+              <w:spacing w:after="0" w:line="240" w:lineRule="exact"/>
               <w:jc w:val="center"/>
               <w:rPr>
                 <w:sz w:val="18"/>
@@ -1048,7 +922,7 @@
           </w:tcPr>
           <w:p>
             <w:pPr>
-              <w:spacing w:after="0"/>
+              <w:spacing w:after="0" w:line="240" w:lineRule="exact"/>
               <w:jc w:val="center"/>
               <w:rPr>
                 <w:sz w:val="18"/>
@@ -1065,7 +939,7 @@
           </w:tcPr>
           <w:p>
             <w:pPr>
-              <w:spacing w:after="0"/>
+              <w:spacing w:after="0" w:line="240" w:lineRule="exact"/>
               <w:jc w:val="center"/>
               <w:rPr>
                 <w:sz w:val="18"/>
@@ -1082,7 +956,7 @@
           </w:tcPr>
           <w:p>
             <w:pPr>
-              <w:spacing w:after="0"/>
+              <w:spacing w:after="0" w:line="240" w:lineRule="exact"/>
               <w:jc w:val="center"/>
               <w:rPr>
                 <w:sz w:val="18"/>
@@ -1099,7 +973,7 @@
           </w:tcPr>
           <w:p>
             <w:pPr>
-              <w:spacing w:after="0"/>
+              <w:spacing w:after="0" w:line="240" w:lineRule="exact"/>
               <w:jc w:val="center"/>
               <w:rPr>
                 <w:sz w:val="18"/>
@@ -1116,7 +990,7 @@
           </w:tcPr>
           <w:p>
             <w:pPr>
-              <w:spacing w:after="0"/>
+              <w:spacing w:after="0" w:line="240" w:lineRule="exact"/>
               <w:jc w:val="center"/>
               <w:rPr>
                 <w:sz w:val="18"/>
@@ -1133,7 +1007,7 @@
           </w:tcPr>
           <w:p>
             <w:pPr>
-              <w:spacing w:after="0"/>
+              <w:spacing w:after="0" w:line="240" w:lineRule="exact"/>
               <w:jc w:val="center"/>
               <w:rPr>
                 <w:sz w:val="18"/>
@@ -1150,7 +1024,7 @@
           </w:tcPr>
           <w:p>
             <w:pPr>
-              <w:spacing w:after="0"/>
+              <w:spacing w:after="0" w:line="240" w:lineRule="exact"/>
               <w:jc w:val="center"/>
               <w:rPr>
                 <w:sz w:val="18"/>
@@ -1167,7 +1041,7 @@
           </w:tcPr>
           <w:p>
             <w:pPr>
-              <w:spacing w:after="0"/>
+              <w:spacing w:after="0" w:line="240" w:lineRule="exact"/>
               <w:jc w:val="center"/>
               <w:rPr>
                 <w:sz w:val="18"/>
@@ -1184,7 +1058,7 @@
           </w:tcPr>
           <w:p>
             <w:pPr>
-              <w:spacing w:after="0"/>
+              <w:spacing w:after="0" w:line="240" w:lineRule="exact"/>
               <w:jc w:val="center"/>
               <w:rPr>
                 <w:sz w:val="18"/>
@@ -1201,7 +1075,7 @@
           </w:tcPr>
           <w:p>
             <w:pPr>
-              <w:spacing w:after="0"/>
+              <w:spacing w:after="0" w:line="240" w:lineRule="exact"/>
               <w:jc w:val="center"/>
               <w:rPr>
                 <w:sz w:val="18"/>
@@ -1218,23 +1092,23 @@
           </w:tcPr>
           <w:p>
             <w:pPr>
-              <w:spacing w:after="0"/>
-              <w:jc w:val="center"/>
-              <w:rPr>
-                <w:sz w:val="18"/>
-                <w:szCs w:val="18"/>
-              </w:rPr>
-            </w:pPr>
-          </w:p>
-        </w:tc>
-        <w:tc>
-          <w:tcPr>
-            <w:tcW w:w="630" w:type="dxa"/>
-            <w:vAlign w:val="center"/>
-          </w:tcPr>
-          <w:p>
-            <w:pPr>
-              <w:spacing w:after="0"/>
+              <w:spacing w:after="0" w:line="240" w:lineRule="exact"/>
+              <w:jc w:val="center"/>
+              <w:rPr>
+                <w:sz w:val="18"/>
+                <w:szCs w:val="18"/>
+              </w:rPr>
+            </w:pPr>
+          </w:p>
+        </w:tc>
+        <w:tc>
+          <w:tcPr>
+            <w:tcW w:w="630" w:type="dxa"/>
+            <w:vAlign w:val="center"/>
+          </w:tcPr>
+          <w:p>
+            <w:pPr>
+              <w:spacing w:after="0" w:line="240" w:lineRule="exact"/>
               <w:jc w:val="center"/>
               <w:rPr>
                 <w:sz w:val="18"/>
@@ -1259,7 +1133,7 @@
           </w:tcPr>
           <w:p>
             <w:pPr>
-              <w:spacing w:after="0"/>
+              <w:spacing w:after="0" w:line="240" w:lineRule="exact"/>
               <w:jc w:val="center"/>
               <w:rPr>
                 <w:sz w:val="18"/>
@@ -1284,7 +1158,7 @@
           </w:tcPr>
           <w:p>
             <w:pPr>
-              <w:spacing w:after="0"/>
+              <w:spacing w:after="0" w:line="240" w:lineRule="exact"/>
               <w:jc w:val="center"/>
               <w:rPr>
                 <w:sz w:val="18"/>
@@ -1309,7 +1183,7 @@
           </w:tcPr>
           <w:p>
             <w:pPr>
-              <w:spacing w:after="0"/>
+              <w:spacing w:after="0" w:line="240" w:lineRule="exact"/>
               <w:jc w:val="center"/>
               <w:rPr>
                 <w:sz w:val="18"/>
@@ -1353,7 +1227,7 @@
           </w:tcPr>
           <w:p>
             <w:pPr>
-              <w:spacing w:after="0"/>
+              <w:spacing w:after="0" w:line="240" w:lineRule="exact"/>
               <w:jc w:val="center"/>
               <w:rPr>
                 <w:sz w:val="18"/>
@@ -1370,7 +1244,7 @@
           </w:tcPr>
           <w:p>
             <w:pPr>
-              <w:spacing w:after="0"/>
+              <w:spacing w:after="0" w:line="240" w:lineRule="exact"/>
               <w:jc w:val="center"/>
               <w:rPr>
                 <w:sz w:val="18"/>
@@ -1387,7 +1261,7 @@
           </w:tcPr>
           <w:p>
             <w:pPr>
-              <w:spacing w:after="0"/>
+              <w:spacing w:after="0" w:line="240" w:lineRule="exact"/>
               <w:jc w:val="center"/>
               <w:rPr>
                 <w:sz w:val="18"/>
@@ -1404,7 +1278,7 @@
           </w:tcPr>
           <w:p>
             <w:pPr>
-              <w:spacing w:after="0"/>
+              <w:spacing w:after="0" w:line="240" w:lineRule="exact"/>
               <w:jc w:val="center"/>
               <w:rPr>
                 <w:sz w:val="18"/>
@@ -1421,7 +1295,7 @@
           </w:tcPr>
           <w:p>
             <w:pPr>
-              <w:spacing w:after="0"/>
+              <w:spacing w:after="0" w:line="240" w:lineRule="exact"/>
               <w:jc w:val="center"/>
               <w:rPr>
                 <w:sz w:val="18"/>
@@ -1438,7 +1312,7 @@
           </w:tcPr>
           <w:p>
             <w:pPr>
-              <w:spacing w:after="0"/>
+              <w:spacing w:after="0" w:line="240" w:lineRule="exact"/>
               <w:jc w:val="center"/>
               <w:rPr>
                 <w:sz w:val="18"/>
@@ -1455,7 +1329,7 @@
           </w:tcPr>
           <w:p>
             <w:pPr>
-              <w:spacing w:after="0"/>
+              <w:spacing w:after="0" w:line="240" w:lineRule="exact"/>
               <w:jc w:val="center"/>
               <w:rPr>
                 <w:sz w:val="18"/>
@@ -1472,7 +1346,7 @@
           </w:tcPr>
           <w:p>
             <w:pPr>
-              <w:spacing w:after="0"/>
+              <w:spacing w:after="0" w:line="240" w:lineRule="exact"/>
               <w:jc w:val="center"/>
               <w:rPr>
                 <w:sz w:val="18"/>
@@ -1494,7 +1368,7 @@
           </w:tcPr>
           <w:p>
             <w:pPr>
-              <w:spacing w:after="0"/>
+              <w:spacing w:after="0" w:line="240" w:lineRule="exact"/>
               <w:jc w:val="center"/>
               <w:rPr>
                 <w:sz w:val="18"/>
@@ -1519,7 +1393,7 @@
           </w:tcPr>
           <w:p>
             <w:pPr>
-              <w:spacing w:after="0"/>
+              <w:spacing w:after="0" w:line="240" w:lineRule="exact"/>
               <w:jc w:val="center"/>
               <w:rPr>
                 <w:sz w:val="18"/>
@@ -1544,7 +1418,7 @@
           </w:tcPr>
           <w:p>
             <w:pPr>
-              <w:spacing w:after="0"/>
+              <w:spacing w:after="0" w:line="240" w:lineRule="exact"/>
               <w:jc w:val="center"/>
               <w:rPr>
                 <w:sz w:val="18"/>
@@ -1569,7 +1443,7 @@
           </w:tcPr>
           <w:p>
             <w:pPr>
-              <w:spacing w:after="0"/>
+              <w:spacing w:after="0" w:line="240" w:lineRule="exact"/>
               <w:jc w:val="center"/>
               <w:rPr>
                 <w:sz w:val="18"/>
@@ -1594,7 +1468,7 @@
           </w:tcPr>
           <w:p>
             <w:pPr>
-              <w:spacing w:after="0"/>
+              <w:spacing w:after="0" w:line="240" w:lineRule="exact"/>
               <w:jc w:val="center"/>
               <w:rPr>
                 <w:sz w:val="18"/>
@@ -1619,7 +1493,7 @@
           </w:tcPr>
           <w:p>
             <w:pPr>
-              <w:spacing w:after="0"/>
+              <w:spacing w:after="0" w:line="240" w:lineRule="exact"/>
               <w:jc w:val="center"/>
               <w:rPr>
                 <w:sz w:val="18"/>
@@ -1644,7 +1518,7 @@
           </w:tcPr>
           <w:p>
             <w:pPr>
-              <w:spacing w:after="0"/>
+              <w:spacing w:after="0" w:line="240" w:lineRule="exact"/>
               <w:jc w:val="center"/>
               <w:rPr>
                 <w:sz w:val="18"/>
@@ -1669,7 +1543,7 @@
           </w:tcPr>
           <w:p>
             <w:pPr>
-              <w:spacing w:after="0"/>
+              <w:spacing w:after="0" w:line="240" w:lineRule="exact"/>
               <w:jc w:val="center"/>
               <w:rPr>
                 <w:sz w:val="18"/>
@@ -1694,7 +1568,7 @@
           </w:tcPr>
           <w:p>
             <w:pPr>
-              <w:spacing w:after="0"/>
+              <w:spacing w:after="0" w:line="240" w:lineRule="exact"/>
               <w:jc w:val="center"/>
               <w:rPr>
                 <w:sz w:val="18"/>
@@ -1719,7 +1593,7 @@
           </w:tcPr>
           <w:p>
             <w:pPr>
-              <w:spacing w:after="0"/>
+              <w:spacing w:after="0" w:line="240" w:lineRule="exact"/>
               <w:jc w:val="center"/>
               <w:rPr>
                 <w:sz w:val="18"/>
@@ -1744,7 +1618,7 @@
           </w:tcPr>
           <w:p>
             <w:pPr>
-              <w:spacing w:after="0"/>
+              <w:spacing w:after="0" w:line="240" w:lineRule="exact"/>
               <w:jc w:val="center"/>
               <w:rPr>
                 <w:sz w:val="18"/>
@@ -1769,7 +1643,7 @@
           </w:tcPr>
           <w:p>
             <w:pPr>
-              <w:spacing w:after="0"/>
+              <w:spacing w:after="0" w:line="240" w:lineRule="exact"/>
               <w:jc w:val="center"/>
               <w:rPr>
                 <w:sz w:val="18"/>
@@ -1794,7 +1668,7 @@
           </w:tcPr>
           <w:p>
             <w:pPr>
-              <w:spacing w:after="0"/>
+              <w:spacing w:after="0" w:line="240" w:lineRule="exact"/>
               <w:jc w:val="center"/>
               <w:rPr>
                 <w:sz w:val="18"/>
@@ -1819,7 +1693,7 @@
           </w:tcPr>
           <w:p>
             <w:pPr>
-              <w:spacing w:after="0"/>
+              <w:spacing w:after="0" w:line="240" w:lineRule="exact"/>
               <w:jc w:val="center"/>
               <w:rPr>
                 <w:sz w:val="18"/>
@@ -1844,7 +1718,7 @@
           </w:tcPr>
           <w:p>
             <w:pPr>
-              <w:spacing w:after="0"/>
+              <w:spacing w:after="0" w:line="240" w:lineRule="exact"/>
               <w:jc w:val="center"/>
               <w:rPr>
                 <w:sz w:val="18"/>
@@ -1869,7 +1743,7 @@
           </w:tcPr>
           <w:p>
             <w:pPr>
-              <w:spacing w:after="0"/>
+              <w:spacing w:after="0" w:line="240" w:lineRule="exact"/>
               <w:jc w:val="center"/>
               <w:rPr>
                 <w:sz w:val="18"/>
@@ -1894,7 +1768,7 @@
           </w:tcPr>
           <w:p>
             <w:pPr>
-              <w:spacing w:after="0"/>
+              <w:spacing w:after="0" w:line="240" w:lineRule="exact"/>
               <w:jc w:val="center"/>
               <w:rPr>
                 <w:sz w:val="18"/>
@@ -1919,7 +1793,7 @@
           </w:tcPr>
           <w:p>
             <w:pPr>
-              <w:spacing w:after="0"/>
+              <w:spacing w:after="0" w:line="240" w:lineRule="exact"/>
               <w:jc w:val="center"/>
               <w:rPr>
                 <w:sz w:val="18"/>
@@ -1944,7 +1818,7 @@
           </w:tcPr>
           <w:p>
             <w:pPr>
-              <w:spacing w:after="0"/>
+              <w:spacing w:after="0" w:line="240" w:lineRule="exact"/>
               <w:jc w:val="center"/>
               <w:rPr>
                 <w:sz w:val="18"/>
@@ -1969,7 +1843,7 @@
           </w:tcPr>
           <w:p>
             <w:pPr>
-              <w:spacing w:after="0"/>
+              <w:spacing w:after="0" w:line="240" w:lineRule="exact"/>
               <w:jc w:val="center"/>
               <w:rPr>
                 <w:sz w:val="18"/>
@@ -1994,7 +1868,7 @@
           </w:tcPr>
           <w:p>
             <w:pPr>
-              <w:spacing w:after="0"/>
+              <w:spacing w:after="0" w:line="240" w:lineRule="exact"/>
               <w:jc w:val="center"/>
               <w:rPr>
                 <w:sz w:val="18"/>
@@ -2019,7 +1893,7 @@
           </w:tcPr>
           <w:p>
             <w:pPr>
-              <w:spacing w:after="0"/>
+              <w:spacing w:after="0" w:line="240" w:lineRule="exact"/>
               <w:jc w:val="center"/>
               <w:rPr>
                 <w:sz w:val="18"/>
@@ -2044,7 +1918,7 @@
           </w:tcPr>
           <w:p>
             <w:pPr>
-              <w:spacing w:after="0"/>
+              <w:spacing w:after="0" w:line="240" w:lineRule="exact"/>
               <w:jc w:val="center"/>
               <w:rPr>
                 <w:sz w:val="18"/>
@@ -2069,7 +1943,7 @@
           </w:tcPr>
           <w:p>
             <w:pPr>
-              <w:spacing w:after="0"/>
+              <w:spacing w:after="0" w:line="240" w:lineRule="exact"/>
               <w:jc w:val="center"/>
               <w:rPr>
                 <w:sz w:val="18"/>
@@ -2100,375 +1974,375 @@
           </w:tcPr>
           <w:p>
             <w:pPr>
-              <w:spacing w:after="0"/>
-              <w:jc w:val="center"/>
-              <w:rPr>
-                <w:sz w:val="18"/>
-                <w:szCs w:val="18"/>
-              </w:rPr>
-            </w:pPr>
-          </w:p>
-        </w:tc>
-        <w:tc>
-          <w:tcPr>
-            <w:tcW w:w="630" w:type="dxa"/>
-            <w:vAlign w:val="center"/>
-          </w:tcPr>
-          <w:p>
-            <w:pPr>
-              <w:spacing w:after="0"/>
-              <w:jc w:val="center"/>
-              <w:rPr>
-                <w:sz w:val="18"/>
-                <w:szCs w:val="18"/>
-              </w:rPr>
-            </w:pPr>
-          </w:p>
-        </w:tc>
-        <w:tc>
-          <w:tcPr>
-            <w:tcW w:w="630" w:type="dxa"/>
-            <w:vAlign w:val="center"/>
-          </w:tcPr>
-          <w:p>
-            <w:pPr>
-              <w:spacing w:after="0"/>
-              <w:jc w:val="center"/>
-              <w:rPr>
-                <w:sz w:val="18"/>
-                <w:szCs w:val="18"/>
-              </w:rPr>
-            </w:pPr>
-          </w:p>
-        </w:tc>
-        <w:tc>
-          <w:tcPr>
-            <w:tcW w:w="630" w:type="dxa"/>
-            <w:vAlign w:val="center"/>
-          </w:tcPr>
-          <w:p>
-            <w:pPr>
-              <w:spacing w:after="0"/>
-              <w:jc w:val="center"/>
-              <w:rPr>
-                <w:sz w:val="18"/>
-                <w:szCs w:val="18"/>
-              </w:rPr>
-            </w:pPr>
-          </w:p>
-        </w:tc>
-        <w:tc>
-          <w:tcPr>
-            <w:tcW w:w="630" w:type="dxa"/>
-            <w:vAlign w:val="center"/>
-          </w:tcPr>
-          <w:p>
-            <w:pPr>
-              <w:spacing w:after="0"/>
-              <w:jc w:val="center"/>
-              <w:rPr>
-                <w:sz w:val="18"/>
-                <w:szCs w:val="18"/>
-              </w:rPr>
-            </w:pPr>
-          </w:p>
-        </w:tc>
-        <w:tc>
-          <w:tcPr>
-            <w:tcW w:w="630" w:type="dxa"/>
-            <w:vAlign w:val="center"/>
-          </w:tcPr>
-          <w:p>
-            <w:pPr>
-              <w:spacing w:after="0"/>
-              <w:jc w:val="center"/>
-              <w:rPr>
-                <w:sz w:val="18"/>
-                <w:szCs w:val="18"/>
-              </w:rPr>
-            </w:pPr>
-          </w:p>
-        </w:tc>
-        <w:tc>
-          <w:tcPr>
-            <w:tcW w:w="630" w:type="dxa"/>
-            <w:vAlign w:val="center"/>
-          </w:tcPr>
-          <w:p>
-            <w:pPr>
-              <w:spacing w:after="0"/>
-              <w:jc w:val="center"/>
-              <w:rPr>
-                <w:sz w:val="18"/>
-                <w:szCs w:val="18"/>
-              </w:rPr>
-            </w:pPr>
-          </w:p>
-        </w:tc>
-        <w:tc>
-          <w:tcPr>
-            <w:tcW w:w="630" w:type="dxa"/>
-            <w:vAlign w:val="center"/>
-          </w:tcPr>
-          <w:p>
-            <w:pPr>
-              <w:spacing w:after="0"/>
-              <w:jc w:val="center"/>
-              <w:rPr>
-                <w:sz w:val="18"/>
-                <w:szCs w:val="18"/>
-              </w:rPr>
-            </w:pPr>
-          </w:p>
-        </w:tc>
-        <w:tc>
-          <w:tcPr>
-            <w:tcW w:w="630" w:type="dxa"/>
-            <w:vAlign w:val="center"/>
-          </w:tcPr>
-          <w:p>
-            <w:pPr>
-              <w:spacing w:after="0"/>
-              <w:jc w:val="center"/>
-              <w:rPr>
-                <w:sz w:val="18"/>
-                <w:szCs w:val="18"/>
-              </w:rPr>
-            </w:pPr>
-          </w:p>
-        </w:tc>
-        <w:tc>
-          <w:tcPr>
-            <w:tcW w:w="630" w:type="dxa"/>
-            <w:vAlign w:val="center"/>
-          </w:tcPr>
-          <w:p>
-            <w:pPr>
-              <w:spacing w:after="0"/>
-              <w:jc w:val="center"/>
-              <w:rPr>
-                <w:sz w:val="18"/>
-                <w:szCs w:val="18"/>
-              </w:rPr>
-            </w:pPr>
-          </w:p>
-        </w:tc>
-        <w:tc>
-          <w:tcPr>
-            <w:tcW w:w="630" w:type="dxa"/>
-            <w:vAlign w:val="center"/>
-          </w:tcPr>
-          <w:p>
-            <w:pPr>
-              <w:spacing w:after="0"/>
-              <w:jc w:val="center"/>
-              <w:rPr>
-                <w:sz w:val="18"/>
-                <w:szCs w:val="18"/>
-              </w:rPr>
-            </w:pPr>
-          </w:p>
-        </w:tc>
-        <w:tc>
-          <w:tcPr>
-            <w:tcW w:w="630" w:type="dxa"/>
-            <w:vAlign w:val="center"/>
-          </w:tcPr>
-          <w:p>
-            <w:pPr>
-              <w:spacing w:after="0"/>
-              <w:jc w:val="center"/>
-              <w:rPr>
-                <w:sz w:val="18"/>
-                <w:szCs w:val="18"/>
-              </w:rPr>
-            </w:pPr>
-          </w:p>
-        </w:tc>
-        <w:tc>
-          <w:tcPr>
-            <w:tcW w:w="630" w:type="dxa"/>
-            <w:vAlign w:val="center"/>
-          </w:tcPr>
-          <w:p>
-            <w:pPr>
-              <w:spacing w:after="0"/>
-              <w:jc w:val="center"/>
-              <w:rPr>
-                <w:sz w:val="18"/>
-                <w:szCs w:val="18"/>
-              </w:rPr>
-            </w:pPr>
-          </w:p>
-        </w:tc>
-        <w:tc>
-          <w:tcPr>
-            <w:tcW w:w="630" w:type="dxa"/>
-            <w:vAlign w:val="center"/>
-          </w:tcPr>
-          <w:p>
-            <w:pPr>
-              <w:spacing w:after="0"/>
-              <w:jc w:val="center"/>
-              <w:rPr>
-                <w:sz w:val="18"/>
-                <w:szCs w:val="18"/>
-              </w:rPr>
-            </w:pPr>
-          </w:p>
-        </w:tc>
-        <w:tc>
-          <w:tcPr>
-            <w:tcW w:w="630" w:type="dxa"/>
-            <w:vAlign w:val="center"/>
-          </w:tcPr>
-          <w:p>
-            <w:pPr>
-              <w:spacing w:after="0"/>
-              <w:jc w:val="center"/>
-              <w:rPr>
-                <w:sz w:val="18"/>
-                <w:szCs w:val="18"/>
-              </w:rPr>
-            </w:pPr>
-          </w:p>
-        </w:tc>
-        <w:tc>
-          <w:tcPr>
-            <w:tcW w:w="630" w:type="dxa"/>
-            <w:vAlign w:val="center"/>
-          </w:tcPr>
-          <w:p>
-            <w:pPr>
-              <w:spacing w:after="0"/>
-              <w:jc w:val="center"/>
-              <w:rPr>
-                <w:sz w:val="18"/>
-                <w:szCs w:val="18"/>
-              </w:rPr>
-            </w:pPr>
-          </w:p>
-        </w:tc>
-        <w:tc>
-          <w:tcPr>
-            <w:tcW w:w="630" w:type="dxa"/>
-            <w:vAlign w:val="center"/>
-          </w:tcPr>
-          <w:p>
-            <w:pPr>
-              <w:spacing w:after="0"/>
-              <w:jc w:val="center"/>
-              <w:rPr>
-                <w:sz w:val="18"/>
-                <w:szCs w:val="18"/>
-              </w:rPr>
-            </w:pPr>
-          </w:p>
-        </w:tc>
-        <w:tc>
-          <w:tcPr>
-            <w:tcW w:w="630" w:type="dxa"/>
-            <w:vAlign w:val="center"/>
-          </w:tcPr>
-          <w:p>
-            <w:pPr>
-              <w:spacing w:after="0"/>
-              <w:jc w:val="center"/>
-              <w:rPr>
-                <w:sz w:val="18"/>
-                <w:szCs w:val="18"/>
-              </w:rPr>
-            </w:pPr>
-          </w:p>
-        </w:tc>
-        <w:tc>
-          <w:tcPr>
-            <w:tcW w:w="630" w:type="dxa"/>
-            <w:vAlign w:val="center"/>
-          </w:tcPr>
-          <w:p>
-            <w:pPr>
-              <w:spacing w:after="0"/>
-              <w:jc w:val="center"/>
-              <w:rPr>
-                <w:sz w:val="18"/>
-                <w:szCs w:val="18"/>
-              </w:rPr>
-            </w:pPr>
-          </w:p>
-        </w:tc>
-        <w:tc>
-          <w:tcPr>
-            <w:tcW w:w="630" w:type="dxa"/>
-            <w:vAlign w:val="center"/>
-          </w:tcPr>
-          <w:p>
-            <w:pPr>
-              <w:spacing w:after="0"/>
-              <w:jc w:val="center"/>
-              <w:rPr>
-                <w:sz w:val="18"/>
-                <w:szCs w:val="18"/>
-              </w:rPr>
-            </w:pPr>
-          </w:p>
-        </w:tc>
-        <w:tc>
-          <w:tcPr>
-            <w:tcW w:w="630" w:type="dxa"/>
-            <w:vAlign w:val="center"/>
-          </w:tcPr>
-          <w:p>
-            <w:pPr>
-              <w:spacing w:after="0"/>
-              <w:jc w:val="center"/>
-              <w:rPr>
-                <w:sz w:val="18"/>
-                <w:szCs w:val="18"/>
-              </w:rPr>
-            </w:pPr>
-          </w:p>
-        </w:tc>
-        <w:tc>
-          <w:tcPr>
-            <w:tcW w:w="630" w:type="dxa"/>
-            <w:vAlign w:val="center"/>
-          </w:tcPr>
-          <w:p>
-            <w:pPr>
-              <w:spacing w:after="0"/>
-              <w:jc w:val="center"/>
-              <w:rPr>
-                <w:sz w:val="18"/>
-                <w:szCs w:val="18"/>
-              </w:rPr>
-            </w:pPr>
-          </w:p>
-        </w:tc>
-        <w:tc>
-          <w:tcPr>
-            <w:tcW w:w="630" w:type="dxa"/>
-            <w:vAlign w:val="center"/>
-          </w:tcPr>
-          <w:p>
-            <w:pPr>
-              <w:spacing w:after="0"/>
-              <w:jc w:val="center"/>
-              <w:rPr>
-                <w:sz w:val="18"/>
-                <w:szCs w:val="18"/>
-              </w:rPr>
-            </w:pPr>
-          </w:p>
-        </w:tc>
-        <w:tc>
-          <w:tcPr>
-            <w:tcW w:w="630" w:type="dxa"/>
-            <w:vAlign w:val="center"/>
-          </w:tcPr>
-          <w:p>
-            <w:pPr>
-              <w:spacing w:after="0"/>
+              <w:spacing w:after="0" w:line="240" w:lineRule="exact"/>
+              <w:jc w:val="center"/>
+              <w:rPr>
+                <w:sz w:val="18"/>
+                <w:szCs w:val="18"/>
+              </w:rPr>
+            </w:pPr>
+          </w:p>
+        </w:tc>
+        <w:tc>
+          <w:tcPr>
+            <w:tcW w:w="630" w:type="dxa"/>
+            <w:vAlign w:val="center"/>
+          </w:tcPr>
+          <w:p>
+            <w:pPr>
+              <w:spacing w:after="0" w:line="240" w:lineRule="exact"/>
+              <w:jc w:val="center"/>
+              <w:rPr>
+                <w:sz w:val="18"/>
+                <w:szCs w:val="18"/>
+              </w:rPr>
+            </w:pPr>
+          </w:p>
+        </w:tc>
+        <w:tc>
+          <w:tcPr>
+            <w:tcW w:w="630" w:type="dxa"/>
+            <w:vAlign w:val="center"/>
+          </w:tcPr>
+          <w:p>
+            <w:pPr>
+              <w:spacing w:after="0" w:line="240" w:lineRule="exact"/>
+              <w:jc w:val="center"/>
+              <w:rPr>
+                <w:sz w:val="18"/>
+                <w:szCs w:val="18"/>
+              </w:rPr>
+            </w:pPr>
+          </w:p>
+        </w:tc>
+        <w:tc>
+          <w:tcPr>
+            <w:tcW w:w="630" w:type="dxa"/>
+            <w:vAlign w:val="center"/>
+          </w:tcPr>
+          <w:p>
+            <w:pPr>
+              <w:spacing w:after="0" w:line="240" w:lineRule="exact"/>
+              <w:jc w:val="center"/>
+              <w:rPr>
+                <w:sz w:val="18"/>
+                <w:szCs w:val="18"/>
+              </w:rPr>
+            </w:pPr>
+          </w:p>
+        </w:tc>
+        <w:tc>
+          <w:tcPr>
+            <w:tcW w:w="630" w:type="dxa"/>
+            <w:vAlign w:val="center"/>
+          </w:tcPr>
+          <w:p>
+            <w:pPr>
+              <w:spacing w:after="0" w:line="240" w:lineRule="exact"/>
+              <w:jc w:val="center"/>
+              <w:rPr>
+                <w:sz w:val="18"/>
+                <w:szCs w:val="18"/>
+              </w:rPr>
+            </w:pPr>
+          </w:p>
+        </w:tc>
+        <w:tc>
+          <w:tcPr>
+            <w:tcW w:w="630" w:type="dxa"/>
+            <w:vAlign w:val="center"/>
+          </w:tcPr>
+          <w:p>
+            <w:pPr>
+              <w:spacing w:after="0" w:line="240" w:lineRule="exact"/>
+              <w:jc w:val="center"/>
+              <w:rPr>
+                <w:sz w:val="18"/>
+                <w:szCs w:val="18"/>
+              </w:rPr>
+            </w:pPr>
+          </w:p>
+        </w:tc>
+        <w:tc>
+          <w:tcPr>
+            <w:tcW w:w="630" w:type="dxa"/>
+            <w:vAlign w:val="center"/>
+          </w:tcPr>
+          <w:p>
+            <w:pPr>
+              <w:spacing w:after="0" w:line="240" w:lineRule="exact"/>
+              <w:jc w:val="center"/>
+              <w:rPr>
+                <w:sz w:val="18"/>
+                <w:szCs w:val="18"/>
+              </w:rPr>
+            </w:pPr>
+          </w:p>
+        </w:tc>
+        <w:tc>
+          <w:tcPr>
+            <w:tcW w:w="630" w:type="dxa"/>
+            <w:vAlign w:val="center"/>
+          </w:tcPr>
+          <w:p>
+            <w:pPr>
+              <w:spacing w:after="0" w:line="240" w:lineRule="exact"/>
+              <w:jc w:val="center"/>
+              <w:rPr>
+                <w:sz w:val="18"/>
+                <w:szCs w:val="18"/>
+              </w:rPr>
+            </w:pPr>
+          </w:p>
+        </w:tc>
+        <w:tc>
+          <w:tcPr>
+            <w:tcW w:w="630" w:type="dxa"/>
+            <w:vAlign w:val="center"/>
+          </w:tcPr>
+          <w:p>
+            <w:pPr>
+              <w:spacing w:after="0" w:line="240" w:lineRule="exact"/>
+              <w:jc w:val="center"/>
+              <w:rPr>
+                <w:sz w:val="18"/>
+                <w:szCs w:val="18"/>
+              </w:rPr>
+            </w:pPr>
+          </w:p>
+        </w:tc>
+        <w:tc>
+          <w:tcPr>
+            <w:tcW w:w="630" w:type="dxa"/>
+            <w:vAlign w:val="center"/>
+          </w:tcPr>
+          <w:p>
+            <w:pPr>
+              <w:spacing w:after="0" w:line="240" w:lineRule="exact"/>
+              <w:jc w:val="center"/>
+              <w:rPr>
+                <w:sz w:val="18"/>
+                <w:szCs w:val="18"/>
+              </w:rPr>
+            </w:pPr>
+          </w:p>
+        </w:tc>
+        <w:tc>
+          <w:tcPr>
+            <w:tcW w:w="630" w:type="dxa"/>
+            <w:vAlign w:val="center"/>
+          </w:tcPr>
+          <w:p>
+            <w:pPr>
+              <w:spacing w:after="0" w:line="240" w:lineRule="exact"/>
+              <w:jc w:val="center"/>
+              <w:rPr>
+                <w:sz w:val="18"/>
+                <w:szCs w:val="18"/>
+              </w:rPr>
+            </w:pPr>
+          </w:p>
+        </w:tc>
+        <w:tc>
+          <w:tcPr>
+            <w:tcW w:w="630" w:type="dxa"/>
+            <w:vAlign w:val="center"/>
+          </w:tcPr>
+          <w:p>
+            <w:pPr>
+              <w:spacing w:after="0" w:line="240" w:lineRule="exact"/>
+              <w:jc w:val="center"/>
+              <w:rPr>
+                <w:sz w:val="18"/>
+                <w:szCs w:val="18"/>
+              </w:rPr>
+            </w:pPr>
+          </w:p>
+        </w:tc>
+        <w:tc>
+          <w:tcPr>
+            <w:tcW w:w="630" w:type="dxa"/>
+            <w:vAlign w:val="center"/>
+          </w:tcPr>
+          <w:p>
+            <w:pPr>
+              <w:spacing w:after="0" w:line="240" w:lineRule="exact"/>
+              <w:jc w:val="center"/>
+              <w:rPr>
+                <w:sz w:val="18"/>
+                <w:szCs w:val="18"/>
+              </w:rPr>
+            </w:pPr>
+          </w:p>
+        </w:tc>
+        <w:tc>
+          <w:tcPr>
+            <w:tcW w:w="630" w:type="dxa"/>
+            <w:vAlign w:val="center"/>
+          </w:tcPr>
+          <w:p>
+            <w:pPr>
+              <w:spacing w:after="0" w:line="240" w:lineRule="exact"/>
+              <w:jc w:val="center"/>
+              <w:rPr>
+                <w:sz w:val="18"/>
+                <w:szCs w:val="18"/>
+              </w:rPr>
+            </w:pPr>
+          </w:p>
+        </w:tc>
+        <w:tc>
+          <w:tcPr>
+            <w:tcW w:w="630" w:type="dxa"/>
+            <w:vAlign w:val="center"/>
+          </w:tcPr>
+          <w:p>
+            <w:pPr>
+              <w:spacing w:after="0" w:line="240" w:lineRule="exact"/>
+              <w:jc w:val="center"/>
+              <w:rPr>
+                <w:sz w:val="18"/>
+                <w:szCs w:val="18"/>
+              </w:rPr>
+            </w:pPr>
+          </w:p>
+        </w:tc>
+        <w:tc>
+          <w:tcPr>
+            <w:tcW w:w="630" w:type="dxa"/>
+            <w:vAlign w:val="center"/>
+          </w:tcPr>
+          <w:p>
+            <w:pPr>
+              <w:spacing w:after="0" w:line="240" w:lineRule="exact"/>
+              <w:jc w:val="center"/>
+              <w:rPr>
+                <w:sz w:val="18"/>
+                <w:szCs w:val="18"/>
+              </w:rPr>
+            </w:pPr>
+          </w:p>
+        </w:tc>
+        <w:tc>
+          <w:tcPr>
+            <w:tcW w:w="630" w:type="dxa"/>
+            <w:vAlign w:val="center"/>
+          </w:tcPr>
+          <w:p>
+            <w:pPr>
+              <w:spacing w:after="0" w:line="240" w:lineRule="exact"/>
+              <w:jc w:val="center"/>
+              <w:rPr>
+                <w:sz w:val="18"/>
+                <w:szCs w:val="18"/>
+              </w:rPr>
+            </w:pPr>
+          </w:p>
+        </w:tc>
+        <w:tc>
+          <w:tcPr>
+            <w:tcW w:w="630" w:type="dxa"/>
+            <w:vAlign w:val="center"/>
+          </w:tcPr>
+          <w:p>
+            <w:pPr>
+              <w:spacing w:after="0" w:line="240" w:lineRule="exact"/>
+              <w:jc w:val="center"/>
+              <w:rPr>
+                <w:sz w:val="18"/>
+                <w:szCs w:val="18"/>
+              </w:rPr>
+            </w:pPr>
+          </w:p>
+        </w:tc>
+        <w:tc>
+          <w:tcPr>
+            <w:tcW w:w="630" w:type="dxa"/>
+            <w:vAlign w:val="center"/>
+          </w:tcPr>
+          <w:p>
+            <w:pPr>
+              <w:spacing w:after="0" w:line="240" w:lineRule="exact"/>
+              <w:jc w:val="center"/>
+              <w:rPr>
+                <w:sz w:val="18"/>
+                <w:szCs w:val="18"/>
+              </w:rPr>
+            </w:pPr>
+          </w:p>
+        </w:tc>
+        <w:tc>
+          <w:tcPr>
+            <w:tcW w:w="630" w:type="dxa"/>
+            <w:vAlign w:val="center"/>
+          </w:tcPr>
+          <w:p>
+            <w:pPr>
+              <w:spacing w:after="0" w:line="240" w:lineRule="exact"/>
+              <w:jc w:val="center"/>
+              <w:rPr>
+                <w:sz w:val="18"/>
+                <w:szCs w:val="18"/>
+              </w:rPr>
+            </w:pPr>
+          </w:p>
+        </w:tc>
+        <w:tc>
+          <w:tcPr>
+            <w:tcW w:w="630" w:type="dxa"/>
+            <w:vAlign w:val="center"/>
+          </w:tcPr>
+          <w:p>
+            <w:pPr>
+              <w:spacing w:after="0" w:line="240" w:lineRule="exact"/>
+              <w:jc w:val="center"/>
+              <w:rPr>
+                <w:sz w:val="18"/>
+                <w:szCs w:val="18"/>
+              </w:rPr>
+            </w:pPr>
+          </w:p>
+        </w:tc>
+        <w:tc>
+          <w:tcPr>
+            <w:tcW w:w="630" w:type="dxa"/>
+            <w:vAlign w:val="center"/>
+          </w:tcPr>
+          <w:p>
+            <w:pPr>
+              <w:spacing w:after="0" w:line="240" w:lineRule="exact"/>
+              <w:jc w:val="center"/>
+              <w:rPr>
+                <w:sz w:val="18"/>
+                <w:szCs w:val="18"/>
+              </w:rPr>
+            </w:pPr>
+          </w:p>
+        </w:tc>
+        <w:tc>
+          <w:tcPr>
+            <w:tcW w:w="630" w:type="dxa"/>
+            <w:vAlign w:val="center"/>
+          </w:tcPr>
+          <w:p>
+            <w:pPr>
+              <w:spacing w:after="0" w:line="240" w:lineRule="exact"/>
+              <w:jc w:val="center"/>
+              <w:rPr>
+                <w:sz w:val="18"/>
+                <w:szCs w:val="18"/>
+              </w:rPr>
+            </w:pPr>
+          </w:p>
+        </w:tc>
+        <w:tc>
+          <w:tcPr>
+            <w:tcW w:w="630" w:type="dxa"/>
+            <w:vAlign w:val="center"/>
+          </w:tcPr>
+          <w:p>
+            <w:pPr>
+              <w:spacing w:after="0" w:line="240" w:lineRule="exact"/>
               <w:jc w:val="center"/>
               <w:rPr>
                 <w:sz w:val="18"/>
@@ -2481,7 +2355,7 @@
     </w:tbl>
     <w:p>
       <w:pPr>
-        <w:spacing w:after="40"/>
+        <w:spacing w:after="0" w:line="240" w:lineRule="exact"/>
         <w:rPr>
           <w:sz w:val="18"/>
           <w:szCs w:val="18"/>
@@ -2523,39 +2397,21 @@
           </w:tcPr>
           <w:p>
             <w:pPr>
-              <w:spacing w:after="30"/>
-            </w:pPr>
-            <w:r>
-              <w:rPr>
-                <w:rFonts w:ascii="Sylfaen" w:eastAsia="Sylfaen" w:hAnsi="Sylfaen" w:cs="Sylfaen"/>
-                <w:b/>
-                <w:bCs/>
-                <w:lang w:val="hy-AM" w:bidi="hy-AM"/>
-              </w:rPr>
-              <w:t>Ընդունված</w:t>
-            </w:r>
-            <w:r>
-              <w:rPr>
-                <w:rFonts w:ascii="Sylfaen" w:eastAsia="Sylfaen" w:hAnsi="Sylfaen" w:cs="Sylfaen"/>
-                <w:b/>
-                <w:bCs/>
-                <w:lang w:val="hy-AM" w:bidi="hy-AM"/>
-              </w:rPr>
-              <w:t xml:space="preserve"> </w:t>
-            </w:r>
-            <w:r>
-              <w:rPr>
-                <w:rFonts w:ascii="Sylfaen" w:eastAsia="Sylfaen" w:hAnsi="Sylfaen" w:cs="Sylfaen"/>
-                <w:b/>
-                <w:bCs/>
-                <w:lang w:val="hy-AM" w:bidi="hy-AM"/>
-              </w:rPr>
-              <w:t>հիվանդներ</w:t>
-            </w:r>
-          </w:p>
-          <w:p>
-            <w:pPr>
-              <w:spacing w:after="10"/>
+              <w:spacing w:after="0" w:line="240" w:lineRule="exact"/>
+            </w:pPr>
+            <w:r>
+              <w:rPr>
+                <w:rFonts w:ascii="Sylfaen" w:eastAsia="Sylfaen" w:hAnsi="Sylfaen" w:cs="Sylfaen"/>
+                <w:b/>
+                <w:bCs/>
+                <w:lang w:val="hy-AM" w:bidi="hy-AM"/>
+              </w:rPr>
+              <w:t>Տեղափոխված հիվանդներ</w:t>
+            </w:r>
+          </w:p>
+          <w:p>
+            <w:pPr>
+              <w:spacing w:after="0" w:line="240" w:lineRule="exact"/>
             </w:pPr>
             <w:r>
               <w:rPr>
@@ -2567,7 +2423,7 @@
           </w:p>
           <w:p>
             <w:pPr>
-              <w:spacing w:after="10"/>
+              <w:spacing w:after="0" w:line="240" w:lineRule="exact"/>
             </w:pPr>
             <w:r>
               <w:rPr>
@@ -2579,7 +2435,7 @@
           </w:p>
           <w:p>
             <w:pPr>
-              <w:spacing w:after="10"/>
+              <w:spacing w:after="0" w:line="240" w:lineRule="exact"/>
             </w:pPr>
             <w:r>
               <w:rPr>
@@ -2591,7 +2447,7 @@
           </w:p>
           <w:p>
             <w:pPr>
-              <w:spacing w:after="10"/>
+              <w:spacing w:after="0" w:line="240" w:lineRule="exact"/>
             </w:pPr>
             <w:r>
               <w:rPr>
@@ -2603,7 +2459,7 @@
           </w:p>
           <w:p>
             <w:pPr>
-              <w:spacing w:after="10"/>
+              <w:spacing w:after="0" w:line="240" w:lineRule="exact"/>
             </w:pPr>
             <w:r>
               <w:rPr>
@@ -2620,57 +2476,21 @@
           </w:tcPr>
           <w:p>
             <w:pPr>
-              <w:spacing w:after="30"/>
-            </w:pPr>
-            <w:r>
-              <w:rPr>
-                <w:rFonts w:ascii="Sylfaen" w:eastAsia="Sylfaen" w:hAnsi="Sylfaen" w:cs="Sylfaen"/>
-                <w:b/>
-                <w:bCs/>
-                <w:lang w:val="hy-AM" w:bidi="hy-AM"/>
-              </w:rPr>
-              <w:t>Դուրս</w:t>
-            </w:r>
-            <w:r>
-              <w:rPr>
-                <w:rFonts w:ascii="Sylfaen" w:eastAsia="Sylfaen" w:hAnsi="Sylfaen" w:cs="Sylfaen"/>
-                <w:b/>
-                <w:bCs/>
-                <w:lang w:val="hy-AM" w:bidi="hy-AM"/>
-              </w:rPr>
-              <w:t xml:space="preserve"> </w:t>
-            </w:r>
-            <w:r>
-              <w:rPr>
-                <w:rFonts w:ascii="Sylfaen" w:eastAsia="Sylfaen" w:hAnsi="Sylfaen" w:cs="Sylfaen"/>
-                <w:b/>
-                <w:bCs/>
-                <w:lang w:val="hy-AM" w:bidi="hy-AM"/>
-              </w:rPr>
-              <w:t>գրված</w:t>
-            </w:r>
-            <w:r>
-              <w:rPr>
-                <w:rFonts w:ascii="Sylfaen" w:eastAsia="Sylfaen" w:hAnsi="Sylfaen" w:cs="Sylfaen"/>
-                <w:b/>
-                <w:bCs/>
-                <w:lang w:val="hy-AM" w:bidi="hy-AM"/>
-              </w:rPr>
-              <w:t xml:space="preserve"> </w:t>
-            </w:r>
-            <w:r>
-              <w:rPr>
-                <w:rFonts w:ascii="Sylfaen" w:eastAsia="Sylfaen" w:hAnsi="Sylfaen" w:cs="Sylfaen"/>
-                <w:b/>
-                <w:bCs/>
-                <w:lang w:val="hy-AM" w:bidi="hy-AM"/>
-              </w:rPr>
-              <w:t>հիվանդներ</w:t>
-            </w:r>
-          </w:p>
-          <w:p>
-            <w:pPr>
-              <w:spacing w:after="10"/>
+              <w:spacing w:after="0" w:line="240" w:lineRule="exact"/>
+            </w:pPr>
+            <w:r>
+              <w:rPr>
+                <w:rFonts w:ascii="Sylfaen" w:eastAsia="Sylfaen" w:hAnsi="Sylfaen" w:cs="Sylfaen"/>
+                <w:b/>
+                <w:bCs/>
+                <w:lang w:val="hy-AM" w:bidi="hy-AM"/>
+              </w:rPr>
+              <w:t>Վերադարձել են արձակուրդից</w:t>
+            </w:r>
+          </w:p>
+          <w:p>
+            <w:pPr>
+              <w:spacing w:after="0" w:line="240" w:lineRule="exact"/>
             </w:pPr>
             <w:r>
               <w:rPr>
@@ -2682,7 +2502,7 @@
           </w:p>
           <w:p>
             <w:pPr>
-              <w:spacing w:after="10"/>
+              <w:spacing w:after="0" w:line="240" w:lineRule="exact"/>
             </w:pPr>
             <w:r>
               <w:rPr>
@@ -2694,7 +2514,7 @@
           </w:p>
           <w:p>
             <w:pPr>
-              <w:spacing w:after="10"/>
+              <w:spacing w:after="0" w:line="240" w:lineRule="exact"/>
             </w:pPr>
             <w:r>
               <w:rPr>
@@ -2706,7 +2526,7 @@
           </w:p>
           <w:p>
             <w:pPr>
-              <w:spacing w:after="10"/>
+              <w:spacing w:after="0" w:line="240" w:lineRule="exact"/>
             </w:pPr>
             <w:r>
               <w:rPr>
@@ -2718,7 +2538,7 @@
           </w:p>
           <w:p>
             <w:pPr>
-              <w:spacing w:after="10"/>
+              <w:spacing w:after="0" w:line="240" w:lineRule="exact"/>
             </w:pPr>
             <w:r>
               <w:rPr>
@@ -2726,18 +2546,6 @@
                 <w:lang w:val="hy-AM" w:bidi="hy-AM"/>
               </w:rPr>
               <w:t>5. ________________________________________________</w:t>
-            </w:r>
-          </w:p>
-          <w:p>
-            <w:pPr>
-              <w:spacing w:after="10"/>
-            </w:pPr>
-            <w:r>
-              <w:rPr>
-                <w:rFonts w:ascii="Sylfaen" w:eastAsia="Sylfaen" w:hAnsi="Sylfaen" w:cs="Sylfaen"/>
-                <w:lang w:val="hy-AM" w:bidi="hy-AM"/>
-              </w:rPr>
-              <w:t>6. ________________________________________________</w:t>
             </w:r>
           </w:p>
         </w:tc>
@@ -2752,16 +2560,25 @@
           </w:tcPr>
           <w:p>
             <w:pPr>
-              <w:spacing w:after="30"/>
-            </w:pPr>
-            <w:r>
-              <w:rPr>
-                <w:rFonts w:ascii="Sylfaen" w:eastAsia="Sylfaen" w:hAnsi="Sylfaen" w:cs="Sylfaen"/>
-                <w:b/>
-                <w:bCs/>
-                <w:lang w:val="hy-AM" w:bidi="hy-AM"/>
-              </w:rPr>
-              <w:t>Տեղափոխված</w:t>
+              <w:spacing w:after="0" w:line="240" w:lineRule="exact"/>
+            </w:pPr>
+            <w:r>
+              <w:rPr>
+                <w:rFonts w:ascii="Sylfaen" w:eastAsia="Sylfaen" w:hAnsi="Sylfaen" w:cs="Sylfaen"/>
+                <w:b/>
+                <w:bCs/>
+                <w:lang w:val="hy-AM" w:bidi="hy-AM"/>
+              </w:rPr>
+              <w:t xml:space="preserve">Դուրս գրված </w:t>
+            </w:r>
+            <w:r>
+              <w:rPr>
+                <w:rFonts w:ascii="Sylfaen" w:eastAsia="Sylfaen" w:hAnsi="Sylfaen" w:cs="Sylfaen"/>
+                <w:b/>
+                <w:bCs/>
+                <w:lang w:val="hy-AM" w:bidi="hy-AM"/>
+              </w:rPr>
+              <w:t>–</w:t>
             </w:r>
             <w:r>
               <w:rPr>
@@ -2779,12 +2596,39 @@
                 <w:bCs/>
                 <w:lang w:val="hy-AM" w:bidi="hy-AM"/>
               </w:rPr>
+              <w:t>չտարվա</w:t>
+            </w:r>
+            <w:r>
+              <w:rPr>
+                <w:rFonts w:ascii="Sylfaen" w:eastAsia="Sylfaen" w:hAnsi="Sylfaen" w:cs="Sylfaen"/>
+                <w:b/>
+                <w:bCs/>
+                <w:lang w:val="hy-AM" w:bidi="hy-AM"/>
+              </w:rPr>
+              <w:t>ծ</w:t>
+            </w:r>
+            <w:r>
+              <w:rPr>
+                <w:rFonts w:ascii="Sylfaen" w:eastAsia="Sylfaen" w:hAnsi="Sylfaen" w:cs="Sylfaen"/>
+                <w:b/>
+                <w:bCs/>
+                <w:lang w:val="hy-AM" w:bidi="hy-AM"/>
+              </w:rPr>
+              <w:t xml:space="preserve"> </w:t>
+            </w:r>
+            <w:r>
+              <w:rPr>
+                <w:rFonts w:ascii="Sylfaen" w:eastAsia="Sylfaen" w:hAnsi="Sylfaen" w:cs="Sylfaen"/>
+                <w:b/>
+                <w:bCs/>
+                <w:lang w:val="hy-AM" w:bidi="hy-AM"/>
+              </w:rPr>
               <w:t>հիվանդներ</w:t>
             </w:r>
           </w:p>
           <w:p>
             <w:pPr>
-              <w:spacing w:after="10"/>
+              <w:spacing w:after="0" w:line="240" w:lineRule="exact"/>
             </w:pPr>
             <w:r>
               <w:rPr>
@@ -2796,7 +2640,7 @@
           </w:p>
           <w:p>
             <w:pPr>
-              <w:spacing w:after="10"/>
+              <w:spacing w:after="0" w:line="240" w:lineRule="exact"/>
             </w:pPr>
             <w:r>
               <w:rPr>
@@ -2808,7 +2652,7 @@
           </w:p>
           <w:p>
             <w:pPr>
-              <w:spacing w:after="10"/>
+              <w:spacing w:after="0" w:line="240" w:lineRule="exact"/>
             </w:pPr>
             <w:r>
               <w:rPr>
@@ -2820,7 +2664,7 @@
           </w:p>
           <w:p>
             <w:pPr>
-              <w:spacing w:after="10"/>
+              <w:spacing w:after="0" w:line="240" w:lineRule="exact"/>
             </w:pPr>
             <w:r>
               <w:rPr>
@@ -2832,7 +2676,7 @@
           </w:p>
           <w:p>
             <w:pPr>
-              <w:spacing w:after="10"/>
+              <w:spacing w:after="0" w:line="240" w:lineRule="exact"/>
             </w:pPr>
             <w:r>
               <w:rPr>
@@ -2849,57 +2693,21 @@
           </w:tcPr>
           <w:p>
             <w:pPr>
-              <w:spacing w:after="30"/>
-            </w:pPr>
-            <w:r>
-              <w:rPr>
-                <w:rFonts w:ascii="Sylfaen" w:eastAsia="Sylfaen" w:hAnsi="Sylfaen" w:cs="Sylfaen"/>
-                <w:b/>
-                <w:bCs/>
-                <w:lang w:val="hy-AM" w:bidi="hy-AM"/>
-              </w:rPr>
-              <w:t>Վերադարձել</w:t>
-            </w:r>
-            <w:r>
-              <w:rPr>
-                <w:rFonts w:ascii="Sylfaen" w:eastAsia="Sylfaen" w:hAnsi="Sylfaen" w:cs="Sylfaen"/>
-                <w:b/>
-                <w:bCs/>
-                <w:lang w:val="hy-AM" w:bidi="hy-AM"/>
-              </w:rPr>
-              <w:t xml:space="preserve"> </w:t>
-            </w:r>
-            <w:r>
-              <w:rPr>
-                <w:rFonts w:ascii="Sylfaen" w:eastAsia="Sylfaen" w:hAnsi="Sylfaen" w:cs="Sylfaen"/>
-                <w:b/>
-                <w:bCs/>
-                <w:lang w:val="hy-AM" w:bidi="hy-AM"/>
-              </w:rPr>
-              <w:t>են</w:t>
-            </w:r>
-            <w:r>
-              <w:rPr>
-                <w:rFonts w:ascii="Sylfaen" w:eastAsia="Sylfaen" w:hAnsi="Sylfaen" w:cs="Sylfaen"/>
-                <w:b/>
-                <w:bCs/>
-                <w:lang w:val="hy-AM" w:bidi="hy-AM"/>
-              </w:rPr>
-              <w:t xml:space="preserve"> </w:t>
-            </w:r>
-            <w:r>
-              <w:rPr>
-                <w:rFonts w:ascii="Sylfaen" w:eastAsia="Sylfaen" w:hAnsi="Sylfaen" w:cs="Sylfaen"/>
-                <w:b/>
-                <w:bCs/>
-                <w:lang w:val="hy-AM" w:bidi="hy-AM"/>
-              </w:rPr>
-              <w:t>արձակուրդից</w:t>
-            </w:r>
-          </w:p>
-          <w:p>
-            <w:pPr>
-              <w:spacing w:after="10"/>
+              <w:spacing w:after="0" w:line="240" w:lineRule="exact"/>
+            </w:pPr>
+            <w:r>
+              <w:rPr>
+                <w:rFonts w:ascii="Sylfaen" w:eastAsia="Sylfaen" w:hAnsi="Sylfaen" w:cs="Sylfaen"/>
+                <w:b/>
+                <w:bCs/>
+                <w:lang w:val="hy-AM" w:bidi="hy-AM"/>
+              </w:rPr>
+              <w:t>Գնացել են արձակուրդ</w:t>
+            </w:r>
+          </w:p>
+          <w:p>
+            <w:pPr>
+              <w:spacing w:after="0" w:line="240" w:lineRule="exact"/>
             </w:pPr>
             <w:r>
               <w:rPr>
@@ -2911,7 +2719,7 @@
           </w:p>
           <w:p>
             <w:pPr>
-              <w:spacing w:after="10"/>
+              <w:spacing w:after="0" w:line="240" w:lineRule="exact"/>
             </w:pPr>
             <w:r>
               <w:rPr>
@@ -2923,7 +2731,7 @@
           </w:p>
           <w:p>
             <w:pPr>
-              <w:spacing w:after="10"/>
+              <w:spacing w:after="0" w:line="240" w:lineRule="exact"/>
             </w:pPr>
             <w:r>
               <w:rPr>
@@ -2935,7 +2743,7 @@
           </w:p>
           <w:p>
             <w:pPr>
-              <w:spacing w:after="10"/>
+              <w:spacing w:after="0" w:line="240" w:lineRule="exact"/>
             </w:pPr>
             <w:r>
               <w:rPr>
@@ -2947,7 +2755,7 @@
           </w:p>
           <w:p>
             <w:pPr>
-              <w:spacing w:after="10"/>
+              <w:spacing w:after="0" w:line="240" w:lineRule="exact"/>
             </w:pPr>
             <w:r>
               <w:rPr>
@@ -2966,109 +2774,48 @@
         <w:tc>
           <w:tcPr>
             <w:tcW w:w="7600" w:type="dxa"/>
-          </w:tcPr>
-          <w:p>
-            <w:pPr>
-              <w:spacing w:after="30"/>
-            </w:pPr>
-            <w:r>
-              <w:rPr>
-                <w:rFonts w:ascii="Sylfaen" w:eastAsia="Sylfaen" w:hAnsi="Sylfaen" w:cs="Sylfaen"/>
-                <w:b/>
-                <w:bCs/>
-                <w:lang w:val="hy-AM" w:bidi="hy-AM"/>
-              </w:rPr>
-              <w:t>Դուրս</w:t>
-            </w:r>
-            <w:r>
-              <w:rPr>
-                <w:rFonts w:ascii="Sylfaen" w:eastAsia="Sylfaen" w:hAnsi="Sylfaen" w:cs="Sylfaen"/>
-                <w:b/>
-                <w:bCs/>
-                <w:lang w:val="hy-AM" w:bidi="hy-AM"/>
-              </w:rPr>
-              <w:t xml:space="preserve"> </w:t>
-            </w:r>
-            <w:r>
-              <w:rPr>
-                <w:rFonts w:ascii="Sylfaen" w:eastAsia="Sylfaen" w:hAnsi="Sylfaen" w:cs="Sylfaen"/>
-                <w:b/>
-                <w:bCs/>
-                <w:lang w:val="hy-AM" w:bidi="hy-AM"/>
-              </w:rPr>
-              <w:t>գրված</w:t>
-            </w:r>
-            <w:r>
-              <w:rPr>
-                <w:rFonts w:ascii="Sylfaen" w:eastAsia="Sylfaen" w:hAnsi="Sylfaen" w:cs="Sylfaen"/>
-                <w:b/>
-                <w:bCs/>
-                <w:lang w:val="hy-AM" w:bidi="hy-AM"/>
-              </w:rPr>
-              <w:t xml:space="preserve"> </w:t>
-            </w:r>
-            <w:r>
-              <w:rPr>
-                <w:rFonts w:ascii="Sylfaen" w:eastAsia="Sylfaen" w:hAnsi="Sylfaen" w:cs="Sylfaen"/>
-                <w:b/>
-                <w:bCs/>
-                <w:lang w:val="hy-AM" w:bidi="hy-AM"/>
-              </w:rPr>
-              <w:t>–</w:t>
-            </w:r>
-            <w:r>
-              <w:rPr>
-                <w:rFonts w:ascii="Sylfaen" w:eastAsia="Sylfaen" w:hAnsi="Sylfaen" w:cs="Sylfaen"/>
-                <w:b/>
-                <w:bCs/>
-                <w:lang w:val="hy-AM" w:bidi="hy-AM"/>
-              </w:rPr>
-              <w:t xml:space="preserve"> </w:t>
-            </w:r>
-            <w:r>
-              <w:rPr>
-                <w:rFonts w:ascii="Sylfaen" w:eastAsia="Sylfaen" w:hAnsi="Sylfaen" w:cs="Sylfaen"/>
-                <w:b/>
-                <w:bCs/>
-                <w:lang w:val="hy-AM" w:bidi="hy-AM"/>
-              </w:rPr>
-              <w:t>չտարվա</w:t>
-            </w:r>
-            <w:r>
-              <w:rPr>
-                <w:rFonts w:ascii="Sylfaen" w:eastAsia="Sylfaen" w:hAnsi="Sylfaen" w:cs="Sylfaen"/>
-                <w:b/>
-                <w:bCs/>
-                <w:lang w:val="hy-AM" w:bidi="hy-AM"/>
-              </w:rPr>
-              <w:t>ծ</w:t>
-            </w:r>
-            <w:r>
-              <w:rPr>
-                <w:rFonts w:ascii="Sylfaen" w:eastAsia="Sylfaen" w:hAnsi="Sylfaen" w:cs="Sylfaen"/>
-                <w:b/>
-                <w:bCs/>
-                <w:lang w:val="hy-AM" w:bidi="hy-AM"/>
-              </w:rPr>
-              <w:t xml:space="preserve"> </w:t>
-            </w:r>
-            <w:r>
-              <w:rPr>
-                <w:rFonts w:ascii="Sylfaen" w:eastAsia="Sylfaen" w:hAnsi="Sylfaen" w:cs="Sylfaen"/>
-                <w:b/>
-                <w:bCs/>
-                <w:lang w:val="hy-AM" w:bidi="hy-AM"/>
-              </w:rPr>
-              <w:t>հիվանդներ</w:t>
-            </w:r>
-          </w:p>
-          <w:p>
-            <w:pPr>
-              <w:spacing w:after="10"/>
-            </w:pPr>
-            <w:r>
-              <w:rPr>
-                <w:rFonts w:ascii="Sylfaen" w:eastAsia="Sylfaen" w:hAnsi="Sylfaen" w:cs="Sylfaen"/>
+            <w:tcBorders>
+              <w:top w:val="nil"/>
+              <w:left w:val="nil"/>
+              <w:bottom w:val="nil"/>
+              <w:right w:val="nil"/>
+            </w:tcBorders>
+          </w:tcPr>
+          <w:p>
+            <w:pPr>
+              <w:spacing w:after="0" w:line="240" w:lineRule="exact"/>
+              <w:rPr>
+                <w:rFonts w:ascii="Sylfaen" w:eastAsia="Sylfaen" w:hAnsi="Sylfaen" w:cs="Sylfaen"/>
+                <w:b/>
+                <w:bCs/>
+                <w:lang w:val="hy-AM" w:bidi="hy-AM"/>
+              </w:rPr>
+            </w:pPr>
+            <w:r>
+              <w:rPr>
+                <w:rFonts w:ascii="Sylfaen" w:eastAsia="Sylfaen" w:hAnsi="Sylfaen" w:cs="Sylfaen"/>
+                <w:b/>
+                <w:bCs/>
+                <w:lang w:val="hy-AM" w:bidi="hy-AM"/>
+              </w:rPr>
+              <w:t>Ընդունված հիվանդներ</w:t>
+            </w:r>
+          </w:p>
+          <w:p>
+            <w:pPr>
+              <w:spacing w:after="0" w:line="240" w:lineRule="exact"/>
+              <w:rPr>
+                <w:rFonts w:ascii="Sylfaen" w:eastAsia="Sylfaen" w:hAnsi="Sylfaen" w:cs="Sylfaen"/>
+                <w:b/>
+                <w:bCs/>
+                <w:lang w:val="hy-AM" w:bidi="hy-AM"/>
+              </w:rPr>
+            </w:pPr>
+            <w:r>
+              <w:rPr>
+                <w:rFonts w:ascii="Sylfaen" w:eastAsia="Sylfaen" w:hAnsi="Sylfaen" w:cs="Sylfaen"/>
+                <w:b/>
+                <w:bCs/>
                 <w:lang w:val="hy-AM" w:bidi="hy-AM"/>
               </w:rPr>
               <w:t>1. ________________________________________________</w:t>
@@ -3076,11 +2823,19 @@
           </w:p>
           <w:p>
             <w:pPr>
-              <w:spacing w:after="10"/>
-            </w:pPr>
-            <w:r>
-              <w:rPr>
-                <w:rFonts w:ascii="Sylfaen" w:eastAsia="Sylfaen" w:hAnsi="Sylfaen" w:cs="Sylfaen"/>
+              <w:spacing w:after="0" w:line="240" w:lineRule="exact"/>
+              <w:rPr>
+                <w:rFonts w:ascii="Sylfaen" w:eastAsia="Sylfaen" w:hAnsi="Sylfaen" w:cs="Sylfaen"/>
+                <w:b/>
+                <w:bCs/>
+                <w:lang w:val="hy-AM" w:bidi="hy-AM"/>
+              </w:rPr>
+            </w:pPr>
+            <w:r>
+              <w:rPr>
+                <w:rFonts w:ascii="Sylfaen" w:eastAsia="Sylfaen" w:hAnsi="Sylfaen" w:cs="Sylfaen"/>
+                <w:b/>
+                <w:bCs/>
                 <w:lang w:val="hy-AM" w:bidi="hy-AM"/>
               </w:rPr>
               <w:t>2. ________________________________________________</w:t>
@@ -3088,24 +2843,39 @@
           </w:p>
           <w:p>
             <w:pPr>
-              <w:spacing w:after="10"/>
-            </w:pPr>
-            <w:r>
-              <w:rPr>
-                <w:rFonts w:ascii="Sylfaen" w:eastAsia="Sylfaen" w:hAnsi="Sylfaen" w:cs="Sylfaen"/>
-                <w:lang w:val="hy-AM" w:bidi="hy-AM"/>
-              </w:rPr>
-              <w:lastRenderedPageBreak/>
+              <w:spacing w:after="0" w:line="240" w:lineRule="exact"/>
+              <w:rPr>
+                <w:rFonts w:ascii="Sylfaen" w:eastAsia="Sylfaen" w:hAnsi="Sylfaen" w:cs="Sylfaen"/>
+                <w:b/>
+                <w:bCs/>
+                <w:lang w:val="hy-AM" w:bidi="hy-AM"/>
+              </w:rPr>
+            </w:pPr>
+            <w:r>
+              <w:rPr>
+                <w:rFonts w:ascii="Sylfaen" w:eastAsia="Sylfaen" w:hAnsi="Sylfaen" w:cs="Sylfaen"/>
+                <w:b/>
+                <w:bCs/>
+                <w:lang w:val="hy-AM" w:bidi="hy-AM"/>
+              </w:rPr>
               <w:t>3. ________________________________________________</w:t>
             </w:r>
           </w:p>
           <w:p>
             <w:pPr>
-              <w:spacing w:after="10"/>
-            </w:pPr>
-            <w:r>
-              <w:rPr>
-                <w:rFonts w:ascii="Sylfaen" w:eastAsia="Sylfaen" w:hAnsi="Sylfaen" w:cs="Sylfaen"/>
+              <w:spacing w:after="0" w:line="240" w:lineRule="exact"/>
+              <w:rPr>
+                <w:rFonts w:ascii="Sylfaen" w:eastAsia="Sylfaen" w:hAnsi="Sylfaen" w:cs="Sylfaen"/>
+                <w:b/>
+                <w:bCs/>
+                <w:lang w:val="hy-AM" w:bidi="hy-AM"/>
+              </w:rPr>
+            </w:pPr>
+            <w:r>
+              <w:rPr>
+                <w:rFonts w:ascii="Sylfaen" w:eastAsia="Sylfaen" w:hAnsi="Sylfaen" w:cs="Sylfaen"/>
+                <w:b/>
+                <w:bCs/>
                 <w:lang w:val="hy-AM" w:bidi="hy-AM"/>
               </w:rPr>
               <w:t>4. ________________________________________________</w:t>
@@ -3113,11 +2883,19 @@
           </w:p>
           <w:p>
             <w:pPr>
-              <w:spacing w:after="10"/>
-            </w:pPr>
-            <w:r>
-              <w:rPr>
-                <w:rFonts w:ascii="Sylfaen" w:eastAsia="Sylfaen" w:hAnsi="Sylfaen" w:cs="Sylfaen"/>
+              <w:spacing w:after="0" w:line="240" w:lineRule="exact"/>
+              <w:rPr>
+                <w:rFonts w:ascii="Sylfaen" w:eastAsia="Sylfaen" w:hAnsi="Sylfaen" w:cs="Sylfaen"/>
+                <w:b/>
+                <w:bCs/>
+                <w:lang w:val="hy-AM" w:bidi="hy-AM"/>
+              </w:rPr>
+            </w:pPr>
+            <w:r>
+              <w:rPr>
+                <w:rFonts w:ascii="Sylfaen" w:eastAsia="Sylfaen" w:hAnsi="Sylfaen" w:cs="Sylfaen"/>
+                <w:b/>
+                <w:bCs/>
                 <w:lang w:val="hy-AM" w:bidi="hy-AM"/>
               </w:rPr>
               <w:t>5. ________________________________________________</w:t>
@@ -3127,65 +2905,48 @@
         <w:tc>
           <w:tcPr>
             <w:tcW w:w="7600" w:type="dxa"/>
-          </w:tcPr>
-          <w:p>
-            <w:pPr>
-              <w:spacing w:after="30"/>
-            </w:pPr>
-            <w:r>
-              <w:rPr>
-                <w:rFonts w:ascii="Sylfaen" w:eastAsia="Sylfaen" w:hAnsi="Sylfaen" w:cs="Sylfaen"/>
-                <w:b/>
-                <w:bCs/>
-                <w:lang w:val="hy-AM" w:bidi="hy-AM"/>
-              </w:rPr>
-              <w:lastRenderedPageBreak/>
-              <w:t>Գնացել</w:t>
-            </w:r>
-            <w:r>
-              <w:rPr>
-                <w:rFonts w:ascii="Sylfaen" w:eastAsia="Sylfaen" w:hAnsi="Sylfaen" w:cs="Sylfaen"/>
-                <w:b/>
-                <w:bCs/>
-                <w:lang w:val="hy-AM" w:bidi="hy-AM"/>
-              </w:rPr>
-              <w:t xml:space="preserve"> </w:t>
-            </w:r>
-            <w:r>
-              <w:rPr>
-                <w:rFonts w:ascii="Sylfaen" w:eastAsia="Sylfaen" w:hAnsi="Sylfaen" w:cs="Sylfaen"/>
-                <w:b/>
-                <w:bCs/>
-                <w:lang w:val="hy-AM" w:bidi="hy-AM"/>
-              </w:rPr>
-              <w:t>են</w:t>
-            </w:r>
-            <w:r>
-              <w:rPr>
-                <w:rFonts w:ascii="Sylfaen" w:eastAsia="Sylfaen" w:hAnsi="Sylfaen" w:cs="Sylfaen"/>
-                <w:b/>
-                <w:bCs/>
-                <w:lang w:val="hy-AM" w:bidi="hy-AM"/>
-              </w:rPr>
-              <w:t xml:space="preserve"> </w:t>
-            </w:r>
-            <w:r>
-              <w:rPr>
-                <w:rFonts w:ascii="Sylfaen" w:eastAsia="Sylfaen" w:hAnsi="Sylfaen" w:cs="Sylfaen"/>
-                <w:b/>
-                <w:bCs/>
-                <w:lang w:val="hy-AM" w:bidi="hy-AM"/>
-              </w:rPr>
-              <w:t>արձակուրդ</w:t>
-            </w:r>
-          </w:p>
-          <w:p>
-            <w:pPr>
-              <w:spacing w:after="10"/>
-            </w:pPr>
-            <w:r>
-              <w:rPr>
-                <w:rFonts w:ascii="Sylfaen" w:eastAsia="Sylfaen" w:hAnsi="Sylfaen" w:cs="Sylfaen"/>
+            <w:tcBorders>
+              <w:top w:val="nil"/>
+              <w:left w:val="nil"/>
+              <w:bottom w:val="nil"/>
+              <w:right w:val="nil"/>
+            </w:tcBorders>
+          </w:tcPr>
+          <w:p>
+            <w:pPr>
+              <w:spacing w:after="0" w:line="240" w:lineRule="exact"/>
+              <w:rPr>
+                <w:rFonts w:ascii="Sylfaen" w:eastAsia="Sylfaen" w:hAnsi="Sylfaen" w:cs="Sylfaen"/>
+                <w:b/>
+                <w:bCs/>
+                <w:lang w:val="hy-AM" w:bidi="hy-AM"/>
+              </w:rPr>
+            </w:pPr>
+            <w:r>
+              <w:rPr>
+                <w:rFonts w:ascii="Sylfaen" w:eastAsia="Sylfaen" w:hAnsi="Sylfaen" w:cs="Sylfaen"/>
+                <w:b/>
+                <w:bCs/>
+                <w:lang w:val="hy-AM" w:bidi="hy-AM"/>
+              </w:rPr>
+              <w:t>Դուրս գրված հիվանդներ</w:t>
+            </w:r>
+          </w:p>
+          <w:p>
+            <w:pPr>
+              <w:spacing w:after="0" w:line="240" w:lineRule="exact"/>
+              <w:rPr>
+                <w:rFonts w:ascii="Sylfaen" w:eastAsia="Sylfaen" w:hAnsi="Sylfaen" w:cs="Sylfaen"/>
+                <w:b/>
+                <w:bCs/>
+                <w:lang w:val="hy-AM" w:bidi="hy-AM"/>
+              </w:rPr>
+            </w:pPr>
+            <w:r>
+              <w:rPr>
+                <w:rFonts w:ascii="Sylfaen" w:eastAsia="Sylfaen" w:hAnsi="Sylfaen" w:cs="Sylfaen"/>
+                <w:b/>
+                <w:bCs/>
                 <w:lang w:val="hy-AM" w:bidi="hy-AM"/>
               </w:rPr>
               <w:t>1. ________________________________________________</w:t>
@@ -3193,11 +2954,19 @@
           </w:p>
           <w:p>
             <w:pPr>
-              <w:spacing w:after="10"/>
-            </w:pPr>
-            <w:r>
-              <w:rPr>
-                <w:rFonts w:ascii="Sylfaen" w:eastAsia="Sylfaen" w:hAnsi="Sylfaen" w:cs="Sylfaen"/>
+              <w:spacing w:after="0" w:line="240" w:lineRule="exact"/>
+              <w:rPr>
+                <w:rFonts w:ascii="Sylfaen" w:eastAsia="Sylfaen" w:hAnsi="Sylfaen" w:cs="Sylfaen"/>
+                <w:b/>
+                <w:bCs/>
+                <w:lang w:val="hy-AM" w:bidi="hy-AM"/>
+              </w:rPr>
+            </w:pPr>
+            <w:r>
+              <w:rPr>
+                <w:rFonts w:ascii="Sylfaen" w:eastAsia="Sylfaen" w:hAnsi="Sylfaen" w:cs="Sylfaen"/>
+                <w:b/>
+                <w:bCs/>
                 <w:lang w:val="hy-AM" w:bidi="hy-AM"/>
               </w:rPr>
               <w:t>2. ________________________________________________</w:t>
@@ -3205,24 +2974,39 @@
           </w:p>
           <w:p>
             <w:pPr>
-              <w:spacing w:after="10"/>
-            </w:pPr>
-            <w:r>
-              <w:rPr>
-                <w:rFonts w:ascii="Sylfaen" w:eastAsia="Sylfaen" w:hAnsi="Sylfaen" w:cs="Sylfaen"/>
-                <w:lang w:val="hy-AM" w:bidi="hy-AM"/>
-              </w:rPr>
-              <w:lastRenderedPageBreak/>
+              <w:spacing w:after="0" w:line="240" w:lineRule="exact"/>
+              <w:rPr>
+                <w:rFonts w:ascii="Sylfaen" w:eastAsia="Sylfaen" w:hAnsi="Sylfaen" w:cs="Sylfaen"/>
+                <w:b/>
+                <w:bCs/>
+                <w:lang w:val="hy-AM" w:bidi="hy-AM"/>
+              </w:rPr>
+            </w:pPr>
+            <w:r>
+              <w:rPr>
+                <w:rFonts w:ascii="Sylfaen" w:eastAsia="Sylfaen" w:hAnsi="Sylfaen" w:cs="Sylfaen"/>
+                <w:b/>
+                <w:bCs/>
+                <w:lang w:val="hy-AM" w:bidi="hy-AM"/>
+              </w:rPr>
               <w:t>3. ________________________________________________</w:t>
             </w:r>
           </w:p>
           <w:p>
             <w:pPr>
-              <w:spacing w:after="10"/>
-            </w:pPr>
-            <w:r>
-              <w:rPr>
-                <w:rFonts w:ascii="Sylfaen" w:eastAsia="Sylfaen" w:hAnsi="Sylfaen" w:cs="Sylfaen"/>
+              <w:spacing w:after="0" w:line="240" w:lineRule="exact"/>
+              <w:rPr>
+                <w:rFonts w:ascii="Sylfaen" w:eastAsia="Sylfaen" w:hAnsi="Sylfaen" w:cs="Sylfaen"/>
+                <w:b/>
+                <w:bCs/>
+                <w:lang w:val="hy-AM" w:bidi="hy-AM"/>
+              </w:rPr>
+            </w:pPr>
+            <w:r>
+              <w:rPr>
+                <w:rFonts w:ascii="Sylfaen" w:eastAsia="Sylfaen" w:hAnsi="Sylfaen" w:cs="Sylfaen"/>
+                <w:b/>
+                <w:bCs/>
                 <w:lang w:val="hy-AM" w:bidi="hy-AM"/>
               </w:rPr>
               <w:t>4. ________________________________________________</w:t>
@@ -3230,14 +3014,42 @@
           </w:p>
           <w:p>
             <w:pPr>
-              <w:spacing w:after="10"/>
-            </w:pPr>
-            <w:r>
-              <w:rPr>
-                <w:rFonts w:ascii="Sylfaen" w:eastAsia="Sylfaen" w:hAnsi="Sylfaen" w:cs="Sylfaen"/>
+              <w:spacing w:after="0" w:line="240" w:lineRule="exact"/>
+              <w:rPr>
+                <w:rFonts w:ascii="Sylfaen" w:eastAsia="Sylfaen" w:hAnsi="Sylfaen" w:cs="Sylfaen"/>
+                <w:b/>
+                <w:bCs/>
+                <w:lang w:val="hy-AM" w:bidi="hy-AM"/>
+              </w:rPr>
+            </w:pPr>
+            <w:r>
+              <w:rPr>
+                <w:rFonts w:ascii="Sylfaen" w:eastAsia="Sylfaen" w:hAnsi="Sylfaen" w:cs="Sylfaen"/>
+                <w:b/>
+                <w:bCs/>
                 <w:lang w:val="hy-AM" w:bidi="hy-AM"/>
               </w:rPr>
               <w:t>5. ________________________________________________</w:t>
+            </w:r>
+          </w:p>
+          <w:p>
+            <w:pPr>
+              <w:spacing w:after="0" w:line="240" w:lineRule="exact"/>
+              <w:rPr>
+                <w:rFonts w:ascii="Sylfaen" w:eastAsia="Sylfaen" w:hAnsi="Sylfaen" w:cs="Sylfaen"/>
+                <w:b/>
+                <w:bCs/>
+                <w:lang w:val="hy-AM" w:bidi="hy-AM"/>
+              </w:rPr>
+            </w:pPr>
+            <w:r>
+              <w:rPr>
+                <w:rFonts w:ascii="Sylfaen" w:eastAsia="Sylfaen" w:hAnsi="Sylfaen" w:cs="Sylfaen"/>
+                <w:b/>
+                <w:bCs/>
+                <w:lang w:val="hy-AM" w:bidi="hy-AM"/>
+              </w:rPr>
+              <w:t>6. ________________________________________________</w:t>
             </w:r>
           </w:p>
         </w:tc>
@@ -3245,6 +3057,7 @@
     </w:tbl>
     <w:p>
       <w:pPr>
+        <w:spacing w:after="0" w:line="240" w:lineRule="exact"/>
         <w:rPr>
           <w:sz w:val="28"/>
           <w:szCs w:val="28"/>
@@ -3259,7 +3072,7 @@
       <w:headerReference w:type="first" r:id="rId10"/>
       <w:footerReference w:type="first" r:id="rId11"/>
       <w:pgSz w:w="16838" w:h="11906" w:orient="landscape"/>
-      <w:pgMar w:top="360" w:right="540" w:bottom="360" w:left="540" w:header="240" w:footer="240" w:gutter="0"/>
+      <w:pgMar w:top="1800" w:right="540" w:bottom="360" w:left="540" w:header="240" w:footer="240" w:gutter="0"/>
       <w:cols w:space="720"/>
       <w:docGrid w:linePitch="326"/>
     </w:sectPr>

</xml_diff>

<commit_message>
Rotate published project links
</commit_message>
<xml_diff>
--- a/Отделения/ԱՆՈԹԱՅԻՆ/ԱՆՈԹԱՅԻՆ շարժ.docx
+++ b/Отделения/ԱՆՈԹԱՅԻՆ/ԱՆՈԹԱՅԻՆ շարժ.docx
@@ -3182,16 +3182,16 @@
         <w:noProof/>
       </w:rPr>
       <w:drawing>
-        <wp:inline distT="0" distB="0" distL="0" distR="0" wp14:anchorId="0AD6C575" wp14:editId="492B642D">
+        <wp:inline distT="0" distB="0" distL="0" distR="0" wp14:anchorId="13C87ED1" wp14:editId="078A64E8">
           <wp:extent cx="787505" cy="787505"/>
           <wp:effectExtent l="0" t="0" r="0" b="0"/>
-          <wp:docPr id="1058137855" name="Рисунок 1" descr="SARSH_KKZH_QR"/>
+          <wp:docPr id="1025236339" name="Рисунок 1" descr="SARSH_KKZH_QR"/>
           <wp:cNvGraphicFramePr/>
           <a:graphic xmlns:a="http://schemas.openxmlformats.org/drawingml/2006/main">
             <a:graphicData uri="http://schemas.openxmlformats.org/drawingml/2006/picture">
               <pic:pic xmlns:pic="http://schemas.openxmlformats.org/drawingml/2006/picture">
                 <pic:nvPicPr>
-                  <pic:cNvPr id="1058137855" name="Рисунок 1" descr="SARSH_KKZH_QR"/>
+                  <pic:cNvPr id="1025236339" name="Рисунок 1" descr="SARSH_KKZH_QR"/>
                   <pic:cNvPicPr/>
                 </pic:nvPicPr>
                 <pic:blipFill>

</xml_diff>

<commit_message>
Show computed photo cell 12 in preview
</commit_message>
<xml_diff>
--- a/Отделения/ԱՆՈԹԱՅԻՆ/ԱՆՈԹԱՅԻՆ շարժ.docx
+++ b/Отделения/ԱՆՈԹԱՅԻՆ/ԱՆՈԹԱՅԻՆ շարժ.docx
@@ -7,13 +7,17 @@
         <w:spacing w:after="0" w:line="240" w:lineRule="exact"/>
         <w:jc w:val="center"/>
         <w:rPr>
+          <w:rFonts w:ascii="Arial Armenian" w:eastAsia="Sylfaen" w:hAnsi="Arial Armenian" w:cs="Sylfaen"/>
+          <w:b/>
+          <w:bCs/>
           <w:sz w:val="28"/>
           <w:szCs w:val="28"/>
+          <w:lang w:val="hy-AM" w:bidi="hy-AM"/>
         </w:rPr>
       </w:pPr>
       <w:r>
         <w:rPr>
-          <w:rFonts w:ascii="Sylfaen" w:eastAsia="Sylfaen" w:hAnsi="Sylfaen" w:cs="Sylfaen"/>
+          <w:rFonts w:ascii="Arial Armenian" w:eastAsia="Sylfaen" w:hAnsi="Arial Armenian" w:cs="Sylfaen"/>
           <w:b/>
           <w:bCs/>
           <w:sz w:val="28"/>
@@ -21,25 +25,6 @@
           <w:lang w:val="hy-AM" w:bidi="hy-AM"/>
         </w:rPr>
         <w:t>ԱՆՈԹԱՅԻՆ</w:t>
-      </w:r>
-    </w:p>
-    <w:p>
-      <w:pPr>
-        <w:spacing w:after="0" w:line="240" w:lineRule="exact"/>
-        <w:jc w:val="center"/>
-        <w:rPr>
-          <w:sz w:val="18"/>
-          <w:szCs w:val="18"/>
-        </w:rPr>
-      </w:pPr>
-      <w:r>
-        <w:rPr>
-          <w:rFonts w:ascii="Sylfaen" w:eastAsia="Sylfaen" w:hAnsi="Sylfaen" w:cs="Sylfaen"/>
-          <w:sz w:val="18"/>
-          <w:szCs w:val="18"/>
-          <w:lang w:val="hy-AM" w:bidi="hy-AM"/>
-        </w:rPr>
-        <w:t>Ամսաթիվ ____________________        Հերթապահ ____________________</w:t>
       </w:r>
     </w:p>
     <w:tbl>
@@ -87,10 +72,11 @@
         <w:gridCol w:w="630"/>
         <w:gridCol w:w="630"/>
         <w:gridCol w:w="630"/>
-        <w:gridCol w:w="630"/>
       </w:tblGrid>
       <w:tr>
         <w:trPr>
+          <w:gridAfter w:val="9"/>
+          <w:wAfter w:w="5670" w:type="dxa"/>
           <w:trHeight w:hRule="exact" w:val="542"/>
           <w:jc w:val="center"/>
         </w:trPr>
@@ -105,21 +91,37 @@
               <w:spacing w:after="0" w:line="240" w:lineRule="exact"/>
               <w:jc w:val="center"/>
               <w:rPr>
-                <w:sz w:val="18"/>
-                <w:szCs w:val="18"/>
-              </w:rPr>
-            </w:pPr>
-            <w:r>
-              <w:rPr>
-                <w:rFonts w:ascii="Sylfaen" w:eastAsia="Sylfaen" w:hAnsi="Sylfaen" w:cs="Sylfaen"/>
-                <w:b/>
-                <w:bCs/>
+                <w:rFonts w:ascii="Sylfaen" w:eastAsia="Sylfaen" w:hAnsi="Sylfaen" w:cs="Sylfaen"/>
+                <w:b/>
+                <w:noProof/>
+                <w:sz w:val="18"/>
+                <w:szCs w:val="18"/>
+                <w:lang w:val="hy-AM" w:bidi="hy-AM"/>
+              </w:rPr>
+            </w:pPr>
+            <w:r>
+              <w:rPr>
+                <w:rFonts w:ascii="Sylfaen" w:eastAsia="Sylfaen" w:hAnsi="Sylfaen" w:cs="Sylfaen"/>
+                <w:b/>
+                <w:noProof/>
                 <w:sz w:val="18"/>
                 <w:szCs w:val="18"/>
                 <w:lang w:val="hy-AM" w:bidi="hy-AM"/>
               </w:rPr>
               <w:t>Եղել է</w:t>
             </w:r>
+          </w:p>
+          <w:p>
+            <w:pPr>
+              <w:spacing w:after="0" w:line="240" w:lineRule="exact"/>
+              <w:jc w:val="center"/>
+              <w:rPr>
+                <w:rFonts w:ascii="Sylfaen" w:hAnsi="Sylfaen"/>
+                <w:b/>
+                <w:sz w:val="18"/>
+                <w:szCs w:val="18"/>
+              </w:rPr>
+            </w:pPr>
           </w:p>
         </w:tc>
         <w:tc>
@@ -208,34 +210,6 @@
         </w:tc>
         <w:tc>
           <w:tcPr>
-            <w:tcW w:w="6300" w:type="dxa"/>
-            <w:gridSpan w:val="10"/>
-            <w:vAlign w:val="center"/>
-          </w:tcPr>
-          <w:p>
-            <w:pPr>
-              <w:spacing w:after="0" w:line="240" w:lineRule="exact"/>
-              <w:jc w:val="center"/>
-              <w:rPr>
-                <w:sz w:val="18"/>
-                <w:szCs w:val="18"/>
-              </w:rPr>
-            </w:pPr>
-            <w:r>
-              <w:rPr>
-                <w:rFonts w:ascii="Sylfaen" w:eastAsia="Sylfaen" w:hAnsi="Sylfaen" w:cs="Sylfaen"/>
-                <w:b/>
-                <w:bCs/>
-                <w:sz w:val="18"/>
-                <w:szCs w:val="18"/>
-                <w:lang w:val="hy-AM" w:bidi="hy-AM"/>
-              </w:rPr>
-              <w:t>Առկա է</w:t>
-            </w:r>
-          </w:p>
-        </w:tc>
-        <w:tc>
-          <w:tcPr>
             <w:tcW w:w="1890" w:type="dxa"/>
             <w:gridSpan w:val="3"/>
             <w:vAlign w:val="center"/>
@@ -281,6 +255,584 @@
                 <w:lang w:val="hy-AM" w:bidi="hy-AM"/>
               </w:rPr>
               <w:t>արձակուրդ</w:t>
+            </w:r>
+          </w:p>
+        </w:tc>
+      </w:tr>
+      <w:tr>
+        <w:trPr>
+          <w:gridAfter w:val="3"/>
+          <w:wAfter w:w="1890" w:type="dxa"/>
+          <w:trHeight w:hRule="exact" w:val="300"/>
+          <w:jc w:val="center"/>
+        </w:trPr>
+        <w:tc>
+          <w:tcPr>
+            <w:tcW w:w="630" w:type="dxa"/>
+            <w:vMerge w:val="restart"/>
+            <w:vAlign w:val="center"/>
+          </w:tcPr>
+          <w:p>
+            <w:pPr>
+              <w:spacing w:after="0" w:line="240" w:lineRule="exact"/>
+              <w:jc w:val="center"/>
+              <w:rPr>
+                <w:sz w:val="18"/>
+                <w:szCs w:val="18"/>
+              </w:rPr>
+            </w:pPr>
+            <w:r>
+              <w:rPr>
+                <w:rFonts w:ascii="Sylfaen" w:eastAsia="Sylfaen" w:hAnsi="Sylfaen" w:cs="Sylfaen"/>
+                <w:sz w:val="18"/>
+                <w:szCs w:val="18"/>
+                <w:lang w:val="hy-AM" w:bidi="hy-AM"/>
+              </w:rPr>
+              <w:t>Ը</w:t>
+            </w:r>
+            <w:r>
+              <w:rPr>
+                <w:rFonts w:ascii="Sylfaen" w:eastAsia="Sylfaen" w:hAnsi="Sylfaen" w:cs="Sylfaen"/>
+                <w:sz w:val="18"/>
+                <w:szCs w:val="18"/>
+                <w:lang w:val="hy-AM" w:bidi="hy-AM"/>
+              </w:rPr>
+              <w:t>ՆԴ</w:t>
+            </w:r>
+          </w:p>
+        </w:tc>
+        <w:tc>
+          <w:tcPr>
+            <w:tcW w:w="630" w:type="dxa"/>
+            <w:vMerge w:val="restart"/>
+            <w:vAlign w:val="center"/>
+          </w:tcPr>
+          <w:p>
+            <w:pPr>
+              <w:spacing w:after="0" w:line="240" w:lineRule="exact"/>
+              <w:jc w:val="center"/>
+              <w:rPr>
+                <w:sz w:val="18"/>
+                <w:szCs w:val="18"/>
+                <w:lang w:val="hy-AM"/>
+              </w:rPr>
+            </w:pPr>
+            <w:r>
+              <w:rPr>
+                <w:rFonts w:ascii="Sylfaen" w:eastAsia="Sylfaen" w:hAnsi="Sylfaen" w:cs="Sylfaen"/>
+                <w:sz w:val="18"/>
+                <w:szCs w:val="18"/>
+                <w:lang w:val="hy-AM" w:bidi="hy-AM"/>
+              </w:rPr>
+              <w:t>Զ/Ծ</w:t>
+            </w:r>
+          </w:p>
+        </w:tc>
+        <w:tc>
+          <w:tcPr>
+            <w:tcW w:w="630" w:type="dxa"/>
+            <w:vMerge w:val="restart"/>
+            <w:vAlign w:val="center"/>
+          </w:tcPr>
+          <w:p>
+            <w:pPr>
+              <w:spacing w:after="0" w:line="240" w:lineRule="exact"/>
+              <w:jc w:val="center"/>
+              <w:rPr>
+                <w:sz w:val="18"/>
+                <w:szCs w:val="18"/>
+              </w:rPr>
+            </w:pPr>
+            <w:r>
+              <w:rPr>
+                <w:rFonts w:ascii="Sylfaen" w:eastAsia="Sylfaen" w:hAnsi="Sylfaen" w:cs="Sylfaen"/>
+                <w:sz w:val="18"/>
+                <w:szCs w:val="18"/>
+                <w:lang w:val="hy-AM" w:bidi="hy-AM"/>
+              </w:rPr>
+              <w:t>ՇԱՐՔ</w:t>
+            </w:r>
+          </w:p>
+        </w:tc>
+        <w:tc>
+          <w:tcPr>
+            <w:tcW w:w="630" w:type="dxa"/>
+            <w:vMerge w:val="restart"/>
+            <w:vAlign w:val="center"/>
+          </w:tcPr>
+          <w:p>
+            <w:pPr>
+              <w:spacing w:after="0" w:line="240" w:lineRule="exact"/>
+              <w:jc w:val="center"/>
+              <w:rPr>
+                <w:sz w:val="18"/>
+                <w:szCs w:val="18"/>
+              </w:rPr>
+            </w:pPr>
+            <w:r>
+              <w:rPr>
+                <w:rFonts w:ascii="Sylfaen" w:eastAsia="Sylfaen" w:hAnsi="Sylfaen" w:cs="Sylfaen"/>
+                <w:sz w:val="18"/>
+                <w:szCs w:val="18"/>
+                <w:lang w:val="hy-AM" w:bidi="hy-AM"/>
+              </w:rPr>
+              <w:t>Ը</w:t>
+            </w:r>
+            <w:r>
+              <w:rPr>
+                <w:rFonts w:ascii="Sylfaen" w:eastAsia="Sylfaen" w:hAnsi="Sylfaen" w:cs="Sylfaen"/>
+                <w:sz w:val="18"/>
+                <w:szCs w:val="18"/>
+                <w:lang w:val="hy-AM" w:bidi="hy-AM"/>
+              </w:rPr>
+              <w:t>ՆԴ</w:t>
+            </w:r>
+          </w:p>
+        </w:tc>
+        <w:tc>
+          <w:tcPr>
+            <w:tcW w:w="630" w:type="dxa"/>
+            <w:vMerge w:val="restart"/>
+            <w:vAlign w:val="center"/>
+          </w:tcPr>
+          <w:p>
+            <w:pPr>
+              <w:spacing w:after="0" w:line="240" w:lineRule="exact"/>
+              <w:jc w:val="center"/>
+              <w:rPr>
+                <w:sz w:val="18"/>
+                <w:szCs w:val="18"/>
+              </w:rPr>
+            </w:pPr>
+            <w:r>
+              <w:rPr>
+                <w:rFonts w:ascii="Sylfaen" w:eastAsia="Sylfaen" w:hAnsi="Sylfaen" w:cs="Sylfaen"/>
+                <w:sz w:val="18"/>
+                <w:szCs w:val="18"/>
+                <w:lang w:val="hy-AM" w:bidi="hy-AM"/>
+              </w:rPr>
+              <w:t>Զ/Ծ</w:t>
+            </w:r>
+          </w:p>
+        </w:tc>
+        <w:tc>
+          <w:tcPr>
+            <w:tcW w:w="630" w:type="dxa"/>
+            <w:vMerge w:val="restart"/>
+            <w:vAlign w:val="center"/>
+          </w:tcPr>
+          <w:p>
+            <w:pPr>
+              <w:spacing w:after="0" w:line="240" w:lineRule="exact"/>
+              <w:jc w:val="center"/>
+              <w:rPr>
+                <w:sz w:val="18"/>
+                <w:szCs w:val="18"/>
+              </w:rPr>
+            </w:pPr>
+            <w:r>
+              <w:rPr>
+                <w:rFonts w:ascii="Sylfaen" w:eastAsia="Sylfaen" w:hAnsi="Sylfaen" w:cs="Sylfaen"/>
+                <w:sz w:val="18"/>
+                <w:szCs w:val="18"/>
+                <w:lang w:val="hy-AM" w:bidi="hy-AM"/>
+              </w:rPr>
+              <w:t>ՇԱՐՔ</w:t>
+            </w:r>
+          </w:p>
+        </w:tc>
+        <w:tc>
+          <w:tcPr>
+            <w:tcW w:w="630" w:type="dxa"/>
+            <w:vMerge w:val="restart"/>
+            <w:vAlign w:val="center"/>
+          </w:tcPr>
+          <w:p>
+            <w:pPr>
+              <w:spacing w:after="0" w:line="240" w:lineRule="exact"/>
+              <w:jc w:val="center"/>
+              <w:rPr>
+                <w:sz w:val="18"/>
+                <w:szCs w:val="18"/>
+              </w:rPr>
+            </w:pPr>
+            <w:r>
+              <w:rPr>
+                <w:rFonts w:ascii="Sylfaen" w:eastAsia="Sylfaen" w:hAnsi="Sylfaen" w:cs="Sylfaen"/>
+                <w:sz w:val="18"/>
+                <w:szCs w:val="18"/>
+                <w:lang w:val="hy-AM" w:bidi="hy-AM"/>
+              </w:rPr>
+              <w:t>Ը</w:t>
+            </w:r>
+            <w:r>
+              <w:rPr>
+                <w:rFonts w:ascii="Sylfaen" w:eastAsia="Sylfaen" w:hAnsi="Sylfaen" w:cs="Sylfaen"/>
+                <w:sz w:val="18"/>
+                <w:szCs w:val="18"/>
+                <w:lang w:val="hy-AM" w:bidi="hy-AM"/>
+              </w:rPr>
+              <w:t>ՆԴ</w:t>
+            </w:r>
+          </w:p>
+        </w:tc>
+        <w:tc>
+          <w:tcPr>
+            <w:tcW w:w="630" w:type="dxa"/>
+            <w:vMerge w:val="restart"/>
+            <w:vAlign w:val="center"/>
+          </w:tcPr>
+          <w:p>
+            <w:pPr>
+              <w:spacing w:after="0" w:line="240" w:lineRule="exact"/>
+              <w:jc w:val="center"/>
+              <w:rPr>
+                <w:sz w:val="18"/>
+                <w:szCs w:val="18"/>
+              </w:rPr>
+            </w:pPr>
+            <w:r>
+              <w:rPr>
+                <w:rFonts w:ascii="Sylfaen" w:eastAsia="Sylfaen" w:hAnsi="Sylfaen" w:cs="Sylfaen"/>
+                <w:sz w:val="18"/>
+                <w:szCs w:val="18"/>
+                <w:lang w:val="hy-AM" w:bidi="hy-AM"/>
+              </w:rPr>
+              <w:t>Զ/Ծ</w:t>
+            </w:r>
+          </w:p>
+        </w:tc>
+        <w:tc>
+          <w:tcPr>
+            <w:tcW w:w="630" w:type="dxa"/>
+            <w:vMerge w:val="restart"/>
+            <w:vAlign w:val="center"/>
+          </w:tcPr>
+          <w:p>
+            <w:pPr>
+              <w:spacing w:after="0" w:line="240" w:lineRule="exact"/>
+              <w:jc w:val="center"/>
+              <w:rPr>
+                <w:sz w:val="18"/>
+                <w:szCs w:val="18"/>
+              </w:rPr>
+            </w:pPr>
+            <w:r>
+              <w:rPr>
+                <w:rFonts w:ascii="Sylfaen" w:eastAsia="Sylfaen" w:hAnsi="Sylfaen" w:cs="Sylfaen"/>
+                <w:sz w:val="18"/>
+                <w:szCs w:val="18"/>
+                <w:lang w:val="hy-AM" w:bidi="hy-AM"/>
+              </w:rPr>
+              <w:t>ՇԱՐՔ</w:t>
+            </w:r>
+          </w:p>
+        </w:tc>
+        <w:tc>
+          <w:tcPr>
+            <w:tcW w:w="630" w:type="dxa"/>
+            <w:vMerge w:val="restart"/>
+            <w:vAlign w:val="center"/>
+          </w:tcPr>
+          <w:p>
+            <w:pPr>
+              <w:spacing w:after="0" w:line="240" w:lineRule="exact"/>
+              <w:jc w:val="center"/>
+              <w:rPr>
+                <w:sz w:val="18"/>
+                <w:szCs w:val="18"/>
+              </w:rPr>
+            </w:pPr>
+            <w:r>
+              <w:rPr>
+                <w:rFonts w:ascii="Sylfaen" w:eastAsia="Sylfaen" w:hAnsi="Sylfaen" w:cs="Sylfaen"/>
+                <w:sz w:val="18"/>
+                <w:szCs w:val="18"/>
+                <w:lang w:val="hy-AM" w:bidi="hy-AM"/>
+              </w:rPr>
+              <w:t>բաժնից</w:t>
+            </w:r>
+          </w:p>
+        </w:tc>
+        <w:tc>
+          <w:tcPr>
+            <w:tcW w:w="630" w:type="dxa"/>
+            <w:vMerge w:val="restart"/>
+            <w:vAlign w:val="center"/>
+          </w:tcPr>
+          <w:p>
+            <w:pPr>
+              <w:spacing w:after="0" w:line="240" w:lineRule="exact"/>
+              <w:jc w:val="center"/>
+              <w:rPr>
+                <w:sz w:val="18"/>
+                <w:szCs w:val="18"/>
+              </w:rPr>
+            </w:pPr>
+            <w:r>
+              <w:rPr>
+                <w:rFonts w:ascii="Sylfaen" w:eastAsia="Sylfaen" w:hAnsi="Sylfaen" w:cs="Sylfaen"/>
+                <w:sz w:val="18"/>
+                <w:szCs w:val="18"/>
+                <w:lang w:val="hy-AM" w:bidi="hy-AM"/>
+              </w:rPr>
+              <w:t>բաժին</w:t>
+            </w:r>
+          </w:p>
+        </w:tc>
+        <w:tc>
+          <w:tcPr>
+            <w:tcW w:w="630" w:type="dxa"/>
+            <w:vMerge w:val="restart"/>
+            <w:vAlign w:val="center"/>
+          </w:tcPr>
+          <w:p>
+            <w:pPr>
+              <w:spacing w:after="0" w:line="240" w:lineRule="exact"/>
+              <w:jc w:val="center"/>
+              <w:rPr>
+                <w:sz w:val="18"/>
+                <w:szCs w:val="18"/>
+              </w:rPr>
+            </w:pPr>
+            <w:r>
+              <w:rPr>
+                <w:rFonts w:ascii="Sylfaen" w:eastAsia="Sylfaen" w:hAnsi="Sylfaen" w:cs="Sylfaen"/>
+                <w:sz w:val="18"/>
+                <w:szCs w:val="18"/>
+                <w:lang w:val="hy-AM" w:bidi="hy-AM"/>
+              </w:rPr>
+              <w:t>Ընդհ</w:t>
+            </w:r>
+          </w:p>
+        </w:tc>
+        <w:tc>
+          <w:tcPr>
+            <w:tcW w:w="630" w:type="dxa"/>
+            <w:vAlign w:val="center"/>
+          </w:tcPr>
+          <w:p>
+            <w:pPr>
+              <w:spacing w:after="0" w:line="240" w:lineRule="exact"/>
+              <w:jc w:val="center"/>
+              <w:rPr>
+                <w:sz w:val="18"/>
+                <w:szCs w:val="18"/>
+              </w:rPr>
+            </w:pPr>
+            <w:r>
+              <w:rPr>
+                <w:rFonts w:ascii="Sylfaen" w:eastAsia="Sylfaen" w:hAnsi="Sylfaen" w:cs="Sylfaen"/>
+                <w:sz w:val="18"/>
+                <w:szCs w:val="18"/>
+                <w:lang w:val="hy-AM" w:bidi="hy-AM"/>
+              </w:rPr>
+              <w:t>Զ/Կ</w:t>
+            </w:r>
+          </w:p>
+        </w:tc>
+        <w:tc>
+          <w:tcPr>
+            <w:tcW w:w="630" w:type="dxa"/>
+            <w:vAlign w:val="center"/>
+          </w:tcPr>
+          <w:p>
+            <w:pPr>
+              <w:spacing w:after="0" w:line="240" w:lineRule="exact"/>
+              <w:jc w:val="center"/>
+              <w:rPr>
+                <w:sz w:val="18"/>
+                <w:szCs w:val="18"/>
+              </w:rPr>
+            </w:pPr>
+            <w:r>
+              <w:rPr>
+                <w:sz w:val="18"/>
+                <w:szCs w:val="18"/>
+              </w:rPr>
+              <w:t>Հ/Մ</w:t>
+            </w:r>
+          </w:p>
+        </w:tc>
+        <w:tc>
+          <w:tcPr>
+            <w:tcW w:w="630" w:type="dxa"/>
+            <w:vAlign w:val="center"/>
+          </w:tcPr>
+          <w:p>
+            <w:pPr>
+              <w:spacing w:after="0" w:line="240" w:lineRule="exact"/>
+              <w:jc w:val="center"/>
+              <w:rPr>
+                <w:sz w:val="18"/>
+                <w:szCs w:val="18"/>
+              </w:rPr>
+            </w:pPr>
+            <w:r>
+              <w:rPr>
+                <w:rFonts w:ascii="Sylfaen" w:eastAsia="Sylfaen" w:hAnsi="Sylfaen" w:cs="Sylfaen"/>
+                <w:sz w:val="18"/>
+                <w:szCs w:val="18"/>
+                <w:lang w:val="hy-AM" w:bidi="hy-AM"/>
+              </w:rPr>
+              <w:t>Զ/Ծ</w:t>
+            </w:r>
+            <w:r>
+              <w:rPr>
+                <w:rFonts w:ascii="Sylfaen" w:eastAsia="Sylfaen" w:hAnsi="Sylfaen" w:cs="Sylfaen"/>
+                <w:sz w:val="18"/>
+                <w:szCs w:val="18"/>
+                <w:lang w:val="hy-AM" w:bidi="hy-AM"/>
+              </w:rPr>
+              <w:t xml:space="preserve"> ըն</w:t>
+            </w:r>
+            <w:r>
+              <w:rPr>
+                <w:rFonts w:ascii="Sylfaen" w:eastAsia="Sylfaen" w:hAnsi="Sylfaen" w:cs="Sylfaen"/>
+                <w:sz w:val="18"/>
+                <w:szCs w:val="18"/>
+                <w:lang w:val="hy-AM" w:bidi="hy-AM"/>
+              </w:rPr>
+              <w:t>տ</w:t>
+            </w:r>
+          </w:p>
+        </w:tc>
+        <w:tc>
+          <w:tcPr>
+            <w:tcW w:w="630" w:type="dxa"/>
+            <w:vMerge w:val="restart"/>
+            <w:vAlign w:val="center"/>
+          </w:tcPr>
+          <w:p>
+            <w:pPr>
+              <w:spacing w:after="0" w:line="240" w:lineRule="exact"/>
+              <w:jc w:val="center"/>
+              <w:rPr>
+                <w:sz w:val="18"/>
+                <w:szCs w:val="18"/>
+              </w:rPr>
+            </w:pPr>
+            <w:r>
+              <w:rPr>
+                <w:rFonts w:ascii="Sylfaen" w:eastAsia="Sylfaen" w:hAnsi="Sylfaen" w:cs="Sylfaen"/>
+                <w:sz w:val="18"/>
+                <w:szCs w:val="18"/>
+                <w:lang w:val="hy-AM" w:bidi="hy-AM"/>
+              </w:rPr>
+              <w:t>Զ/Պ</w:t>
+            </w:r>
+          </w:p>
+        </w:tc>
+        <w:tc>
+          <w:tcPr>
+            <w:tcW w:w="630" w:type="dxa"/>
+            <w:vMerge w:val="restart"/>
+            <w:vAlign w:val="center"/>
+          </w:tcPr>
+          <w:p>
+            <w:pPr>
+              <w:spacing w:after="0" w:line="240" w:lineRule="exact"/>
+              <w:jc w:val="center"/>
+              <w:rPr>
+                <w:sz w:val="18"/>
+                <w:szCs w:val="18"/>
+              </w:rPr>
+            </w:pPr>
+            <w:r>
+              <w:rPr>
+                <w:rFonts w:ascii="Sylfaen" w:eastAsia="Sylfaen" w:hAnsi="Sylfaen" w:cs="Sylfaen"/>
+                <w:sz w:val="18"/>
+                <w:szCs w:val="18"/>
+                <w:lang w:val="hy-AM" w:bidi="hy-AM"/>
+              </w:rPr>
+              <w:t>Ք</w:t>
+            </w:r>
+            <w:r>
+              <w:rPr>
+                <w:rFonts w:ascii="Sylfaen" w:eastAsia="Sylfaen" w:hAnsi="Sylfaen" w:cs="Sylfaen"/>
+                <w:sz w:val="18"/>
+                <w:szCs w:val="18"/>
+                <w:lang w:val="hy-AM" w:bidi="hy-AM"/>
+              </w:rPr>
+              <w:t>-ի</w:t>
+            </w:r>
+          </w:p>
+        </w:tc>
+        <w:tc>
+          <w:tcPr>
+            <w:tcW w:w="630" w:type="dxa"/>
+            <w:vMerge w:val="restart"/>
+            <w:vAlign w:val="center"/>
+          </w:tcPr>
+          <w:p>
+            <w:pPr>
+              <w:spacing w:after="0" w:line="240" w:lineRule="exact"/>
+              <w:jc w:val="center"/>
+              <w:rPr>
+                <w:sz w:val="18"/>
+                <w:szCs w:val="18"/>
+              </w:rPr>
+            </w:pPr>
+            <w:r>
+              <w:rPr>
+                <w:rFonts w:ascii="Sylfaen" w:eastAsia="Sylfaen" w:hAnsi="Sylfaen" w:cs="Sylfaen"/>
+                <w:sz w:val="18"/>
+                <w:szCs w:val="18"/>
+                <w:lang w:val="hy-AM" w:bidi="hy-AM"/>
+              </w:rPr>
+              <w:t>ՇԱՐՔ</w:t>
+            </w:r>
+          </w:p>
+        </w:tc>
+        <w:tc>
+          <w:tcPr>
+            <w:tcW w:w="630" w:type="dxa"/>
+            <w:vMerge w:val="restart"/>
+            <w:vAlign w:val="center"/>
+          </w:tcPr>
+          <w:p>
+            <w:pPr>
+              <w:spacing w:after="0" w:line="240" w:lineRule="exact"/>
+              <w:jc w:val="center"/>
+              <w:rPr>
+                <w:sz w:val="18"/>
+                <w:szCs w:val="18"/>
+              </w:rPr>
+            </w:pPr>
+            <w:r>
+              <w:rPr>
+                <w:rFonts w:ascii="Sylfaen" w:eastAsia="Sylfaen" w:hAnsi="Sylfaen" w:cs="Sylfaen"/>
+                <w:sz w:val="18"/>
+                <w:szCs w:val="18"/>
+                <w:lang w:val="hy-AM" w:bidi="hy-AM"/>
+              </w:rPr>
+              <w:t>ՍՊԱ</w:t>
+            </w:r>
+          </w:p>
+        </w:tc>
+        <w:tc>
+          <w:tcPr>
+            <w:tcW w:w="630" w:type="dxa"/>
+            <w:vMerge w:val="restart"/>
+            <w:vAlign w:val="center"/>
+          </w:tcPr>
+          <w:p>
+            <w:pPr>
+              <w:spacing w:after="0" w:line="240" w:lineRule="exact"/>
+              <w:jc w:val="center"/>
+              <w:rPr>
+                <w:sz w:val="18"/>
+                <w:szCs w:val="18"/>
+              </w:rPr>
+            </w:pPr>
+            <w:r>
+              <w:rPr>
+                <w:rFonts w:ascii="Sylfaen" w:eastAsia="Sylfaen" w:hAnsi="Sylfaen" w:cs="Sylfaen"/>
+                <w:sz w:val="18"/>
+                <w:szCs w:val="18"/>
+                <w:lang w:val="hy-AM" w:bidi="hy-AM"/>
+              </w:rPr>
+              <w:t>ՊԱՅՄ</w:t>
             </w:r>
           </w:p>
         </w:tc>
@@ -293,69 +845,210 @@
         <w:tc>
           <w:tcPr>
             <w:tcW w:w="630" w:type="dxa"/>
-            <w:vMerge w:val="restart"/>
-            <w:vAlign w:val="center"/>
-          </w:tcPr>
-          <w:p>
-            <w:pPr>
-              <w:spacing w:after="0" w:line="240" w:lineRule="exact"/>
-              <w:jc w:val="center"/>
-              <w:rPr>
-                <w:sz w:val="18"/>
-                <w:szCs w:val="18"/>
-              </w:rPr>
-            </w:pPr>
-            <w:r>
-              <w:rPr>
-                <w:rFonts w:ascii="Sylfaen" w:eastAsia="Sylfaen" w:hAnsi="Sylfaen" w:cs="Sylfaen"/>
-                <w:sz w:val="18"/>
-                <w:szCs w:val="18"/>
-                <w:lang w:val="hy-AM" w:bidi="hy-AM"/>
-              </w:rPr>
-              <w:t>Ը</w:t>
-            </w:r>
-            <w:r>
-              <w:rPr>
-                <w:rFonts w:ascii="Sylfaen" w:eastAsia="Sylfaen" w:hAnsi="Sylfaen" w:cs="Sylfaen"/>
-                <w:sz w:val="18"/>
-                <w:szCs w:val="18"/>
-                <w:lang w:val="hy-AM" w:bidi="hy-AM"/>
-              </w:rPr>
-              <w:t>ՆԴ</w:t>
-            </w:r>
-          </w:p>
-        </w:tc>
-        <w:tc>
-          <w:tcPr>
-            <w:tcW w:w="630" w:type="dxa"/>
-            <w:vMerge w:val="restart"/>
-            <w:vAlign w:val="center"/>
-          </w:tcPr>
-          <w:p>
-            <w:pPr>
-              <w:spacing w:after="0" w:line="240" w:lineRule="exact"/>
-              <w:jc w:val="center"/>
-              <w:rPr>
-                <w:sz w:val="18"/>
-                <w:szCs w:val="18"/>
-                <w:lang w:val="hy-AM"/>
-              </w:rPr>
-            </w:pPr>
-            <w:r>
-              <w:rPr>
-                <w:rFonts w:ascii="Sylfaen" w:eastAsia="Sylfaen" w:hAnsi="Sylfaen" w:cs="Sylfaen"/>
-                <w:sz w:val="18"/>
-                <w:szCs w:val="18"/>
-                <w:lang w:val="hy-AM" w:bidi="hy-AM"/>
-              </w:rPr>
-              <w:t>Զ/Ծ</w:t>
-            </w:r>
-          </w:p>
-        </w:tc>
-        <w:tc>
-          <w:tcPr>
-            <w:tcW w:w="630" w:type="dxa"/>
-            <w:vMerge w:val="restart"/>
+            <w:vMerge/>
+            <w:vAlign w:val="center"/>
+          </w:tcPr>
+          <w:p>
+            <w:pPr>
+              <w:spacing w:after="0" w:line="240" w:lineRule="exact"/>
+              <w:jc w:val="center"/>
+              <w:rPr>
+                <w:sz w:val="18"/>
+                <w:szCs w:val="18"/>
+              </w:rPr>
+            </w:pPr>
+          </w:p>
+        </w:tc>
+        <w:tc>
+          <w:tcPr>
+            <w:tcW w:w="630" w:type="dxa"/>
+            <w:vMerge/>
+            <w:vAlign w:val="center"/>
+          </w:tcPr>
+          <w:p>
+            <w:pPr>
+              <w:spacing w:after="0" w:line="240" w:lineRule="exact"/>
+              <w:jc w:val="center"/>
+              <w:rPr>
+                <w:sz w:val="18"/>
+                <w:szCs w:val="18"/>
+              </w:rPr>
+            </w:pPr>
+          </w:p>
+        </w:tc>
+        <w:tc>
+          <w:tcPr>
+            <w:tcW w:w="630" w:type="dxa"/>
+            <w:vMerge/>
+            <w:vAlign w:val="center"/>
+          </w:tcPr>
+          <w:p>
+            <w:pPr>
+              <w:spacing w:after="0" w:line="240" w:lineRule="exact"/>
+              <w:jc w:val="center"/>
+              <w:rPr>
+                <w:sz w:val="18"/>
+                <w:szCs w:val="18"/>
+              </w:rPr>
+            </w:pPr>
+          </w:p>
+        </w:tc>
+        <w:tc>
+          <w:tcPr>
+            <w:tcW w:w="630" w:type="dxa"/>
+            <w:vMerge/>
+            <w:vAlign w:val="center"/>
+          </w:tcPr>
+          <w:p>
+            <w:pPr>
+              <w:spacing w:after="0" w:line="240" w:lineRule="exact"/>
+              <w:jc w:val="center"/>
+              <w:rPr>
+                <w:sz w:val="18"/>
+                <w:szCs w:val="18"/>
+              </w:rPr>
+            </w:pPr>
+          </w:p>
+        </w:tc>
+        <w:tc>
+          <w:tcPr>
+            <w:tcW w:w="630" w:type="dxa"/>
+            <w:vMerge/>
+            <w:vAlign w:val="center"/>
+          </w:tcPr>
+          <w:p>
+            <w:pPr>
+              <w:spacing w:after="0" w:line="240" w:lineRule="exact"/>
+              <w:jc w:val="center"/>
+              <w:rPr>
+                <w:sz w:val="18"/>
+                <w:szCs w:val="18"/>
+              </w:rPr>
+            </w:pPr>
+          </w:p>
+        </w:tc>
+        <w:tc>
+          <w:tcPr>
+            <w:tcW w:w="630" w:type="dxa"/>
+            <w:vMerge/>
+            <w:vAlign w:val="center"/>
+          </w:tcPr>
+          <w:p>
+            <w:pPr>
+              <w:spacing w:after="0" w:line="240" w:lineRule="exact"/>
+              <w:jc w:val="center"/>
+              <w:rPr>
+                <w:sz w:val="18"/>
+                <w:szCs w:val="18"/>
+              </w:rPr>
+            </w:pPr>
+          </w:p>
+        </w:tc>
+        <w:tc>
+          <w:tcPr>
+            <w:tcW w:w="630" w:type="dxa"/>
+            <w:vMerge/>
+            <w:vAlign w:val="center"/>
+          </w:tcPr>
+          <w:p>
+            <w:pPr>
+              <w:spacing w:after="0" w:line="240" w:lineRule="exact"/>
+              <w:jc w:val="center"/>
+              <w:rPr>
+                <w:sz w:val="18"/>
+                <w:szCs w:val="18"/>
+              </w:rPr>
+            </w:pPr>
+          </w:p>
+        </w:tc>
+        <w:tc>
+          <w:tcPr>
+            <w:tcW w:w="630" w:type="dxa"/>
+            <w:vMerge/>
+            <w:vAlign w:val="center"/>
+          </w:tcPr>
+          <w:p>
+            <w:pPr>
+              <w:spacing w:after="0" w:line="240" w:lineRule="exact"/>
+              <w:jc w:val="center"/>
+              <w:rPr>
+                <w:sz w:val="18"/>
+                <w:szCs w:val="18"/>
+              </w:rPr>
+            </w:pPr>
+          </w:p>
+        </w:tc>
+        <w:tc>
+          <w:tcPr>
+            <w:tcW w:w="630" w:type="dxa"/>
+            <w:vMerge/>
+            <w:vAlign w:val="center"/>
+          </w:tcPr>
+          <w:p>
+            <w:pPr>
+              <w:spacing w:after="0" w:line="240" w:lineRule="exact"/>
+              <w:jc w:val="center"/>
+              <w:rPr>
+                <w:sz w:val="18"/>
+                <w:szCs w:val="18"/>
+              </w:rPr>
+            </w:pPr>
+          </w:p>
+        </w:tc>
+        <w:tc>
+          <w:tcPr>
+            <w:tcW w:w="630" w:type="dxa"/>
+            <w:vMerge/>
+            <w:vAlign w:val="center"/>
+          </w:tcPr>
+          <w:p>
+            <w:pPr>
+              <w:spacing w:after="0" w:line="240" w:lineRule="exact"/>
+              <w:jc w:val="center"/>
+              <w:rPr>
+                <w:sz w:val="18"/>
+                <w:szCs w:val="18"/>
+              </w:rPr>
+            </w:pPr>
+          </w:p>
+        </w:tc>
+        <w:tc>
+          <w:tcPr>
+            <w:tcW w:w="630" w:type="dxa"/>
+            <w:vMerge/>
+            <w:vAlign w:val="center"/>
+          </w:tcPr>
+          <w:p>
+            <w:pPr>
+              <w:spacing w:after="0" w:line="240" w:lineRule="exact"/>
+              <w:jc w:val="center"/>
+              <w:rPr>
+                <w:sz w:val="18"/>
+                <w:szCs w:val="18"/>
+              </w:rPr>
+            </w:pPr>
+          </w:p>
+        </w:tc>
+        <w:tc>
+          <w:tcPr>
+            <w:tcW w:w="630" w:type="dxa"/>
+            <w:vMerge/>
+            <w:vAlign w:val="center"/>
+          </w:tcPr>
+          <w:p>
+            <w:pPr>
+              <w:spacing w:after="0" w:line="240" w:lineRule="exact"/>
+              <w:jc w:val="center"/>
+              <w:rPr>
+                <w:sz w:val="18"/>
+                <w:szCs w:val="18"/>
+              </w:rPr>
+            </w:pPr>
+          </w:p>
+        </w:tc>
+        <w:tc>
+          <w:tcPr>
+            <w:tcW w:w="630" w:type="dxa"/>
             <w:vAlign w:val="center"/>
           </w:tcPr>
           <w:p>
@@ -381,468 +1074,6 @@
         <w:tc>
           <w:tcPr>
             <w:tcW w:w="630" w:type="dxa"/>
-            <w:vMerge w:val="restart"/>
-            <w:vAlign w:val="center"/>
-          </w:tcPr>
-          <w:p>
-            <w:pPr>
-              <w:spacing w:after="0" w:line="240" w:lineRule="exact"/>
-              <w:jc w:val="center"/>
-              <w:rPr>
-                <w:sz w:val="18"/>
-                <w:szCs w:val="18"/>
-              </w:rPr>
-            </w:pPr>
-            <w:r>
-              <w:rPr>
-                <w:rFonts w:ascii="Sylfaen" w:eastAsia="Sylfaen" w:hAnsi="Sylfaen" w:cs="Sylfaen"/>
-                <w:sz w:val="18"/>
-                <w:szCs w:val="18"/>
-                <w:lang w:val="hy-AM" w:bidi="hy-AM"/>
-              </w:rPr>
-              <w:t>Ը</w:t>
-            </w:r>
-            <w:r>
-              <w:rPr>
-                <w:rFonts w:ascii="Sylfaen" w:eastAsia="Sylfaen" w:hAnsi="Sylfaen" w:cs="Sylfaen"/>
-                <w:sz w:val="18"/>
-                <w:szCs w:val="18"/>
-                <w:lang w:val="hy-AM" w:bidi="hy-AM"/>
-              </w:rPr>
-              <w:t>ՆԴ</w:t>
-            </w:r>
-          </w:p>
-        </w:tc>
-        <w:tc>
-          <w:tcPr>
-            <w:tcW w:w="630" w:type="dxa"/>
-            <w:vMerge w:val="restart"/>
-            <w:vAlign w:val="center"/>
-          </w:tcPr>
-          <w:p>
-            <w:pPr>
-              <w:spacing w:after="0" w:line="240" w:lineRule="exact"/>
-              <w:jc w:val="center"/>
-              <w:rPr>
-                <w:sz w:val="18"/>
-                <w:szCs w:val="18"/>
-              </w:rPr>
-            </w:pPr>
-            <w:r>
-              <w:rPr>
-                <w:rFonts w:ascii="Sylfaen" w:eastAsia="Sylfaen" w:hAnsi="Sylfaen" w:cs="Sylfaen"/>
-                <w:sz w:val="18"/>
-                <w:szCs w:val="18"/>
-                <w:lang w:val="hy-AM" w:bidi="hy-AM"/>
-              </w:rPr>
-              <w:t>Զ/Ծ</w:t>
-            </w:r>
-          </w:p>
-        </w:tc>
-        <w:tc>
-          <w:tcPr>
-            <w:tcW w:w="630" w:type="dxa"/>
-            <w:vMerge w:val="restart"/>
-            <w:vAlign w:val="center"/>
-          </w:tcPr>
-          <w:p>
-            <w:pPr>
-              <w:spacing w:after="0" w:line="240" w:lineRule="exact"/>
-              <w:jc w:val="center"/>
-              <w:rPr>
-                <w:sz w:val="18"/>
-                <w:szCs w:val="18"/>
-              </w:rPr>
-            </w:pPr>
-            <w:r>
-              <w:rPr>
-                <w:rFonts w:ascii="Sylfaen" w:eastAsia="Sylfaen" w:hAnsi="Sylfaen" w:cs="Sylfaen"/>
-                <w:sz w:val="18"/>
-                <w:szCs w:val="18"/>
-                <w:lang w:val="hy-AM" w:bidi="hy-AM"/>
-              </w:rPr>
-              <w:t>ՇԱՐՔ</w:t>
-            </w:r>
-          </w:p>
-        </w:tc>
-        <w:tc>
-          <w:tcPr>
-            <w:tcW w:w="630" w:type="dxa"/>
-            <w:vMerge w:val="restart"/>
-            <w:vAlign w:val="center"/>
-          </w:tcPr>
-          <w:p>
-            <w:pPr>
-              <w:spacing w:after="0" w:line="240" w:lineRule="exact"/>
-              <w:jc w:val="center"/>
-              <w:rPr>
-                <w:sz w:val="18"/>
-                <w:szCs w:val="18"/>
-              </w:rPr>
-            </w:pPr>
-            <w:r>
-              <w:rPr>
-                <w:rFonts w:ascii="Sylfaen" w:eastAsia="Sylfaen" w:hAnsi="Sylfaen" w:cs="Sylfaen"/>
-                <w:sz w:val="18"/>
-                <w:szCs w:val="18"/>
-                <w:lang w:val="hy-AM" w:bidi="hy-AM"/>
-              </w:rPr>
-              <w:t>Ը</w:t>
-            </w:r>
-            <w:r>
-              <w:rPr>
-                <w:rFonts w:ascii="Sylfaen" w:eastAsia="Sylfaen" w:hAnsi="Sylfaen" w:cs="Sylfaen"/>
-                <w:sz w:val="18"/>
-                <w:szCs w:val="18"/>
-                <w:lang w:val="hy-AM" w:bidi="hy-AM"/>
-              </w:rPr>
-              <w:t>ՆԴ</w:t>
-            </w:r>
-          </w:p>
-        </w:tc>
-        <w:tc>
-          <w:tcPr>
-            <w:tcW w:w="630" w:type="dxa"/>
-            <w:vMerge w:val="restart"/>
-            <w:vAlign w:val="center"/>
-          </w:tcPr>
-          <w:p>
-            <w:pPr>
-              <w:spacing w:after="0" w:line="240" w:lineRule="exact"/>
-              <w:jc w:val="center"/>
-              <w:rPr>
-                <w:sz w:val="18"/>
-                <w:szCs w:val="18"/>
-              </w:rPr>
-            </w:pPr>
-            <w:r>
-              <w:rPr>
-                <w:rFonts w:ascii="Sylfaen" w:eastAsia="Sylfaen" w:hAnsi="Sylfaen" w:cs="Sylfaen"/>
-                <w:sz w:val="18"/>
-                <w:szCs w:val="18"/>
-                <w:lang w:val="hy-AM" w:bidi="hy-AM"/>
-              </w:rPr>
-              <w:t>Զ/Ծ</w:t>
-            </w:r>
-          </w:p>
-        </w:tc>
-        <w:tc>
-          <w:tcPr>
-            <w:tcW w:w="630" w:type="dxa"/>
-            <w:vMerge w:val="restart"/>
-            <w:vAlign w:val="center"/>
-          </w:tcPr>
-          <w:p>
-            <w:pPr>
-              <w:spacing w:after="0" w:line="240" w:lineRule="exact"/>
-              <w:jc w:val="center"/>
-              <w:rPr>
-                <w:sz w:val="18"/>
-                <w:szCs w:val="18"/>
-              </w:rPr>
-            </w:pPr>
-            <w:r>
-              <w:rPr>
-                <w:rFonts w:ascii="Sylfaen" w:eastAsia="Sylfaen" w:hAnsi="Sylfaen" w:cs="Sylfaen"/>
-                <w:sz w:val="18"/>
-                <w:szCs w:val="18"/>
-                <w:lang w:val="hy-AM" w:bidi="hy-AM"/>
-              </w:rPr>
-              <w:t>ՇԱՐՔ</w:t>
-            </w:r>
-          </w:p>
-        </w:tc>
-        <w:tc>
-          <w:tcPr>
-            <w:tcW w:w="630" w:type="dxa"/>
-            <w:vMerge w:val="restart"/>
-            <w:vAlign w:val="center"/>
-          </w:tcPr>
-          <w:p>
-            <w:pPr>
-              <w:spacing w:after="0" w:line="240" w:lineRule="exact"/>
-              <w:jc w:val="center"/>
-              <w:rPr>
-                <w:sz w:val="18"/>
-                <w:szCs w:val="18"/>
-              </w:rPr>
-            </w:pPr>
-            <w:r>
-              <w:rPr>
-                <w:rFonts w:ascii="Sylfaen" w:eastAsia="Sylfaen" w:hAnsi="Sylfaen" w:cs="Sylfaen"/>
-                <w:sz w:val="18"/>
-                <w:szCs w:val="18"/>
-                <w:lang w:val="hy-AM" w:bidi="hy-AM"/>
-              </w:rPr>
-              <w:t>բաժնից</w:t>
-            </w:r>
-          </w:p>
-        </w:tc>
-        <w:tc>
-          <w:tcPr>
-            <w:tcW w:w="630" w:type="dxa"/>
-            <w:vMerge w:val="restart"/>
-            <w:vAlign w:val="center"/>
-          </w:tcPr>
-          <w:p>
-            <w:pPr>
-              <w:spacing w:after="0" w:line="240" w:lineRule="exact"/>
-              <w:jc w:val="center"/>
-              <w:rPr>
-                <w:sz w:val="18"/>
-                <w:szCs w:val="18"/>
-              </w:rPr>
-            </w:pPr>
-            <w:r>
-              <w:rPr>
-                <w:rFonts w:ascii="Sylfaen" w:eastAsia="Sylfaen" w:hAnsi="Sylfaen" w:cs="Sylfaen"/>
-                <w:sz w:val="18"/>
-                <w:szCs w:val="18"/>
-                <w:lang w:val="hy-AM" w:bidi="hy-AM"/>
-              </w:rPr>
-              <w:t>բաժին</w:t>
-            </w:r>
-          </w:p>
-        </w:tc>
-        <w:tc>
-          <w:tcPr>
-            <w:tcW w:w="630" w:type="dxa"/>
-            <w:vMerge w:val="restart"/>
-            <w:vAlign w:val="center"/>
-          </w:tcPr>
-          <w:p>
-            <w:pPr>
-              <w:spacing w:after="0" w:line="240" w:lineRule="exact"/>
-              <w:jc w:val="center"/>
-              <w:rPr>
-                <w:sz w:val="18"/>
-                <w:szCs w:val="18"/>
-              </w:rPr>
-            </w:pPr>
-            <w:r>
-              <w:rPr>
-                <w:rFonts w:ascii="Sylfaen" w:eastAsia="Sylfaen" w:hAnsi="Sylfaen" w:cs="Sylfaen"/>
-                <w:sz w:val="18"/>
-                <w:szCs w:val="18"/>
-                <w:lang w:val="hy-AM" w:bidi="hy-AM"/>
-              </w:rPr>
-              <w:t>Ընդհ</w:t>
-            </w:r>
-          </w:p>
-        </w:tc>
-        <w:tc>
-          <w:tcPr>
-            <w:tcW w:w="2520" w:type="dxa"/>
-            <w:gridSpan w:val="4"/>
-            <w:vAlign w:val="center"/>
-          </w:tcPr>
-          <w:p>
-            <w:pPr>
-              <w:spacing w:after="0" w:line="240" w:lineRule="exact"/>
-              <w:jc w:val="center"/>
-              <w:rPr>
-                <w:sz w:val="18"/>
-                <w:szCs w:val="18"/>
-              </w:rPr>
-            </w:pPr>
-            <w:r>
-              <w:rPr>
-                <w:rFonts w:ascii="Sylfaen" w:eastAsia="Sylfaen" w:hAnsi="Sylfaen" w:cs="Sylfaen"/>
-                <w:b/>
-                <w:bCs/>
-                <w:sz w:val="18"/>
-                <w:szCs w:val="18"/>
-                <w:lang w:val="hy-AM" w:bidi="hy-AM"/>
-              </w:rPr>
-              <w:t>Զինծառայող</w:t>
-            </w:r>
-          </w:p>
-        </w:tc>
-        <w:tc>
-          <w:tcPr>
-            <w:tcW w:w="630" w:type="dxa"/>
-            <w:vMerge w:val="restart"/>
-            <w:vAlign w:val="center"/>
-          </w:tcPr>
-          <w:p>
-            <w:pPr>
-              <w:spacing w:after="0" w:line="240" w:lineRule="exact"/>
-              <w:jc w:val="center"/>
-              <w:rPr>
-                <w:sz w:val="18"/>
-                <w:szCs w:val="18"/>
-              </w:rPr>
-            </w:pPr>
-            <w:r>
-              <w:rPr>
-                <w:rFonts w:ascii="Sylfaen" w:eastAsia="Sylfaen" w:hAnsi="Sylfaen" w:cs="Sylfaen"/>
-                <w:sz w:val="18"/>
-                <w:szCs w:val="18"/>
-                <w:lang w:val="hy-AM" w:bidi="hy-AM"/>
-              </w:rPr>
-              <w:t>Զ/Կ</w:t>
-            </w:r>
-          </w:p>
-        </w:tc>
-        <w:tc>
-          <w:tcPr>
-            <w:tcW w:w="630" w:type="dxa"/>
-            <w:vMerge w:val="restart"/>
-            <w:vAlign w:val="center"/>
-          </w:tcPr>
-          <w:p>
-            <w:pPr>
-              <w:spacing w:after="0" w:line="240" w:lineRule="exact"/>
-              <w:jc w:val="center"/>
-              <w:rPr>
-                <w:sz w:val="18"/>
-                <w:szCs w:val="18"/>
-              </w:rPr>
-            </w:pPr>
-            <w:r>
-              <w:rPr>
-                <w:sz w:val="18"/>
-                <w:szCs w:val="18"/>
-              </w:rPr>
-              <w:t>Հ/Մ</w:t>
-            </w:r>
-          </w:p>
-        </w:tc>
-        <w:tc>
-          <w:tcPr>
-            <w:tcW w:w="630" w:type="dxa"/>
-            <w:vMerge w:val="restart"/>
-            <w:vAlign w:val="center"/>
-          </w:tcPr>
-          <w:p>
-            <w:pPr>
-              <w:spacing w:after="0" w:line="240" w:lineRule="exact"/>
-              <w:jc w:val="center"/>
-              <w:rPr>
-                <w:sz w:val="18"/>
-                <w:szCs w:val="18"/>
-              </w:rPr>
-            </w:pPr>
-            <w:r>
-              <w:rPr>
-                <w:rFonts w:ascii="Sylfaen" w:eastAsia="Sylfaen" w:hAnsi="Sylfaen" w:cs="Sylfaen"/>
-                <w:sz w:val="18"/>
-                <w:szCs w:val="18"/>
-                <w:lang w:val="hy-AM" w:bidi="hy-AM"/>
-              </w:rPr>
-              <w:t>Զ/Ծ</w:t>
-            </w:r>
-            <w:r>
-              <w:rPr>
-                <w:rFonts w:ascii="Sylfaen" w:eastAsia="Sylfaen" w:hAnsi="Sylfaen" w:cs="Sylfaen"/>
-                <w:sz w:val="18"/>
-                <w:szCs w:val="18"/>
-                <w:lang w:val="hy-AM" w:bidi="hy-AM"/>
-              </w:rPr>
-              <w:t xml:space="preserve"> ըն</w:t>
-            </w:r>
-            <w:r>
-              <w:rPr>
-                <w:rFonts w:ascii="Sylfaen" w:eastAsia="Sylfaen" w:hAnsi="Sylfaen" w:cs="Sylfaen"/>
-                <w:sz w:val="18"/>
-                <w:szCs w:val="18"/>
-                <w:lang w:val="hy-AM" w:bidi="hy-AM"/>
-              </w:rPr>
-              <w:t>տ</w:t>
-            </w:r>
-          </w:p>
-        </w:tc>
-        <w:tc>
-          <w:tcPr>
-            <w:tcW w:w="630" w:type="dxa"/>
-            <w:vMerge w:val="restart"/>
-            <w:vAlign w:val="center"/>
-          </w:tcPr>
-          <w:p>
-            <w:pPr>
-              <w:spacing w:after="0" w:line="240" w:lineRule="exact"/>
-              <w:jc w:val="center"/>
-              <w:rPr>
-                <w:sz w:val="18"/>
-                <w:szCs w:val="18"/>
-              </w:rPr>
-            </w:pPr>
-            <w:r>
-              <w:rPr>
-                <w:rFonts w:ascii="Sylfaen" w:eastAsia="Sylfaen" w:hAnsi="Sylfaen" w:cs="Sylfaen"/>
-                <w:sz w:val="18"/>
-                <w:szCs w:val="18"/>
-                <w:lang w:val="hy-AM" w:bidi="hy-AM"/>
-              </w:rPr>
-              <w:t>Զ/Պ</w:t>
-            </w:r>
-          </w:p>
-        </w:tc>
-        <w:tc>
-          <w:tcPr>
-            <w:tcW w:w="630" w:type="dxa"/>
-            <w:vMerge w:val="restart"/>
-            <w:vAlign w:val="center"/>
-          </w:tcPr>
-          <w:p>
-            <w:pPr>
-              <w:spacing w:after="0" w:line="240" w:lineRule="exact"/>
-              <w:jc w:val="center"/>
-              <w:rPr>
-                <w:sz w:val="18"/>
-                <w:szCs w:val="18"/>
-              </w:rPr>
-            </w:pPr>
-            <w:r>
-              <w:rPr>
-                <w:rFonts w:ascii="Sylfaen" w:eastAsia="Sylfaen" w:hAnsi="Sylfaen" w:cs="Sylfaen"/>
-                <w:sz w:val="18"/>
-                <w:szCs w:val="18"/>
-                <w:lang w:val="hy-AM" w:bidi="hy-AM"/>
-              </w:rPr>
-              <w:t>Ք</w:t>
-            </w:r>
-            <w:r>
-              <w:rPr>
-                <w:rFonts w:ascii="Sylfaen" w:eastAsia="Sylfaen" w:hAnsi="Sylfaen" w:cs="Sylfaen"/>
-                <w:sz w:val="18"/>
-                <w:szCs w:val="18"/>
-                <w:lang w:val="hy-AM" w:bidi="hy-AM"/>
-              </w:rPr>
-              <w:t>-ի</w:t>
-            </w:r>
-          </w:p>
-        </w:tc>
-        <w:tc>
-          <w:tcPr>
-            <w:tcW w:w="630" w:type="dxa"/>
-            <w:vMerge w:val="restart"/>
-            <w:vAlign w:val="center"/>
-          </w:tcPr>
-          <w:p>
-            <w:pPr>
-              <w:spacing w:after="0" w:line="240" w:lineRule="exact"/>
-              <w:jc w:val="center"/>
-              <w:rPr>
-                <w:sz w:val="18"/>
-                <w:szCs w:val="18"/>
-              </w:rPr>
-            </w:pPr>
-            <w:r>
-              <w:rPr>
-                <w:rFonts w:ascii="Sylfaen" w:eastAsia="Sylfaen" w:hAnsi="Sylfaen" w:cs="Sylfaen"/>
-                <w:sz w:val="18"/>
-                <w:szCs w:val="18"/>
-                <w:lang w:val="hy-AM" w:bidi="hy-AM"/>
-              </w:rPr>
-              <w:t>ՇԱՐՔ</w:t>
-            </w:r>
-          </w:p>
-        </w:tc>
-        <w:tc>
-          <w:tcPr>
-            <w:tcW w:w="630" w:type="dxa"/>
-            <w:vMerge w:val="restart"/>
             <w:vAlign w:val="center"/>
           </w:tcPr>
           <w:p>
@@ -868,7 +1099,6 @@
         <w:tc>
           <w:tcPr>
             <w:tcW w:w="630" w:type="dxa"/>
-            <w:vMerge w:val="restart"/>
             <w:vAlign w:val="center"/>
           </w:tcPr>
           <w:p>
@@ -891,12 +1121,6 @@
             </w:r>
           </w:p>
         </w:tc>
-      </w:tr>
-      <w:tr>
-        <w:trPr>
-          <w:trHeight w:hRule="exact" w:val="300"/>
-          <w:jc w:val="center"/>
-        </w:trPr>
         <w:tc>
           <w:tcPr>
             <w:tcW w:w="630" w:type="dxa"/>
@@ -985,363 +1209,38 @@
         <w:tc>
           <w:tcPr>
             <w:tcW w:w="630" w:type="dxa"/>
-            <w:vMerge/>
-            <w:vAlign w:val="center"/>
-          </w:tcPr>
-          <w:p>
-            <w:pPr>
-              <w:spacing w:after="0" w:line="240" w:lineRule="exact"/>
-              <w:jc w:val="center"/>
-              <w:rPr>
-                <w:sz w:val="18"/>
-                <w:szCs w:val="18"/>
-              </w:rPr>
-            </w:pPr>
-          </w:p>
-        </w:tc>
-        <w:tc>
-          <w:tcPr>
-            <w:tcW w:w="630" w:type="dxa"/>
-            <w:vMerge/>
-            <w:vAlign w:val="center"/>
-          </w:tcPr>
-          <w:p>
-            <w:pPr>
-              <w:spacing w:after="0" w:line="240" w:lineRule="exact"/>
-              <w:jc w:val="center"/>
-              <w:rPr>
-                <w:sz w:val="18"/>
-                <w:szCs w:val="18"/>
-              </w:rPr>
-            </w:pPr>
-          </w:p>
-        </w:tc>
-        <w:tc>
-          <w:tcPr>
-            <w:tcW w:w="630" w:type="dxa"/>
-            <w:vMerge/>
-            <w:vAlign w:val="center"/>
-          </w:tcPr>
-          <w:p>
-            <w:pPr>
-              <w:spacing w:after="0" w:line="240" w:lineRule="exact"/>
-              <w:jc w:val="center"/>
-              <w:rPr>
-                <w:sz w:val="18"/>
-                <w:szCs w:val="18"/>
-              </w:rPr>
-            </w:pPr>
-          </w:p>
-        </w:tc>
-        <w:tc>
-          <w:tcPr>
-            <w:tcW w:w="630" w:type="dxa"/>
-            <w:vMerge/>
-            <w:vAlign w:val="center"/>
-          </w:tcPr>
-          <w:p>
-            <w:pPr>
-              <w:spacing w:after="0" w:line="240" w:lineRule="exact"/>
-              <w:jc w:val="center"/>
-              <w:rPr>
-                <w:sz w:val="18"/>
-                <w:szCs w:val="18"/>
-              </w:rPr>
-            </w:pPr>
-          </w:p>
-        </w:tc>
-        <w:tc>
-          <w:tcPr>
-            <w:tcW w:w="630" w:type="dxa"/>
-            <w:vMerge/>
-            <w:vAlign w:val="center"/>
-          </w:tcPr>
-          <w:p>
-            <w:pPr>
-              <w:spacing w:after="0" w:line="240" w:lineRule="exact"/>
-              <w:jc w:val="center"/>
-              <w:rPr>
-                <w:sz w:val="18"/>
-                <w:szCs w:val="18"/>
-              </w:rPr>
-            </w:pPr>
-          </w:p>
-        </w:tc>
-        <w:tc>
-          <w:tcPr>
-            <w:tcW w:w="630" w:type="dxa"/>
-            <w:vMerge/>
-            <w:vAlign w:val="center"/>
-          </w:tcPr>
-          <w:p>
-            <w:pPr>
-              <w:spacing w:after="0" w:line="240" w:lineRule="exact"/>
-              <w:jc w:val="center"/>
-              <w:rPr>
-                <w:sz w:val="18"/>
-                <w:szCs w:val="18"/>
-              </w:rPr>
-            </w:pPr>
-          </w:p>
-        </w:tc>
-        <w:tc>
-          <w:tcPr>
-            <w:tcW w:w="630" w:type="dxa"/>
-            <w:vMerge/>
-            <w:vAlign w:val="center"/>
-          </w:tcPr>
-          <w:p>
-            <w:pPr>
-              <w:spacing w:after="0" w:line="240" w:lineRule="exact"/>
-              <w:jc w:val="center"/>
-              <w:rPr>
-                <w:sz w:val="18"/>
-                <w:szCs w:val="18"/>
-              </w:rPr>
-            </w:pPr>
-          </w:p>
-        </w:tc>
-        <w:tc>
-          <w:tcPr>
-            <w:tcW w:w="630" w:type="dxa"/>
-            <w:vAlign w:val="center"/>
-          </w:tcPr>
-          <w:p>
-            <w:pPr>
-              <w:spacing w:after="0" w:line="240" w:lineRule="exact"/>
-              <w:jc w:val="center"/>
-              <w:rPr>
-                <w:sz w:val="18"/>
-                <w:szCs w:val="18"/>
-              </w:rPr>
-            </w:pPr>
-            <w:r>
-              <w:rPr>
-                <w:rFonts w:ascii="Sylfaen" w:eastAsia="Sylfaen" w:hAnsi="Sylfaen" w:cs="Sylfaen"/>
-                <w:sz w:val="18"/>
-                <w:szCs w:val="18"/>
-                <w:lang w:val="hy-AM" w:bidi="hy-AM"/>
-              </w:rPr>
-              <w:t>ՇԱՐՔ</w:t>
-            </w:r>
-          </w:p>
-        </w:tc>
-        <w:tc>
-          <w:tcPr>
-            <w:tcW w:w="630" w:type="dxa"/>
-            <w:vAlign w:val="center"/>
-          </w:tcPr>
-          <w:p>
-            <w:pPr>
-              <w:spacing w:after="0" w:line="240" w:lineRule="exact"/>
-              <w:jc w:val="center"/>
-              <w:rPr>
-                <w:sz w:val="18"/>
-                <w:szCs w:val="18"/>
-              </w:rPr>
-            </w:pPr>
-            <w:r>
-              <w:rPr>
-                <w:rFonts w:ascii="Sylfaen" w:eastAsia="Sylfaen" w:hAnsi="Sylfaen" w:cs="Sylfaen"/>
-                <w:sz w:val="18"/>
-                <w:szCs w:val="18"/>
-                <w:lang w:val="hy-AM" w:bidi="hy-AM"/>
-              </w:rPr>
-              <w:t>ՍՊԱ</w:t>
-            </w:r>
-          </w:p>
-        </w:tc>
-        <w:tc>
-          <w:tcPr>
-            <w:tcW w:w="630" w:type="dxa"/>
-            <w:vAlign w:val="center"/>
-          </w:tcPr>
-          <w:p>
-            <w:pPr>
-              <w:spacing w:after="0" w:line="240" w:lineRule="exact"/>
-              <w:jc w:val="center"/>
-              <w:rPr>
-                <w:sz w:val="18"/>
-                <w:szCs w:val="18"/>
-              </w:rPr>
-            </w:pPr>
-            <w:r>
-              <w:rPr>
-                <w:rFonts w:ascii="Sylfaen" w:eastAsia="Sylfaen" w:hAnsi="Sylfaen" w:cs="Sylfaen"/>
-                <w:sz w:val="18"/>
-                <w:szCs w:val="18"/>
-                <w:lang w:val="hy-AM" w:bidi="hy-AM"/>
-              </w:rPr>
-              <w:t>ՊԱՅՄ</w:t>
-            </w:r>
-          </w:p>
-        </w:tc>
-        <w:tc>
-          <w:tcPr>
-            <w:tcW w:w="630" w:type="dxa"/>
-            <w:vAlign w:val="center"/>
-          </w:tcPr>
-          <w:p>
-            <w:pPr>
-              <w:spacing w:after="0" w:line="240" w:lineRule="exact"/>
-              <w:jc w:val="center"/>
-              <w:rPr>
-                <w:sz w:val="18"/>
-                <w:szCs w:val="18"/>
-              </w:rPr>
-            </w:pPr>
-            <w:r>
-              <w:rPr>
-                <w:rFonts w:ascii="Sylfaen" w:eastAsia="Sylfaen" w:hAnsi="Sylfaen" w:cs="Sylfaen"/>
-                <w:sz w:val="18"/>
-                <w:szCs w:val="18"/>
-                <w:lang w:val="hy-AM" w:bidi="hy-AM"/>
-              </w:rPr>
-              <w:t>Ա</w:t>
-            </w:r>
-            <w:r>
-              <w:rPr>
-                <w:rFonts w:ascii="Sylfaen" w:eastAsia="Sylfaen" w:hAnsi="Sylfaen" w:cs="Sylfaen"/>
-                <w:sz w:val="18"/>
-                <w:szCs w:val="18"/>
-                <w:lang w:val="hy-AM" w:bidi="hy-AM"/>
-              </w:rPr>
-              <w:t>-</w:t>
-            </w:r>
-            <w:r>
-              <w:rPr>
-                <w:rFonts w:ascii="Sylfaen" w:eastAsia="Sylfaen" w:hAnsi="Sylfaen" w:cs="Sylfaen"/>
-                <w:sz w:val="18"/>
-                <w:szCs w:val="18"/>
-                <w:lang w:val="hy-AM" w:bidi="hy-AM"/>
-              </w:rPr>
-              <w:t>Հ</w:t>
-            </w:r>
-          </w:p>
-        </w:tc>
-        <w:tc>
-          <w:tcPr>
-            <w:tcW w:w="630" w:type="dxa"/>
-            <w:vMerge/>
-            <w:vAlign w:val="center"/>
-          </w:tcPr>
-          <w:p>
-            <w:pPr>
-              <w:spacing w:after="0" w:line="240" w:lineRule="exact"/>
-              <w:jc w:val="center"/>
-              <w:rPr>
-                <w:sz w:val="18"/>
-                <w:szCs w:val="18"/>
-              </w:rPr>
-            </w:pPr>
-          </w:p>
-        </w:tc>
-        <w:tc>
-          <w:tcPr>
-            <w:tcW w:w="630" w:type="dxa"/>
-            <w:vMerge/>
-            <w:vAlign w:val="center"/>
-          </w:tcPr>
-          <w:p>
-            <w:pPr>
-              <w:spacing w:after="0" w:line="240" w:lineRule="exact"/>
-              <w:jc w:val="center"/>
-              <w:rPr>
-                <w:sz w:val="18"/>
-                <w:szCs w:val="18"/>
-              </w:rPr>
-            </w:pPr>
-          </w:p>
-        </w:tc>
-        <w:tc>
-          <w:tcPr>
-            <w:tcW w:w="630" w:type="dxa"/>
-            <w:vMerge/>
-            <w:vAlign w:val="center"/>
-          </w:tcPr>
-          <w:p>
-            <w:pPr>
-              <w:spacing w:after="0" w:line="240" w:lineRule="exact"/>
-              <w:jc w:val="center"/>
-              <w:rPr>
-                <w:sz w:val="18"/>
-                <w:szCs w:val="18"/>
-              </w:rPr>
-            </w:pPr>
-          </w:p>
-        </w:tc>
-        <w:tc>
-          <w:tcPr>
-            <w:tcW w:w="630" w:type="dxa"/>
-            <w:vMerge/>
-            <w:vAlign w:val="center"/>
-          </w:tcPr>
-          <w:p>
-            <w:pPr>
-              <w:spacing w:after="0" w:line="240" w:lineRule="exact"/>
-              <w:jc w:val="center"/>
-              <w:rPr>
-                <w:sz w:val="18"/>
-                <w:szCs w:val="18"/>
-              </w:rPr>
-            </w:pPr>
-          </w:p>
-        </w:tc>
-        <w:tc>
-          <w:tcPr>
-            <w:tcW w:w="630" w:type="dxa"/>
-            <w:vMerge/>
-            <w:vAlign w:val="center"/>
-          </w:tcPr>
-          <w:p>
-            <w:pPr>
-              <w:spacing w:after="0" w:line="240" w:lineRule="exact"/>
-              <w:jc w:val="center"/>
-              <w:rPr>
-                <w:sz w:val="18"/>
-                <w:szCs w:val="18"/>
-              </w:rPr>
-            </w:pPr>
-          </w:p>
-        </w:tc>
-        <w:tc>
-          <w:tcPr>
-            <w:tcW w:w="630" w:type="dxa"/>
-            <w:vMerge/>
-            <w:vAlign w:val="center"/>
-          </w:tcPr>
-          <w:p>
-            <w:pPr>
-              <w:spacing w:after="0" w:line="240" w:lineRule="exact"/>
-              <w:jc w:val="center"/>
-              <w:rPr>
-                <w:sz w:val="18"/>
-                <w:szCs w:val="18"/>
-              </w:rPr>
-            </w:pPr>
-          </w:p>
-        </w:tc>
-        <w:tc>
-          <w:tcPr>
-            <w:tcW w:w="630" w:type="dxa"/>
-            <w:vMerge/>
-            <w:vAlign w:val="center"/>
-          </w:tcPr>
-          <w:p>
-            <w:pPr>
-              <w:spacing w:after="0" w:line="240" w:lineRule="exact"/>
-              <w:jc w:val="center"/>
-              <w:rPr>
-                <w:sz w:val="18"/>
-                <w:szCs w:val="18"/>
-              </w:rPr>
-            </w:pPr>
-          </w:p>
-        </w:tc>
-        <w:tc>
-          <w:tcPr>
-            <w:tcW w:w="630" w:type="dxa"/>
-            <w:vMerge/>
+            <w:vAlign w:val="center"/>
+          </w:tcPr>
+          <w:p>
+            <w:pPr>
+              <w:spacing w:after="0" w:line="240" w:lineRule="exact"/>
+              <w:jc w:val="center"/>
+              <w:rPr>
+                <w:sz w:val="18"/>
+                <w:szCs w:val="18"/>
+              </w:rPr>
+            </w:pPr>
+          </w:p>
+        </w:tc>
+        <w:tc>
+          <w:tcPr>
+            <w:tcW w:w="630" w:type="dxa"/>
+            <w:vAlign w:val="center"/>
+          </w:tcPr>
+          <w:p>
+            <w:pPr>
+              <w:spacing w:after="0" w:line="240" w:lineRule="exact"/>
+              <w:jc w:val="center"/>
+              <w:rPr>
+                <w:sz w:val="18"/>
+                <w:szCs w:val="18"/>
+              </w:rPr>
+            </w:pPr>
+          </w:p>
+        </w:tc>
+        <w:tc>
+          <w:tcPr>
+            <w:tcW w:w="630" w:type="dxa"/>
             <w:vAlign w:val="center"/>
           </w:tcPr>
           <w:p>
@@ -1757,31 +1656,6 @@
                 <w:szCs w:val="18"/>
                 <w:lang w:val="hy-AM" w:bidi="hy-AM"/>
               </w:rPr>
-              <w:t>16</w:t>
-            </w:r>
-          </w:p>
-        </w:tc>
-        <w:tc>
-          <w:tcPr>
-            <w:tcW w:w="630" w:type="dxa"/>
-            <w:vAlign w:val="center"/>
-          </w:tcPr>
-          <w:p>
-            <w:pPr>
-              <w:spacing w:after="0" w:line="240" w:lineRule="exact"/>
-              <w:jc w:val="center"/>
-              <w:rPr>
-                <w:sz w:val="18"/>
-                <w:szCs w:val="18"/>
-              </w:rPr>
-            </w:pPr>
-            <w:r>
-              <w:rPr>
-                <w:rFonts w:ascii="Sylfaen" w:eastAsia="Sylfaen" w:hAnsi="Sylfaen" w:cs="Sylfaen"/>
-                <w:sz w:val="18"/>
-                <w:szCs w:val="18"/>
-                <w:lang w:val="hy-AM" w:bidi="hy-AM"/>
-              </w:rPr>
               <w:t>17</w:t>
             </w:r>
           </w:p>
@@ -1967,22 +1841,6 @@
           <w:trHeight w:hRule="exact" w:val="868"/>
           <w:jc w:val="center"/>
         </w:trPr>
-        <w:tc>
-          <w:tcPr>
-            <w:tcW w:w="630" w:type="dxa"/>
-            <w:vAlign w:val="center"/>
-          </w:tcPr>
-          <w:p>
-            <w:pPr>
-              <w:spacing w:after="0" w:line="240" w:lineRule="exact"/>
-              <w:jc w:val="center"/>
-              <w:rPr>
-                <w:sz w:val="18"/>
-                <w:szCs w:val="18"/>
-              </w:rPr>
-            </w:pPr>
-          </w:p>
-        </w:tc>
         <w:tc>
           <w:tcPr>
             <w:tcW w:w="630" w:type="dxa"/>
@@ -3063,14 +2921,67 @@
           <w:szCs w:val="28"/>
         </w:rPr>
       </w:pPr>
+      <w:r>
+        <w:rPr>
+          <w:noProof/>
+          <w:sz w:val="28"/>
+          <w:szCs w:val="28"/>
+        </w:rPr>
+        <w:pict w14:anchorId="418843CD">
+          <v:shapetype id="_x0000_t202" coordsize="21600,21600" o:spt="202" path="m,l,21600r21600,l21600,xe">
+            <v:stroke joinstyle="miter"/>
+            <v:path gradientshapeok="t" o:connecttype="rect"/>
+          </v:shapetype>
+          <v:shape id="_x0000_s2086" type="#_x0000_t202" alt="sarsh-doc-meta" style="position:absolute;margin-left:225pt;margin-top:552pt;width:392pt;height:16pt;z-index:251659264;mso-position-horizontal-relative:page;mso-position-vertical-relative:page" filled="f" stroked="f">
+            <v:textbox inset="0,0,0,0">
+              <w:txbxContent>
+                <w:p>
+                  <w:pPr>
+                    <w:jc w:val="center"/>
+                    <w:rPr>
+                      <w:rFonts w:ascii="Arial Armenian" w:hAnsi="Arial Armenian"/>
+                      <w:sz w:val="18"/>
+                    </w:rPr>
+                  </w:pPr>
+                  <w:r>
+                    <w:rPr>
+                      <w:rFonts w:ascii="Arial Armenian" w:hAnsi="Arial Armenian" w:cs="Sylfaen"/>
+                      <w:sz w:val="18"/>
+                    </w:rPr>
+                    <w:t>Ամսաթիվ</w:t>
+                  </w:r>
+                  <w:r>
+                    <w:rPr>
+                      <w:rFonts w:ascii="Arial Armenian" w:hAnsi="Arial Armenian"/>
+                      <w:sz w:val="18"/>
+                    </w:rPr>
+                    <w:t xml:space="preserve"> ____________________        </w:t>
+                  </w:r>
+                  <w:r>
+                    <w:rPr>
+                      <w:rFonts w:ascii="Arial Armenian" w:hAnsi="Arial Armenian" w:cs="Sylfaen"/>
+                      <w:sz w:val="18"/>
+                    </w:rPr>
+                    <w:t>Հերթապահ</w:t>
+                  </w:r>
+                  <w:r>
+                    <w:rPr>
+                      <w:rFonts w:ascii="Arial Armenian" w:hAnsi="Arial Armenian"/>
+                      <w:sz w:val="18"/>
+                    </w:rPr>
+                    <w:t xml:space="preserve"> ____________________</w:t>
+                  </w:r>
+                </w:p>
+              </w:txbxContent>
+            </v:textbox>
+            <w10:wrap anchorx="page" anchory="page"/>
+            <w10:anchorlock/>
+          </v:shape>
+        </w:pict>
+      </w:r>
     </w:p>
     <w:sectPr>
-      <w:headerReference w:type="even" r:id="rId6"/>
-      <w:headerReference w:type="default" r:id="rId7"/>
-      <w:footerReference w:type="even" r:id="rId8"/>
-      <w:footerReference w:type="default" r:id="rId9"/>
-      <w:headerReference w:type="first" r:id="rId10"/>
-      <w:footerReference w:type="first" r:id="rId11"/>
+      <w:headerReference w:type="default" r:id="rId6"/>
       <w:pgSz w:w="16838" w:h="11906" w:orient="landscape"/>
       <w:pgMar w:top="1800" w:right="540" w:bottom="360" w:left="540" w:header="240" w:footer="240" w:gutter="0"/>
       <w:cols w:space="720"/>
@@ -3105,36 +3016,6 @@
 </w:endnotes>
 </file>
 
-<file path=word/footer1.xml><?xml version="1.0" encoding="utf-8"?>
-<w:ftr xmlns:wpc="http://schemas.microsoft.com/office/word/2010/wordprocessingCanvas" xmlns:cx="http://schemas.microsoft.com/office/drawing/2014/chartex" xmlns:cx1="http://schemas.microsoft.com/office/drawing/2015/9/8/chartex" xmlns:cx2="http://schemas.microsoft.com/office/drawing/2015/10/21/chartex" xmlns:cx3="http://schemas.microsoft.com/office/drawing/2016/5/9/chartex" xmlns:cx4="http://schemas.microsoft.com/office/drawing/2016/5/10/chartex" xmlns:cx5="http://schemas.microsoft.com/office/drawing/2016/5/11/chartex" xmlns:cx6="http://schemas.microsoft.com/office/drawing/2016/5/12/chartex" xmlns:cx7="http://schemas.microsoft.com/office/drawing/2016/5/13/chartex" xmlns:cx8="http://schemas.microsoft.com/office/drawing/2016/5/14/chartex" xmlns:mc="http://schemas.openxmlformats.org/markup-compatibility/2006" xmlns:aink="http://schemas.microsoft.com/office/drawing/2016/ink" xmlns:am3d="http://schemas.microsoft.com/office/drawing/2017/model3d" xmlns:o="urn:schemas-microsoft-com:office:office" xmlns:oel="http://schemas.microsoft.com/office/2019/extlst" xmlns:r="http://schemas.openxmlformats.org/officeDocument/2006/relationships" xmlns:m="http://schemas.openxmlformats.org/officeDocument/2006/math" xmlns:v="urn:schemas-microsoft-com:vml" xmlns:wp14="http://schemas.microsoft.com/office/word/2010/wordprocessingDrawing" xmlns:wp="http://schemas.openxmlformats.org/drawingml/2006/wordprocessingDrawing" xmlns:w10="urn:schemas-microsoft-com:office:word" xmlns:w="http://schemas.openxmlformats.org/wordprocessingml/2006/main" xmlns:w14="http://schemas.microsoft.com/office/word/2010/wordml" xmlns:w15="http://schemas.microsoft.com/office/word/2012/wordml" xmlns:w16cex="http://schemas.microsoft.com/office/word/2018/wordml/cex" xmlns:w16cid="http://schemas.microsoft.com/office/word/2016/wordml/cid" xmlns:w16="http://schemas.microsoft.com/office/word/2018/wordml" xmlns:w16du="http://schemas.microsoft.com/office/word/2023/wordml/word16du" xmlns:w16sdtdh="http://schemas.microsoft.com/office/word/2020/wordml/sdtdatahash" xmlns:w16sdtfl="http://schemas.microsoft.com/office/word/2024/wordml/sdtformatlock" xmlns:w16se="http://schemas.microsoft.com/office/word/2015/wordml/symex" xmlns:wpg="http://schemas.microsoft.com/office/word/2010/wordprocessingGroup" xmlns:wpi="http://schemas.microsoft.com/office/word/2010/wordprocessingInk" xmlns:wne="http://schemas.microsoft.com/office/word/2006/wordml" xmlns:wps="http://schemas.microsoft.com/office/word/2010/wordprocessingShape" mc:Ignorable="w14 w15 w16se w16cid w16 w16cex w16sdtdh w16sdtfl w16du wp14">
-  <w:p>
-    <w:pPr>
-      <w:pStyle w:val="a5"/>
-    </w:pPr>
-  </w:p>
-</w:ftr>
-</file>
-
-<file path=word/footer2.xml><?xml version="1.0" encoding="utf-8"?>
-<w:ftr xmlns:wpc="http://schemas.microsoft.com/office/word/2010/wordprocessingCanvas" xmlns:cx="http://schemas.microsoft.com/office/drawing/2014/chartex" xmlns:cx1="http://schemas.microsoft.com/office/drawing/2015/9/8/chartex" xmlns:cx2="http://schemas.microsoft.com/office/drawing/2015/10/21/chartex" xmlns:cx3="http://schemas.microsoft.com/office/drawing/2016/5/9/chartex" xmlns:cx4="http://schemas.microsoft.com/office/drawing/2016/5/10/chartex" xmlns:cx5="http://schemas.microsoft.com/office/drawing/2016/5/11/chartex" xmlns:cx6="http://schemas.microsoft.com/office/drawing/2016/5/12/chartex" xmlns:cx7="http://schemas.microsoft.com/office/drawing/2016/5/13/chartex" xmlns:cx8="http://schemas.microsoft.com/office/drawing/2016/5/14/chartex" xmlns:mc="http://schemas.openxmlformats.org/markup-compatibility/2006" xmlns:aink="http://schemas.microsoft.com/office/drawing/2016/ink" xmlns:am3d="http://schemas.microsoft.com/office/drawing/2017/model3d" xmlns:o="urn:schemas-microsoft-com:office:office" xmlns:oel="http://schemas.microsoft.com/office/2019/extlst" xmlns:r="http://schemas.openxmlformats.org/officeDocument/2006/relationships" xmlns:m="http://schemas.openxmlformats.org/officeDocument/2006/math" xmlns:v="urn:schemas-microsoft-com:vml" xmlns:wp14="http://schemas.microsoft.com/office/word/2010/wordprocessingDrawing" xmlns:wp="http://schemas.openxmlformats.org/drawingml/2006/wordprocessingDrawing" xmlns:w10="urn:schemas-microsoft-com:office:word" xmlns:w="http://schemas.openxmlformats.org/wordprocessingml/2006/main" xmlns:w14="http://schemas.microsoft.com/office/word/2010/wordml" xmlns:w15="http://schemas.microsoft.com/office/word/2012/wordml" xmlns:w16cex="http://schemas.microsoft.com/office/word/2018/wordml/cex" xmlns:w16cid="http://schemas.microsoft.com/office/word/2016/wordml/cid" xmlns:w16="http://schemas.microsoft.com/office/word/2018/wordml" xmlns:w16du="http://schemas.microsoft.com/office/word/2023/wordml/word16du" xmlns:w16sdtdh="http://schemas.microsoft.com/office/word/2020/wordml/sdtdatahash" xmlns:w16sdtfl="http://schemas.microsoft.com/office/word/2024/wordml/sdtformatlock" xmlns:w16se="http://schemas.microsoft.com/office/word/2015/wordml/symex" xmlns:wpg="http://schemas.microsoft.com/office/word/2010/wordprocessingGroup" xmlns:wpi="http://schemas.microsoft.com/office/word/2010/wordprocessingInk" xmlns:wne="http://schemas.microsoft.com/office/word/2006/wordml" xmlns:wps="http://schemas.microsoft.com/office/word/2010/wordprocessingShape" mc:Ignorable="w14 w15 w16se w16cid w16 w16cex w16sdtdh w16sdtfl w16du wp14">
-  <w:p>
-    <w:pPr>
-      <w:pStyle w:val="a5"/>
-    </w:pPr>
-  </w:p>
-</w:ftr>
-</file>
-
-<file path=word/footer3.xml><?xml version="1.0" encoding="utf-8"?>
-<w:ftr xmlns:wpc="http://schemas.microsoft.com/office/word/2010/wordprocessingCanvas" xmlns:cx="http://schemas.microsoft.com/office/drawing/2014/chartex" xmlns:cx1="http://schemas.microsoft.com/office/drawing/2015/9/8/chartex" xmlns:cx2="http://schemas.microsoft.com/office/drawing/2015/10/21/chartex" xmlns:cx3="http://schemas.microsoft.com/office/drawing/2016/5/9/chartex" xmlns:cx4="http://schemas.microsoft.com/office/drawing/2016/5/10/chartex" xmlns:cx5="http://schemas.microsoft.com/office/drawing/2016/5/11/chartex" xmlns:cx6="http://schemas.microsoft.com/office/drawing/2016/5/12/chartex" xmlns:cx7="http://schemas.microsoft.com/office/drawing/2016/5/13/chartex" xmlns:cx8="http://schemas.microsoft.com/office/drawing/2016/5/14/chartex" xmlns:mc="http://schemas.openxmlformats.org/markup-compatibility/2006" xmlns:aink="http://schemas.microsoft.com/office/drawing/2016/ink" xmlns:am3d="http://schemas.microsoft.com/office/drawing/2017/model3d" xmlns:o="urn:schemas-microsoft-com:office:office" xmlns:oel="http://schemas.microsoft.com/office/2019/extlst" xmlns:r="http://schemas.openxmlformats.org/officeDocument/2006/relationships" xmlns:m="http://schemas.openxmlformats.org/officeDocument/2006/math" xmlns:v="urn:schemas-microsoft-com:vml" xmlns:wp14="http://schemas.microsoft.com/office/word/2010/wordprocessingDrawing" xmlns:wp="http://schemas.openxmlformats.org/drawingml/2006/wordprocessingDrawing" xmlns:w10="urn:schemas-microsoft-com:office:word" xmlns:w="http://schemas.openxmlformats.org/wordprocessingml/2006/main" xmlns:w14="http://schemas.microsoft.com/office/word/2010/wordml" xmlns:w15="http://schemas.microsoft.com/office/word/2012/wordml" xmlns:w16cex="http://schemas.microsoft.com/office/word/2018/wordml/cex" xmlns:w16cid="http://schemas.microsoft.com/office/word/2016/wordml/cid" xmlns:w16="http://schemas.microsoft.com/office/word/2018/wordml" xmlns:w16du="http://schemas.microsoft.com/office/word/2023/wordml/word16du" xmlns:w16sdtdh="http://schemas.microsoft.com/office/word/2020/wordml/sdtdatahash" xmlns:w16sdtfl="http://schemas.microsoft.com/office/word/2024/wordml/sdtformatlock" xmlns:w16se="http://schemas.microsoft.com/office/word/2015/wordml/symex" xmlns:wpg="http://schemas.microsoft.com/office/word/2010/wordprocessingGroup" xmlns:wpi="http://schemas.microsoft.com/office/word/2010/wordprocessingInk" xmlns:wne="http://schemas.microsoft.com/office/word/2006/wordml" xmlns:wps="http://schemas.microsoft.com/office/word/2010/wordprocessingShape" mc:Ignorable="w14 w15 w16se w16cid w16 w16cex w16sdtdh w16sdtfl w16du wp14">
-  <w:p>
-    <w:pPr>
-      <w:pStyle w:val="a5"/>
-    </w:pPr>
-  </w:p>
-</w:ftr>
-</file>
-
 <file path=word/footnotes.xml><?xml version="1.0" encoding="utf-8"?>
 <w:footnotes xmlns:wpc="http://schemas.microsoft.com/office/word/2010/wordprocessingCanvas" xmlns:cx="http://schemas.microsoft.com/office/drawing/2014/chartex" xmlns:cx1="http://schemas.microsoft.com/office/drawing/2015/9/8/chartex" xmlns:cx2="http://schemas.microsoft.com/office/drawing/2015/10/21/chartex" xmlns:cx3="http://schemas.microsoft.com/office/drawing/2016/5/9/chartex" xmlns:cx4="http://schemas.microsoft.com/office/drawing/2016/5/10/chartex" xmlns:cx5="http://schemas.microsoft.com/office/drawing/2016/5/11/chartex" xmlns:cx6="http://schemas.microsoft.com/office/drawing/2016/5/12/chartex" xmlns:cx7="http://schemas.microsoft.com/office/drawing/2016/5/13/chartex" xmlns:cx8="http://schemas.microsoft.com/office/drawing/2016/5/14/chartex" xmlns:mc="http://schemas.openxmlformats.org/markup-compatibility/2006" xmlns:aink="http://schemas.microsoft.com/office/drawing/2016/ink" xmlns:am3d="http://schemas.microsoft.com/office/drawing/2017/model3d" xmlns:o="urn:schemas-microsoft-com:office:office" xmlns:oel="http://schemas.microsoft.com/office/2019/extlst" xmlns:r="http://schemas.openxmlformats.org/officeDocument/2006/relationships" xmlns:m="http://schemas.openxmlformats.org/officeDocument/2006/math" xmlns:v="urn:schemas-microsoft-com:vml" xmlns:wp14="http://schemas.microsoft.com/office/word/2010/wordprocessingDrawing" xmlns:wp="http://schemas.openxmlformats.org/drawingml/2006/wordprocessingDrawing" xmlns:w10="urn:schemas-microsoft-com:office:word" xmlns:w="http://schemas.openxmlformats.org/wordprocessingml/2006/main" xmlns:w14="http://schemas.microsoft.com/office/word/2010/wordml" xmlns:w15="http://schemas.microsoft.com/office/word/2012/wordml" xmlns:w16cex="http://schemas.microsoft.com/office/word/2018/wordml/cex" xmlns:w16cid="http://schemas.microsoft.com/office/word/2016/wordml/cid" xmlns:w16="http://schemas.microsoft.com/office/word/2018/wordml" xmlns:w16du="http://schemas.microsoft.com/office/word/2023/wordml/word16du" xmlns:w16sdtdh="http://schemas.microsoft.com/office/word/2020/wordml/sdtdatahash" xmlns:w16sdtfl="http://schemas.microsoft.com/office/word/2024/wordml/sdtformatlock" xmlns:w16se="http://schemas.microsoft.com/office/word/2015/wordml/symex" xmlns:wpg="http://schemas.microsoft.com/office/word/2010/wordprocessingGroup" xmlns:wpi="http://schemas.microsoft.com/office/word/2010/wordprocessingInk" xmlns:wne="http://schemas.microsoft.com/office/word/2006/wordml" xmlns:wps="http://schemas.microsoft.com/office/word/2010/wordprocessingShape" mc:Ignorable="w14 w15 w16se w16cid w16 w16cex w16sdtdh w16sdtfl w16du wp14">
   <w:footnote w:type="separator" w:id="-1">
@@ -3165,72 +3046,89 @@
   <w:p>
     <w:pPr>
       <w:pStyle w:val="a3"/>
-    </w:pPr>
-  </w:p>
-</w:hdr>
-</file>
-
-<file path=word/header2.xml><?xml version="1.0" encoding="utf-8"?>
-<w:hdr xmlns:wpc="http://schemas.microsoft.com/office/word/2010/wordprocessingCanvas" xmlns:cx="http://schemas.microsoft.com/office/drawing/2014/chartex" xmlns:cx1="http://schemas.microsoft.com/office/drawing/2015/9/8/chartex" xmlns:cx2="http://schemas.microsoft.com/office/drawing/2015/10/21/chartex" xmlns:cx3="http://schemas.microsoft.com/office/drawing/2016/5/9/chartex" xmlns:cx4="http://schemas.microsoft.com/office/drawing/2016/5/10/chartex" xmlns:cx5="http://schemas.microsoft.com/office/drawing/2016/5/11/chartex" xmlns:cx6="http://schemas.microsoft.com/office/drawing/2016/5/12/chartex" xmlns:cx7="http://schemas.microsoft.com/office/drawing/2016/5/13/chartex" xmlns:cx8="http://schemas.microsoft.com/office/drawing/2016/5/14/chartex" xmlns:mc="http://schemas.openxmlformats.org/markup-compatibility/2006" xmlns:aink="http://schemas.microsoft.com/office/drawing/2016/ink" xmlns:am3d="http://schemas.microsoft.com/office/drawing/2017/model3d" xmlns:o="urn:schemas-microsoft-com:office:office" xmlns:oel="http://schemas.microsoft.com/office/2019/extlst" xmlns:r="http://schemas.openxmlformats.org/officeDocument/2006/relationships" xmlns:m="http://schemas.openxmlformats.org/officeDocument/2006/math" xmlns:v="urn:schemas-microsoft-com:vml" xmlns:wp14="http://schemas.microsoft.com/office/word/2010/wordprocessingDrawing" xmlns:wp="http://schemas.openxmlformats.org/drawingml/2006/wordprocessingDrawing" xmlns:w10="urn:schemas-microsoft-com:office:word" xmlns:w="http://schemas.openxmlformats.org/wordprocessingml/2006/main" xmlns:w14="http://schemas.microsoft.com/office/word/2010/wordml" xmlns:w15="http://schemas.microsoft.com/office/word/2012/wordml" xmlns:w16cex="http://schemas.microsoft.com/office/word/2018/wordml/cex" xmlns:w16cid="http://schemas.microsoft.com/office/word/2016/wordml/cid" xmlns:w16="http://schemas.microsoft.com/office/word/2018/wordml" xmlns:w16du="http://schemas.microsoft.com/office/word/2023/wordml/word16du" xmlns:w16sdtdh="http://schemas.microsoft.com/office/word/2020/wordml/sdtdatahash" xmlns:w16sdtfl="http://schemas.microsoft.com/office/word/2024/wordml/sdtformatlock" xmlns:w16se="http://schemas.microsoft.com/office/word/2015/wordml/symex" xmlns:wpg="http://schemas.microsoft.com/office/word/2010/wordprocessingGroup" xmlns:wpi="http://schemas.microsoft.com/office/word/2010/wordprocessingInk" xmlns:wne="http://schemas.microsoft.com/office/word/2006/wordml" xmlns:wps="http://schemas.microsoft.com/office/word/2010/wordprocessingShape" mc:Ignorable="w14 w15 w16se w16cid w16 w16cex w16sdtdh w16sdtfl w16du wp14">
-  <w:p>
-    <w:pPr>
-      <w:pStyle w:val="a3"/>
       <w:jc w:val="right"/>
     </w:pPr>
     <w:r>
       <w:rPr>
         <w:noProof/>
       </w:rPr>
-      <w:drawing>
-        <wp:inline distT="0" distB="0" distL="0" distR="0" wp14:anchorId="13C87ED1" wp14:editId="078A64E8">
-          <wp:extent cx="787505" cy="787505"/>
-          <wp:effectExtent l="0" t="0" r="0" b="0"/>
-          <wp:docPr id="1025236339" name="Рисунок 1" descr="SARSH_KKZH_QR"/>
-          <wp:cNvGraphicFramePr/>
-          <a:graphic xmlns:a="http://schemas.openxmlformats.org/drawingml/2006/main">
-            <a:graphicData uri="http://schemas.openxmlformats.org/drawingml/2006/picture">
-              <pic:pic xmlns:pic="http://schemas.openxmlformats.org/drawingml/2006/picture">
-                <pic:nvPicPr>
-                  <pic:cNvPr id="1025236339" name="Рисунок 1" descr="SARSH_KKZH_QR"/>
-                  <pic:cNvPicPr/>
-                </pic:nvPicPr>
-                <pic:blipFill>
-                  <a:blip r:embed="rId1">
-                    <a:extLst>
-                      <a:ext uri="{28A0092B-C50C-407E-A947-70E740481C1C}">
-                        <a14:useLocalDpi xmlns:a14="http://schemas.microsoft.com/office/drawing/2010/main" val="0"/>
-                      </a:ext>
-                    </a:extLst>
-                  </a:blip>
-                  <a:stretch>
-                    <a:fillRect/>
-                  </a:stretch>
-                </pic:blipFill>
-                <pic:spPr>
-                  <a:xfrm>
-                    <a:off x="0" y="0"/>
-                    <a:ext cx="787505" cy="787505"/>
-                  </a:xfrm>
-                  <a:prstGeom prst="rect">
-                    <a:avLst/>
-                  </a:prstGeom>
-                </pic:spPr>
-              </pic:pic>
-            </a:graphicData>
-          </a:graphic>
-        </wp:inline>
-      </w:drawing>
+      <w:pict w14:anchorId="4FC5C947">
+        <v:rect id="_x0000_s1034" alt="sarsh-corner-mark" style="position:absolute;left:0;text-align:left;margin-left:795.2pt;margin-top:215.3pt;width:8pt;height:8pt;z-index:251662336;mso-position-horizontal:absolute;mso-position-horizontal-relative:page;mso-position-vertical:absolute;mso-position-vertical-relative:page" fillcolor="black" stroked="f">
+          <w10:wrap anchorx="page" anchory="page"/>
+          <w10:anchorlock/>
+        </v:rect>
+      </w:pict>
     </w:r>
-  </w:p>
-</w:hdr>
-</file>
-
-<file path=word/header3.xml><?xml version="1.0" encoding="utf-8"?>
-<w:hdr xmlns:wpc="http://schemas.microsoft.com/office/word/2010/wordprocessingCanvas" xmlns:cx="http://schemas.microsoft.com/office/drawing/2014/chartex" xmlns:cx1="http://schemas.microsoft.com/office/drawing/2015/9/8/chartex" xmlns:cx2="http://schemas.microsoft.com/office/drawing/2015/10/21/chartex" xmlns:cx3="http://schemas.microsoft.com/office/drawing/2016/5/9/chartex" xmlns:cx4="http://schemas.microsoft.com/office/drawing/2016/5/10/chartex" xmlns:cx5="http://schemas.microsoft.com/office/drawing/2016/5/11/chartex" xmlns:cx6="http://schemas.microsoft.com/office/drawing/2016/5/12/chartex" xmlns:cx7="http://schemas.microsoft.com/office/drawing/2016/5/13/chartex" xmlns:cx8="http://schemas.microsoft.com/office/drawing/2016/5/14/chartex" xmlns:mc="http://schemas.openxmlformats.org/markup-compatibility/2006" xmlns:aink="http://schemas.microsoft.com/office/drawing/2016/ink" xmlns:am3d="http://schemas.microsoft.com/office/drawing/2017/model3d" xmlns:o="urn:schemas-microsoft-com:office:office" xmlns:oel="http://schemas.microsoft.com/office/2019/extlst" xmlns:r="http://schemas.openxmlformats.org/officeDocument/2006/relationships" xmlns:m="http://schemas.openxmlformats.org/officeDocument/2006/math" xmlns:v="urn:schemas-microsoft-com:vml" xmlns:wp14="http://schemas.microsoft.com/office/word/2010/wordprocessingDrawing" xmlns:wp="http://schemas.openxmlformats.org/drawingml/2006/wordprocessingDrawing" xmlns:w10="urn:schemas-microsoft-com:office:word" xmlns:w="http://schemas.openxmlformats.org/wordprocessingml/2006/main" xmlns:w14="http://schemas.microsoft.com/office/word/2010/wordml" xmlns:w15="http://schemas.microsoft.com/office/word/2012/wordml" xmlns:w16cex="http://schemas.microsoft.com/office/word/2018/wordml/cex" xmlns:w16cid="http://schemas.microsoft.com/office/word/2016/wordml/cid" xmlns:w16="http://schemas.microsoft.com/office/word/2018/wordml" xmlns:w16du="http://schemas.microsoft.com/office/word/2023/wordml/word16du" xmlns:w16sdtdh="http://schemas.microsoft.com/office/word/2020/wordml/sdtdatahash" xmlns:w16sdtfl="http://schemas.microsoft.com/office/word/2024/wordml/sdtformatlock" xmlns:w16se="http://schemas.microsoft.com/office/word/2015/wordml/symex" xmlns:wpg="http://schemas.microsoft.com/office/word/2010/wordprocessingGroup" xmlns:wpi="http://schemas.microsoft.com/office/word/2010/wordprocessingInk" xmlns:wne="http://schemas.microsoft.com/office/word/2006/wordml" xmlns:wps="http://schemas.microsoft.com/office/word/2010/wordprocessingShape" mc:Ignorable="w14 w15 w16se w16cid w16 w16cex w16sdtdh w16sdtfl w16du wp14">
-  <w:p>
-    <w:pPr>
-      <w:pStyle w:val="a3"/>
-    </w:pPr>
+    <w:r>
+      <w:rPr>
+        <w:noProof/>
+      </w:rPr>
+      <w:pict w14:anchorId="39EA6D58">
+        <v:rect id="_x0000_s1033" alt="sarsh-corner-mark" style="position:absolute;left:0;text-align:left;margin-left:39.2pt;margin-top:215.3pt;width:8pt;height:8pt;z-index:251661312;mso-position-horizontal:absolute;mso-position-horizontal-relative:page;mso-position-vertical:absolute;mso-position-vertical-relative:page" fillcolor="black" stroked="f">
+          <w10:wrap anchorx="page" anchory="page"/>
+          <w10:anchorlock/>
+        </v:rect>
+      </w:pict>
+    </w:r>
+    <w:r>
+      <w:rPr>
+        <w:noProof/>
+      </w:rPr>
+      <w:pict w14:anchorId="647F30F5">
+        <v:rect id="_x0000_s1032" alt="sarsh-corner-mark" style="position:absolute;left:0;text-align:left;margin-left:795.2pt;margin-top:96.55pt;width:8pt;height:8pt;z-index:251660288;mso-position-horizontal:absolute;mso-position-horizontal-relative:page;mso-position-vertical:absolute;mso-position-vertical-relative:page" fillcolor="black" stroked="f">
+          <w10:wrap anchorx="page" anchory="page"/>
+          <w10:anchorlock/>
+        </v:rect>
+      </w:pict>
+    </w:r>
+    <w:r>
+      <w:rPr>
+        <w:noProof/>
+      </w:rPr>
+      <w:pict w14:anchorId="3BC7B9A7">
+        <v:rect id="_x0000_s1031" alt="sarsh-corner-mark" style="position:absolute;left:0;text-align:left;margin-left:39.2pt;margin-top:96.55pt;width:8pt;height:8pt;z-index:251659264;mso-position-horizontal:absolute;mso-position-horizontal-relative:page;mso-position-vertical:absolute;mso-position-vertical-relative:page" fillcolor="black" stroked="f">
+          <w10:wrap anchorx="page" anchory="page"/>
+          <w10:anchorlock/>
+        </v:rect>
+      </w:pict>
+    </w:r>
+    <w:r>
+      <w:rPr>
+        <w:noProof/>
+      </w:rPr>
+      <w:pict w14:anchorId="117FD1F2">
+        <v:shapetype id="_x0000_t202" coordsize="21600,21600" o:spt="202" path="m,l,21600r21600,l21600,xe">
+          <v:stroke joinstyle="miter"/>
+          <v:path gradientshapeok="t" o:connecttype="rect"/>
+        </v:shapetype>
+        <v:shape id="_x0000_s1029" type="#_x0000_t202" style="position:absolute;left:0;text-align:left;margin-left:734pt;margin-top:9.95pt;width:56pt;height:40pt;z-index:251658240;mso-wrap-style:tight;mso-position-horizontal:absolute;mso-position-horizontal-relative:page;mso-position-vertical:absolute;mso-position-vertical-relative:page" filled="f" strokeweight="1.25pt">
+          <v:textbox inset="0,8pt,0,0">
+            <w:txbxContent>
+              <w:p>
+                <w:pPr>
+                  <w:jc w:val="center"/>
+                  <w:rPr>
+                    <w:rFonts w:ascii="Arial" w:hAnsi="Arial" w:cs="Arial"/>
+                    <w:b/>
+                    <w:sz w:val="28"/>
+                  </w:rPr>
+                </w:pPr>
+                <w:r>
+                  <w:rPr>
+                    <w:rFonts w:ascii="Arial" w:hAnsi="Arial" w:cs="Arial"/>
+                    <w:b/>
+                    <w:sz w:val="28"/>
+                  </w:rPr>
+                  <w:t>SR-17</w:t>
+                </w:r>
+              </w:p>
+            </w:txbxContent>
+          </v:textbox>
+          <w10:wrap anchorx="page" anchory="page"/>
+          <w10:anchorlock/>
+        </v:shape>
+      </w:pict>
+    </w:r>
   </w:p>
 </w:hdr>
 </file>

</xml_diff>

<commit_message>
Blanks: repair Armenian text in print templates
</commit_message>
<xml_diff>
--- a/Отделения/ԱՆՈԹԱՅԻՆ/ԱՆՈԹԱՅԻՆ շարժ.docx
+++ b/Отделения/ԱՆՈԹԱՅԻՆ/ԱՆՈԹԱՅԻՆ շարժ.docx
@@ -182,7 +182,7 @@
           <w:szCs w:val="28"/>
           <w:lang w:val="hy-AM" w:bidi="hy-AM"/>
         </w:rPr>
-        <w:t>Ô±Õ†ÕˆÔ¹Ô±Õ…Ô»Õ†</w:t>
+        <w:t>ԱՆՈԹԱՅԻՆ</w:t>
       </w:r>
     </w:p>
     <w:p>
@@ -299,7 +299,7 @@
                 <w:sz w:val="20"/>
                 <w:szCs w:val="18"/>
               </w:rPr>
-              <w:t>ÔµÕ²Õ¥Õ¬</w:t>
+              <w:t>Եղել</w:t>
             </w:r>
             <w:proofErr w:type="spellEnd"/>
             <w:r>
@@ -310,7 +310,7 @@
                 <w:sz w:val="20"/>
                 <w:szCs w:val="18"/>
               </w:rPr>
-              <w:t xml:space="preserve"> Õ§</w:t>
+              <w:t xml:space="preserve"> է</w:t>
             </w:r>
           </w:p>
         </w:tc>
@@ -342,7 +342,7 @@
                 <w:sz w:val="20"/>
                 <w:szCs w:val="18"/>
               </w:rPr>
-              <w:t>Ô¸Õ¶Õ¤Õ¸Ö‚Õ¶Õ¾Õ¥Õ¬</w:t>
+              <w:t>Ընդունվել</w:t>
             </w:r>
             <w:proofErr w:type="spellEnd"/>
             <w:r>
@@ -353,7 +353,7 @@
                 <w:sz w:val="20"/>
                 <w:szCs w:val="18"/>
               </w:rPr>
-              <w:t xml:space="preserve"> Õ§</w:t>
+              <w:t xml:space="preserve"> է</w:t>
             </w:r>
           </w:p>
         </w:tc>
@@ -384,7 +384,7 @@
                 <w:sz w:val="20"/>
                 <w:szCs w:val="18"/>
               </w:rPr>
-              <w:t>Ô´/Ô³</w:t>
+              <w:t>Դ/Գ</w:t>
             </w:r>
           </w:p>
         </w:tc>
@@ -416,7 +416,7 @@
                 <w:sz w:val="20"/>
                 <w:szCs w:val="18"/>
               </w:rPr>
-              <w:t>ÕÕ¥Õ²Õ¡ÖƒÕ¸Õ­</w:t>
+              <w:t>Տեղափոխ</w:t>
             </w:r>
             <w:proofErr w:type="spellEnd"/>
           </w:p>
@@ -448,7 +448,7 @@
                 <w:sz w:val="20"/>
                 <w:szCs w:val="18"/>
               </w:rPr>
-              <w:t>Ô±Õ¼Õ¯Õ¡</w:t>
+              <w:t>Առկա</w:t>
             </w:r>
             <w:proofErr w:type="spellEnd"/>
             <w:r>
@@ -459,7 +459,7 @@
                 <w:sz w:val="20"/>
                 <w:szCs w:val="18"/>
               </w:rPr>
-              <w:t xml:space="preserve"> Õ§</w:t>
+              <w:t xml:space="preserve"> է</w:t>
             </w:r>
           </w:p>
         </w:tc>
@@ -490,17 +490,17 @@
                 <w:sz w:val="18"/>
                 <w:szCs w:val="18"/>
               </w:rPr>
-              <w:t>Õˆ</w:t>
-            </w:r>
-            <w:r>
-              <w:rPr>
-                <w:rFonts w:ascii="Sylfaen" w:hAnsi="Sylfaen"/>
-                <w:b/>
-                <w:color w:val="000000"/>
-                <w:sz w:val="18"/>
-                <w:szCs w:val="18"/>
-              </w:rPr>
-              <w:t>Ö€Õ¸Õ¶ÖÕ«Ö</w:t>
+              <w:t>Ո</w:t>
+            </w:r>
+            <w:r>
+              <w:rPr>
+                <w:rFonts w:ascii="Sylfaen" w:hAnsi="Sylfaen"/>
+                <w:b/>
+                <w:color w:val="000000"/>
+                <w:sz w:val="18"/>
+                <w:szCs w:val="18"/>
+              </w:rPr>
+              <w:t>րոնցից</w:t>
             </w:r>
             <w:proofErr w:type="spellEnd"/>
             <w:r>
@@ -522,7 +522,7 @@
                 <w:sz w:val="18"/>
                 <w:szCs w:val="18"/>
               </w:rPr>
-              <w:t>Õ¢Õ¸Ö‚ÕªÕ¡Õ¯Õ¡Õ¶</w:t>
+              <w:t>բուժական</w:t>
             </w:r>
             <w:proofErr w:type="spellEnd"/>
           </w:p>
@@ -644,7 +644,7 @@
                 <w:sz w:val="18"/>
                 <w:szCs w:val="18"/>
               </w:rPr>
-              <w:t>Ô¸Õ¶Õ¤Õ°</w:t>
+              <w:t>Ընդհ</w:t>
             </w:r>
             <w:proofErr w:type="spellEnd"/>
           </w:p>
@@ -676,7 +676,7 @@
                 <w:sz w:val="18"/>
                 <w:szCs w:val="18"/>
               </w:rPr>
-              <w:t>Ô¶Õ«Õ¶Õ®Õ¡Õ¼Õ¡ÕµÕ¸Õ²</w:t>
+              <w:t>Զինծառայող</w:t>
             </w:r>
             <w:proofErr w:type="spellEnd"/>
           </w:p>
@@ -708,7 +708,7 @@
                 <w:sz w:val="18"/>
                 <w:szCs w:val="18"/>
               </w:rPr>
-              <w:t>Ô¶/Õ€</w:t>
+              <w:t>Զ/Հ</w:t>
             </w:r>
           </w:p>
         </w:tc>
@@ -739,7 +739,7 @@
                 <w:sz w:val="18"/>
                 <w:szCs w:val="18"/>
               </w:rPr>
-              <w:t xml:space="preserve">Ô¶/Ô¾ </w:t>
+              <w:t xml:space="preserve">Զ/Ծ </w:t>
             </w:r>
             <w:proofErr w:type="spellStart"/>
             <w:r>
@@ -750,7 +750,7 @@
                 <w:sz w:val="18"/>
                 <w:szCs w:val="18"/>
               </w:rPr>
-              <w:t>Õ¨Õ¶Õ¿</w:t>
+              <w:t>ընտ</w:t>
             </w:r>
             <w:proofErr w:type="spellEnd"/>
           </w:p>
@@ -782,7 +782,7 @@
                 <w:sz w:val="18"/>
                 <w:szCs w:val="18"/>
               </w:rPr>
-              <w:t>Ô¶/ÕŠ</w:t>
+              <w:t>Զ/Պ</w:t>
             </w:r>
           </w:p>
         </w:tc>
@@ -813,7 +813,7 @@
                 <w:sz w:val="18"/>
                 <w:szCs w:val="18"/>
               </w:rPr>
-              <w:t>Õ”-Õ«</w:t>
+              <w:t>Ք-ի</w:t>
             </w:r>
           </w:p>
         </w:tc>
@@ -844,7 +844,7 @@
                 <w:sz w:val="18"/>
                 <w:szCs w:val="18"/>
               </w:rPr>
-              <w:t>Õ¡Ö€Õ±Õ¡Õ¯Õ¸Ö‚Ö€Õ¤Õ¸Ö‚Õ´</w:t>
+              <w:t>արձակուրդում</w:t>
             </w:r>
             <w:proofErr w:type="spellEnd"/>
           </w:p>
@@ -882,263 +882,263 @@
                 <w:sz w:val="18"/>
                 <w:szCs w:val="18"/>
               </w:rPr>
-              <w:t>Ô¸Õ†Ô´</w:t>
-            </w:r>
-          </w:p>
-        </w:tc>
-        <w:tc>
-          <w:tcPr>
-            <w:tcW w:w="717" w:type="dxa"/>
-            <w:shd w:val="solid" w:color="FFFFFF" w:fill="FFFFFF"/>
-            <w:vAlign w:val="center"/>
-          </w:tcPr>
-          <w:p>
-            <w:pPr>
-              <w:spacing w:after="0" w:line="240" w:lineRule="exact"/>
-              <w:jc w:val="center"/>
-              <w:rPr>
-                <w:rFonts w:ascii="Sylfaen" w:hAnsi="Sylfaen"/>
-                <w:b/>
-                <w:bCs/>
-                <w:color w:val="000000"/>
-                <w:sz w:val="18"/>
-                <w:szCs w:val="18"/>
-              </w:rPr>
-            </w:pPr>
-            <w:r>
-              <w:rPr>
-                <w:rFonts w:ascii="Sylfaen" w:hAnsi="Sylfaen"/>
-                <w:b/>
-                <w:bCs/>
-                <w:color w:val="000000"/>
-                <w:sz w:val="18"/>
-                <w:szCs w:val="18"/>
-              </w:rPr>
-              <w:t>Ô¶/Ô¾</w:t>
-            </w:r>
-          </w:p>
-        </w:tc>
-        <w:tc>
-          <w:tcPr>
-            <w:tcW w:w="717" w:type="dxa"/>
-            <w:shd w:val="solid" w:color="FFFFFF" w:fill="FFFFFF"/>
-            <w:vAlign w:val="center"/>
-          </w:tcPr>
-          <w:p>
-            <w:pPr>
-              <w:spacing w:after="0" w:line="240" w:lineRule="exact"/>
-              <w:jc w:val="center"/>
-              <w:rPr>
-                <w:rFonts w:ascii="Sylfaen" w:hAnsi="Sylfaen"/>
-                <w:b/>
-                <w:bCs/>
-                <w:color w:val="000000"/>
-                <w:sz w:val="18"/>
-                <w:szCs w:val="18"/>
-              </w:rPr>
-            </w:pPr>
-            <w:r>
-              <w:rPr>
-                <w:rFonts w:ascii="Sylfaen" w:hAnsi="Sylfaen"/>
-                <w:b/>
-                <w:bCs/>
-                <w:color w:val="000000"/>
-                <w:sz w:val="18"/>
-                <w:szCs w:val="18"/>
-              </w:rPr>
-              <w:t>Õ‡Ô±Õ</w:t>
-            </w:r>
-          </w:p>
-        </w:tc>
-        <w:tc>
-          <w:tcPr>
-            <w:tcW w:w="717" w:type="dxa"/>
-            <w:shd w:val="solid" w:color="FFFFFF" w:fill="FFFFFF"/>
-            <w:vAlign w:val="center"/>
-          </w:tcPr>
-          <w:p>
-            <w:pPr>
-              <w:spacing w:after="0" w:line="240" w:lineRule="exact"/>
-              <w:jc w:val="center"/>
-              <w:rPr>
-                <w:rFonts w:ascii="Sylfaen" w:hAnsi="Sylfaen"/>
-                <w:b/>
-                <w:bCs/>
-                <w:color w:val="000000"/>
-                <w:sz w:val="18"/>
-                <w:szCs w:val="18"/>
-              </w:rPr>
-            </w:pPr>
-            <w:r>
-              <w:rPr>
-                <w:rFonts w:ascii="Sylfaen" w:hAnsi="Sylfaen"/>
-                <w:b/>
-                <w:bCs/>
-                <w:color w:val="000000"/>
-                <w:sz w:val="18"/>
-                <w:szCs w:val="18"/>
-              </w:rPr>
-              <w:t>Ô¸Õ†Ô´</w:t>
-            </w:r>
-          </w:p>
-        </w:tc>
-        <w:tc>
-          <w:tcPr>
-            <w:tcW w:w="717" w:type="dxa"/>
-            <w:shd w:val="solid" w:color="FFFFFF" w:fill="FFFFFF"/>
-            <w:vAlign w:val="center"/>
-          </w:tcPr>
-          <w:p>
-            <w:pPr>
-              <w:spacing w:after="0" w:line="240" w:lineRule="exact"/>
-              <w:jc w:val="center"/>
-              <w:rPr>
-                <w:rFonts w:ascii="Sylfaen" w:hAnsi="Sylfaen"/>
-                <w:b/>
-                <w:bCs/>
-                <w:color w:val="000000"/>
-                <w:sz w:val="18"/>
-                <w:szCs w:val="18"/>
-              </w:rPr>
-            </w:pPr>
-            <w:r>
-              <w:rPr>
-                <w:rFonts w:ascii="Sylfaen" w:hAnsi="Sylfaen"/>
-                <w:b/>
-                <w:bCs/>
-                <w:color w:val="000000"/>
-                <w:sz w:val="18"/>
-                <w:szCs w:val="18"/>
-              </w:rPr>
-              <w:t>Ô¶/Ô¾</w:t>
-            </w:r>
-          </w:p>
-        </w:tc>
-        <w:tc>
-          <w:tcPr>
-            <w:tcW w:w="717" w:type="dxa"/>
-            <w:shd w:val="solid" w:color="FFFFFF" w:fill="FFFFFF"/>
-            <w:vAlign w:val="center"/>
-          </w:tcPr>
-          <w:p>
-            <w:pPr>
-              <w:spacing w:after="0" w:line="240" w:lineRule="exact"/>
-              <w:jc w:val="center"/>
-              <w:rPr>
-                <w:rFonts w:ascii="Sylfaen" w:hAnsi="Sylfaen"/>
-                <w:b/>
-                <w:bCs/>
-                <w:color w:val="000000"/>
-                <w:sz w:val="18"/>
-                <w:szCs w:val="18"/>
-              </w:rPr>
-            </w:pPr>
-            <w:r>
-              <w:rPr>
-                <w:rFonts w:ascii="Sylfaen" w:hAnsi="Sylfaen"/>
-                <w:b/>
-                <w:bCs/>
-                <w:color w:val="000000"/>
-                <w:sz w:val="18"/>
-                <w:szCs w:val="18"/>
-              </w:rPr>
-              <w:t>Õ‡Ô±Õ</w:t>
-            </w:r>
-          </w:p>
-        </w:tc>
-        <w:tc>
-          <w:tcPr>
-            <w:tcW w:w="717" w:type="dxa"/>
-            <w:shd w:val="solid" w:color="FFFFFF" w:fill="FFFFFF"/>
-            <w:vAlign w:val="center"/>
-          </w:tcPr>
-          <w:p>
-            <w:pPr>
-              <w:spacing w:after="0" w:line="240" w:lineRule="exact"/>
-              <w:jc w:val="center"/>
-              <w:rPr>
-                <w:rFonts w:ascii="Sylfaen" w:hAnsi="Sylfaen"/>
-                <w:b/>
-                <w:bCs/>
-                <w:color w:val="000000"/>
-                <w:sz w:val="18"/>
-                <w:szCs w:val="18"/>
-              </w:rPr>
-            </w:pPr>
-            <w:r>
-              <w:rPr>
-                <w:rFonts w:ascii="Sylfaen" w:hAnsi="Sylfaen"/>
-                <w:b/>
-                <w:bCs/>
-                <w:color w:val="000000"/>
-                <w:sz w:val="18"/>
-                <w:szCs w:val="18"/>
-              </w:rPr>
-              <w:t>Ô¸Õ†Ô´</w:t>
-            </w:r>
-          </w:p>
-        </w:tc>
-        <w:tc>
-          <w:tcPr>
-            <w:tcW w:w="717" w:type="dxa"/>
-            <w:shd w:val="solid" w:color="FFFFFF" w:fill="FFFFFF"/>
-            <w:vAlign w:val="center"/>
-          </w:tcPr>
-          <w:p>
-            <w:pPr>
-              <w:spacing w:after="0" w:line="240" w:lineRule="exact"/>
-              <w:jc w:val="center"/>
-              <w:rPr>
-                <w:rFonts w:ascii="Sylfaen" w:hAnsi="Sylfaen"/>
-                <w:b/>
-                <w:bCs/>
-                <w:color w:val="000000"/>
-                <w:sz w:val="18"/>
-                <w:szCs w:val="18"/>
-              </w:rPr>
-            </w:pPr>
-            <w:r>
-              <w:rPr>
-                <w:rFonts w:ascii="Sylfaen" w:hAnsi="Sylfaen"/>
-                <w:b/>
-                <w:bCs/>
-                <w:color w:val="000000"/>
-                <w:sz w:val="18"/>
-                <w:szCs w:val="18"/>
-              </w:rPr>
-              <w:t>Ô¶/Ô¾</w:t>
-            </w:r>
-          </w:p>
-        </w:tc>
-        <w:tc>
-          <w:tcPr>
-            <w:tcW w:w="717" w:type="dxa"/>
-            <w:shd w:val="solid" w:color="FFFFFF" w:fill="FFFFFF"/>
-            <w:vAlign w:val="center"/>
-          </w:tcPr>
-          <w:p>
-            <w:pPr>
-              <w:spacing w:after="0" w:line="240" w:lineRule="exact"/>
-              <w:jc w:val="center"/>
-              <w:rPr>
-                <w:rFonts w:ascii="Sylfaen" w:hAnsi="Sylfaen"/>
-                <w:b/>
-                <w:bCs/>
-                <w:color w:val="000000"/>
-                <w:sz w:val="18"/>
-                <w:szCs w:val="18"/>
-              </w:rPr>
-            </w:pPr>
-            <w:r>
-              <w:rPr>
-                <w:rFonts w:ascii="Sylfaen" w:hAnsi="Sylfaen"/>
-                <w:b/>
-                <w:bCs/>
-                <w:color w:val="000000"/>
-                <w:sz w:val="18"/>
-                <w:szCs w:val="18"/>
-              </w:rPr>
-              <w:t>Õ‡Ô±Õ</w:t>
+              <w:t>ԸՆԴ</w:t>
+            </w:r>
+          </w:p>
+        </w:tc>
+        <w:tc>
+          <w:tcPr>
+            <w:tcW w:w="717" w:type="dxa"/>
+            <w:shd w:val="solid" w:color="FFFFFF" w:fill="FFFFFF"/>
+            <w:vAlign w:val="center"/>
+          </w:tcPr>
+          <w:p>
+            <w:pPr>
+              <w:spacing w:after="0" w:line="240" w:lineRule="exact"/>
+              <w:jc w:val="center"/>
+              <w:rPr>
+                <w:rFonts w:ascii="Sylfaen" w:hAnsi="Sylfaen"/>
+                <w:b/>
+                <w:bCs/>
+                <w:color w:val="000000"/>
+                <w:sz w:val="18"/>
+                <w:szCs w:val="18"/>
+              </w:rPr>
+            </w:pPr>
+            <w:r>
+              <w:rPr>
+                <w:rFonts w:ascii="Sylfaen" w:hAnsi="Sylfaen"/>
+                <w:b/>
+                <w:bCs/>
+                <w:color w:val="000000"/>
+                <w:sz w:val="18"/>
+                <w:szCs w:val="18"/>
+              </w:rPr>
+              <w:t>Զ/Ծ</w:t>
+            </w:r>
+          </w:p>
+        </w:tc>
+        <w:tc>
+          <w:tcPr>
+            <w:tcW w:w="717" w:type="dxa"/>
+            <w:shd w:val="solid" w:color="FFFFFF" w:fill="FFFFFF"/>
+            <w:vAlign w:val="center"/>
+          </w:tcPr>
+          <w:p>
+            <w:pPr>
+              <w:spacing w:after="0" w:line="240" w:lineRule="exact"/>
+              <w:jc w:val="center"/>
+              <w:rPr>
+                <w:rFonts w:ascii="Sylfaen" w:hAnsi="Sylfaen"/>
+                <w:b/>
+                <w:bCs/>
+                <w:color w:val="000000"/>
+                <w:sz w:val="18"/>
+                <w:szCs w:val="18"/>
+              </w:rPr>
+            </w:pPr>
+            <w:r>
+              <w:rPr>
+                <w:rFonts w:ascii="Sylfaen" w:hAnsi="Sylfaen"/>
+                <w:b/>
+                <w:bCs/>
+                <w:color w:val="000000"/>
+                <w:sz w:val="18"/>
+                <w:szCs w:val="18"/>
+              </w:rPr>
+              <w:t>ՇԱՐ</w:t>
+            </w:r>
+          </w:p>
+        </w:tc>
+        <w:tc>
+          <w:tcPr>
+            <w:tcW w:w="717" w:type="dxa"/>
+            <w:shd w:val="solid" w:color="FFFFFF" w:fill="FFFFFF"/>
+            <w:vAlign w:val="center"/>
+          </w:tcPr>
+          <w:p>
+            <w:pPr>
+              <w:spacing w:after="0" w:line="240" w:lineRule="exact"/>
+              <w:jc w:val="center"/>
+              <w:rPr>
+                <w:rFonts w:ascii="Sylfaen" w:hAnsi="Sylfaen"/>
+                <w:b/>
+                <w:bCs/>
+                <w:color w:val="000000"/>
+                <w:sz w:val="18"/>
+                <w:szCs w:val="18"/>
+              </w:rPr>
+            </w:pPr>
+            <w:r>
+              <w:rPr>
+                <w:rFonts w:ascii="Sylfaen" w:hAnsi="Sylfaen"/>
+                <w:b/>
+                <w:bCs/>
+                <w:color w:val="000000"/>
+                <w:sz w:val="18"/>
+                <w:szCs w:val="18"/>
+              </w:rPr>
+              <w:t>ԸՆԴ</w:t>
+            </w:r>
+          </w:p>
+        </w:tc>
+        <w:tc>
+          <w:tcPr>
+            <w:tcW w:w="717" w:type="dxa"/>
+            <w:shd w:val="solid" w:color="FFFFFF" w:fill="FFFFFF"/>
+            <w:vAlign w:val="center"/>
+          </w:tcPr>
+          <w:p>
+            <w:pPr>
+              <w:spacing w:after="0" w:line="240" w:lineRule="exact"/>
+              <w:jc w:val="center"/>
+              <w:rPr>
+                <w:rFonts w:ascii="Sylfaen" w:hAnsi="Sylfaen"/>
+                <w:b/>
+                <w:bCs/>
+                <w:color w:val="000000"/>
+                <w:sz w:val="18"/>
+                <w:szCs w:val="18"/>
+              </w:rPr>
+            </w:pPr>
+            <w:r>
+              <w:rPr>
+                <w:rFonts w:ascii="Sylfaen" w:hAnsi="Sylfaen"/>
+                <w:b/>
+                <w:bCs/>
+                <w:color w:val="000000"/>
+                <w:sz w:val="18"/>
+                <w:szCs w:val="18"/>
+              </w:rPr>
+              <w:t>Զ/Ծ</w:t>
+            </w:r>
+          </w:p>
+        </w:tc>
+        <w:tc>
+          <w:tcPr>
+            <w:tcW w:w="717" w:type="dxa"/>
+            <w:shd w:val="solid" w:color="FFFFFF" w:fill="FFFFFF"/>
+            <w:vAlign w:val="center"/>
+          </w:tcPr>
+          <w:p>
+            <w:pPr>
+              <w:spacing w:after="0" w:line="240" w:lineRule="exact"/>
+              <w:jc w:val="center"/>
+              <w:rPr>
+                <w:rFonts w:ascii="Sylfaen" w:hAnsi="Sylfaen"/>
+                <w:b/>
+                <w:bCs/>
+                <w:color w:val="000000"/>
+                <w:sz w:val="18"/>
+                <w:szCs w:val="18"/>
+              </w:rPr>
+            </w:pPr>
+            <w:r>
+              <w:rPr>
+                <w:rFonts w:ascii="Sylfaen" w:hAnsi="Sylfaen"/>
+                <w:b/>
+                <w:bCs/>
+                <w:color w:val="000000"/>
+                <w:sz w:val="18"/>
+                <w:szCs w:val="18"/>
+              </w:rPr>
+              <w:t>ՇԱՐ</w:t>
+            </w:r>
+          </w:p>
+        </w:tc>
+        <w:tc>
+          <w:tcPr>
+            <w:tcW w:w="717" w:type="dxa"/>
+            <w:shd w:val="solid" w:color="FFFFFF" w:fill="FFFFFF"/>
+            <w:vAlign w:val="center"/>
+          </w:tcPr>
+          <w:p>
+            <w:pPr>
+              <w:spacing w:after="0" w:line="240" w:lineRule="exact"/>
+              <w:jc w:val="center"/>
+              <w:rPr>
+                <w:rFonts w:ascii="Sylfaen" w:hAnsi="Sylfaen"/>
+                <w:b/>
+                <w:bCs/>
+                <w:color w:val="000000"/>
+                <w:sz w:val="18"/>
+                <w:szCs w:val="18"/>
+              </w:rPr>
+            </w:pPr>
+            <w:r>
+              <w:rPr>
+                <w:rFonts w:ascii="Sylfaen" w:hAnsi="Sylfaen"/>
+                <w:b/>
+                <w:bCs/>
+                <w:color w:val="000000"/>
+                <w:sz w:val="18"/>
+                <w:szCs w:val="18"/>
+              </w:rPr>
+              <w:t>ԸՆԴ</w:t>
+            </w:r>
+          </w:p>
+        </w:tc>
+        <w:tc>
+          <w:tcPr>
+            <w:tcW w:w="717" w:type="dxa"/>
+            <w:shd w:val="solid" w:color="FFFFFF" w:fill="FFFFFF"/>
+            <w:vAlign w:val="center"/>
+          </w:tcPr>
+          <w:p>
+            <w:pPr>
+              <w:spacing w:after="0" w:line="240" w:lineRule="exact"/>
+              <w:jc w:val="center"/>
+              <w:rPr>
+                <w:rFonts w:ascii="Sylfaen" w:hAnsi="Sylfaen"/>
+                <w:b/>
+                <w:bCs/>
+                <w:color w:val="000000"/>
+                <w:sz w:val="18"/>
+                <w:szCs w:val="18"/>
+              </w:rPr>
+            </w:pPr>
+            <w:r>
+              <w:rPr>
+                <w:rFonts w:ascii="Sylfaen" w:hAnsi="Sylfaen"/>
+                <w:b/>
+                <w:bCs/>
+                <w:color w:val="000000"/>
+                <w:sz w:val="18"/>
+                <w:szCs w:val="18"/>
+              </w:rPr>
+              <w:t>Զ/Ծ</w:t>
+            </w:r>
+          </w:p>
+        </w:tc>
+        <w:tc>
+          <w:tcPr>
+            <w:tcW w:w="717" w:type="dxa"/>
+            <w:shd w:val="solid" w:color="FFFFFF" w:fill="FFFFFF"/>
+            <w:vAlign w:val="center"/>
+          </w:tcPr>
+          <w:p>
+            <w:pPr>
+              <w:spacing w:after="0" w:line="240" w:lineRule="exact"/>
+              <w:jc w:val="center"/>
+              <w:rPr>
+                <w:rFonts w:ascii="Sylfaen" w:hAnsi="Sylfaen"/>
+                <w:b/>
+                <w:bCs/>
+                <w:color w:val="000000"/>
+                <w:sz w:val="18"/>
+                <w:szCs w:val="18"/>
+              </w:rPr>
+            </w:pPr>
+            <w:r>
+              <w:rPr>
+                <w:rFonts w:ascii="Sylfaen" w:hAnsi="Sylfaen"/>
+                <w:b/>
+                <w:bCs/>
+                <w:color w:val="000000"/>
+                <w:sz w:val="18"/>
+                <w:szCs w:val="18"/>
+              </w:rPr>
+              <w:t>ՇԱՐ</w:t>
             </w:r>
           </w:p>
         </w:tc>
@@ -1171,7 +1171,7 @@
                 <w:sz w:val="16"/>
                 <w:szCs w:val="18"/>
               </w:rPr>
-              <w:t>ÕÕ¥Õ²Õ¡Öƒ</w:t>
+              <w:t>Տեղափ</w:t>
             </w:r>
             <w:proofErr w:type="spellEnd"/>
             <w:r>
@@ -1195,7 +1195,7 @@
                 <w:sz w:val="16"/>
                 <w:szCs w:val="18"/>
               </w:rPr>
-              <w:t>Õ¢Õ¡ÕªÕ¶Õ«Ö</w:t>
+              <w:t>բաժնից</w:t>
             </w:r>
             <w:proofErr w:type="spellEnd"/>
           </w:p>
@@ -1229,7 +1229,7 @@
                 <w:sz w:val="16"/>
                 <w:szCs w:val="18"/>
               </w:rPr>
-              <w:t>ÕÕ¥Õ²Õ¡Öƒ</w:t>
+              <w:t>Տեղափ</w:t>
             </w:r>
             <w:proofErr w:type="spellEnd"/>
             <w:r>
@@ -1253,7 +1253,7 @@
                 <w:sz w:val="16"/>
                 <w:szCs w:val="18"/>
               </w:rPr>
-              <w:t>Õ¢Õ¡ÕªÕ«Õ¶</w:t>
+              <w:t>բաժին</w:t>
             </w:r>
             <w:proofErr w:type="spellEnd"/>
           </w:p>
@@ -1308,71 +1308,71 @@
                 <w:sz w:val="18"/>
                 <w:szCs w:val="18"/>
               </w:rPr>
-              <w:t>Õ‡Ô±Õ</w:t>
-            </w:r>
-          </w:p>
-        </w:tc>
-        <w:tc>
-          <w:tcPr>
-            <w:tcW w:w="717" w:type="dxa"/>
-            <w:shd w:val="solid" w:color="FFFFFF" w:fill="FFFFFF"/>
-            <w:vAlign w:val="center"/>
-          </w:tcPr>
-          <w:p>
-            <w:pPr>
-              <w:spacing w:after="0" w:line="240" w:lineRule="exact"/>
-              <w:jc w:val="center"/>
-              <w:rPr>
-                <w:rFonts w:ascii="Sylfaen" w:hAnsi="Sylfaen"/>
-                <w:b/>
-                <w:bCs/>
-                <w:color w:val="000000"/>
-                <w:sz w:val="18"/>
-                <w:szCs w:val="18"/>
-              </w:rPr>
-            </w:pPr>
-            <w:r>
-              <w:rPr>
-                <w:rFonts w:ascii="Sylfaen" w:hAnsi="Sylfaen"/>
-                <w:b/>
-                <w:bCs/>
-                <w:color w:val="000000"/>
-                <w:sz w:val="18"/>
-                <w:szCs w:val="18"/>
-              </w:rPr>
-              <w:t>ÕÕŠÔ±</w:t>
-            </w:r>
-          </w:p>
-        </w:tc>
-        <w:tc>
-          <w:tcPr>
-            <w:tcW w:w="717" w:type="dxa"/>
-            <w:shd w:val="solid" w:color="FFFFFF" w:fill="FFFFFF"/>
-            <w:vAlign w:val="center"/>
-          </w:tcPr>
-          <w:p>
-            <w:pPr>
-              <w:spacing w:after="0" w:line="240" w:lineRule="exact"/>
-              <w:jc w:val="center"/>
-              <w:rPr>
-                <w:rFonts w:ascii="Sylfaen" w:hAnsi="Sylfaen"/>
-                <w:b/>
-                <w:bCs/>
-                <w:color w:val="000000"/>
-                <w:sz w:val="18"/>
-                <w:szCs w:val="18"/>
-              </w:rPr>
-            </w:pPr>
-            <w:r>
-              <w:rPr>
-                <w:rFonts w:ascii="Sylfaen" w:hAnsi="Sylfaen"/>
-                <w:b/>
-                <w:bCs/>
-                <w:color w:val="000000"/>
-                <w:sz w:val="18"/>
-                <w:szCs w:val="18"/>
-              </w:rPr>
-              <w:t>ÕŠÔ±Õ…Õ„</w:t>
+              <w:t>ՇԱՐ</w:t>
+            </w:r>
+          </w:p>
+        </w:tc>
+        <w:tc>
+          <w:tcPr>
+            <w:tcW w:w="717" w:type="dxa"/>
+            <w:shd w:val="solid" w:color="FFFFFF" w:fill="FFFFFF"/>
+            <w:vAlign w:val="center"/>
+          </w:tcPr>
+          <w:p>
+            <w:pPr>
+              <w:spacing w:after="0" w:line="240" w:lineRule="exact"/>
+              <w:jc w:val="center"/>
+              <w:rPr>
+                <w:rFonts w:ascii="Sylfaen" w:hAnsi="Sylfaen"/>
+                <w:b/>
+                <w:bCs/>
+                <w:color w:val="000000"/>
+                <w:sz w:val="18"/>
+                <w:szCs w:val="18"/>
+              </w:rPr>
+            </w:pPr>
+            <w:r>
+              <w:rPr>
+                <w:rFonts w:ascii="Sylfaen" w:hAnsi="Sylfaen"/>
+                <w:b/>
+                <w:bCs/>
+                <w:color w:val="000000"/>
+                <w:sz w:val="18"/>
+                <w:szCs w:val="18"/>
+              </w:rPr>
+              <w:t>ՍՊԱ</w:t>
+            </w:r>
+          </w:p>
+        </w:tc>
+        <w:tc>
+          <w:tcPr>
+            <w:tcW w:w="717" w:type="dxa"/>
+            <w:shd w:val="solid" w:color="FFFFFF" w:fill="FFFFFF"/>
+            <w:vAlign w:val="center"/>
+          </w:tcPr>
+          <w:p>
+            <w:pPr>
+              <w:spacing w:after="0" w:line="240" w:lineRule="exact"/>
+              <w:jc w:val="center"/>
+              <w:rPr>
+                <w:rFonts w:ascii="Sylfaen" w:hAnsi="Sylfaen"/>
+                <w:b/>
+                <w:bCs/>
+                <w:color w:val="000000"/>
+                <w:sz w:val="18"/>
+                <w:szCs w:val="18"/>
+              </w:rPr>
+            </w:pPr>
+            <w:r>
+              <w:rPr>
+                <w:rFonts w:ascii="Sylfaen" w:hAnsi="Sylfaen"/>
+                <w:b/>
+                <w:bCs/>
+                <w:color w:val="000000"/>
+                <w:sz w:val="18"/>
+                <w:szCs w:val="18"/>
+              </w:rPr>
+              <w:t>ՊԱՅՄ</w:t>
             </w:r>
           </w:p>
         </w:tc>
@@ -1492,71 +1492,71 @@
                 <w:sz w:val="18"/>
                 <w:szCs w:val="18"/>
               </w:rPr>
-              <w:t>Õ‡Ô±Õ</w:t>
-            </w:r>
-          </w:p>
-        </w:tc>
-        <w:tc>
-          <w:tcPr>
-            <w:tcW w:w="717" w:type="dxa"/>
-            <w:shd w:val="solid" w:color="FFFFFF" w:fill="FFFFFF"/>
-            <w:vAlign w:val="center"/>
-          </w:tcPr>
-          <w:p>
-            <w:pPr>
-              <w:spacing w:after="0" w:line="240" w:lineRule="exact"/>
-              <w:jc w:val="center"/>
-              <w:rPr>
-                <w:rFonts w:ascii="Sylfaen" w:hAnsi="Sylfaen"/>
-                <w:b/>
-                <w:bCs/>
-                <w:color w:val="000000"/>
-                <w:sz w:val="18"/>
-                <w:szCs w:val="18"/>
-              </w:rPr>
-            </w:pPr>
-            <w:r>
-              <w:rPr>
-                <w:rFonts w:ascii="Sylfaen" w:hAnsi="Sylfaen"/>
-                <w:b/>
-                <w:bCs/>
-                <w:color w:val="000000"/>
-                <w:sz w:val="18"/>
-                <w:szCs w:val="18"/>
-              </w:rPr>
-              <w:t>ÕÕŠÔ±</w:t>
-            </w:r>
-          </w:p>
-        </w:tc>
-        <w:tc>
-          <w:tcPr>
-            <w:tcW w:w="717" w:type="dxa"/>
-            <w:shd w:val="solid" w:color="FFFFFF" w:fill="FFFFFF"/>
-            <w:vAlign w:val="center"/>
-          </w:tcPr>
-          <w:p>
-            <w:pPr>
-              <w:spacing w:after="0" w:line="240" w:lineRule="exact"/>
-              <w:jc w:val="center"/>
-              <w:rPr>
-                <w:rFonts w:ascii="Sylfaen" w:hAnsi="Sylfaen"/>
-                <w:b/>
-                <w:bCs/>
-                <w:color w:val="000000"/>
-                <w:sz w:val="18"/>
-                <w:szCs w:val="18"/>
-              </w:rPr>
-            </w:pPr>
-            <w:r>
-              <w:rPr>
-                <w:rFonts w:ascii="Sylfaen" w:hAnsi="Sylfaen"/>
-                <w:b/>
-                <w:bCs/>
-                <w:color w:val="000000"/>
-                <w:sz w:val="18"/>
-                <w:szCs w:val="18"/>
-              </w:rPr>
-              <w:t>ÕŠÔ±Õ…Õ„</w:t>
+              <w:t>ՇԱՐ</w:t>
+            </w:r>
+          </w:p>
+        </w:tc>
+        <w:tc>
+          <w:tcPr>
+            <w:tcW w:w="717" w:type="dxa"/>
+            <w:shd w:val="solid" w:color="FFFFFF" w:fill="FFFFFF"/>
+            <w:vAlign w:val="center"/>
+          </w:tcPr>
+          <w:p>
+            <w:pPr>
+              <w:spacing w:after="0" w:line="240" w:lineRule="exact"/>
+              <w:jc w:val="center"/>
+              <w:rPr>
+                <w:rFonts w:ascii="Sylfaen" w:hAnsi="Sylfaen"/>
+                <w:b/>
+                <w:bCs/>
+                <w:color w:val="000000"/>
+                <w:sz w:val="18"/>
+                <w:szCs w:val="18"/>
+              </w:rPr>
+            </w:pPr>
+            <w:r>
+              <w:rPr>
+                <w:rFonts w:ascii="Sylfaen" w:hAnsi="Sylfaen"/>
+                <w:b/>
+                <w:bCs/>
+                <w:color w:val="000000"/>
+                <w:sz w:val="18"/>
+                <w:szCs w:val="18"/>
+              </w:rPr>
+              <w:t>ՍՊԱ</w:t>
+            </w:r>
+          </w:p>
+        </w:tc>
+        <w:tc>
+          <w:tcPr>
+            <w:tcW w:w="717" w:type="dxa"/>
+            <w:shd w:val="solid" w:color="FFFFFF" w:fill="FFFFFF"/>
+            <w:vAlign w:val="center"/>
+          </w:tcPr>
+          <w:p>
+            <w:pPr>
+              <w:spacing w:after="0" w:line="240" w:lineRule="exact"/>
+              <w:jc w:val="center"/>
+              <w:rPr>
+                <w:rFonts w:ascii="Sylfaen" w:hAnsi="Sylfaen"/>
+                <w:b/>
+                <w:bCs/>
+                <w:color w:val="000000"/>
+                <w:sz w:val="18"/>
+                <w:szCs w:val="18"/>
+              </w:rPr>
+            </w:pPr>
+            <w:r>
+              <w:rPr>
+                <w:rFonts w:ascii="Sylfaen" w:hAnsi="Sylfaen"/>
+                <w:b/>
+                <w:bCs/>
+                <w:color w:val="000000"/>
+                <w:sz w:val="18"/>
+                <w:szCs w:val="18"/>
+              </w:rPr>
+              <w:t>ՊԱՅՄ</w:t>
             </w:r>
           </w:p>
         </w:tc>
@@ -2036,7 +2036,7 @@
                 <w:color w:val="000000"/>
                 <w:lang w:val="hy-AM" w:bidi="hy-AM"/>
               </w:rPr>
-              <w:t>Ô¸Õ¶Õ¤Õ¸Ö‚Õ¶Õ¾Õ¡Õ® Õ°Õ«Õ¾Õ¡Õ¶Õ¤Õ¶Õ¥Ö€</w:t>
+              <w:t>Ընդունված հիվանդներ</w:t>
             </w:r>
           </w:p>
           <w:p>
@@ -2140,7 +2140,7 @@
                 <w:color w:val="000000"/>
                 <w:lang w:val="hy-AM" w:bidi="hy-AM"/>
               </w:rPr>
-              <w:t>Ô´Õ¸Ö‚Ö€Õ½ Õ£Ö€Õ¾Õ¡Õ® Õ°Õ«Õ¾Õ¡Õ¶Õ¤Õ¶Õ¥Ö€</w:t>
+              <w:t>Դուրս գրված հիվանդներ</w:t>
             </w:r>
           </w:p>
           <w:p>
@@ -2265,7 +2265,7 @@
                 <w:color w:val="000000"/>
                 <w:lang w:val="hy-AM" w:bidi="hy-AM"/>
               </w:rPr>
-              <w:t>ÕÕ¥Õ²Õ¡ÖƒÕ¸Õ­Õ¾Õ¡Õ® Õ°Õ«Õ¾Õ¡Õ¶Õ¤Õ¶Õ¥Ö€</w:t>
+              <w:t>Տեղափոխված հիվանդներ</w:t>
             </w:r>
           </w:p>
           <w:p>
@@ -2369,7 +2369,7 @@
                 <w:color w:val="000000"/>
                 <w:lang w:val="hy-AM" w:bidi="hy-AM"/>
               </w:rPr>
-              <w:t>ÕŽÕ¥Ö€Õ¡Õ¤Õ¡Ö€Õ±Õ¥Õ¬ Õ¥Õ¶ Õ¡Ö€Õ±Õ¡Õ¯Õ¸Ö‚Ö€Õ¤Õ«Ö</w:t>
+              <w:t>Վերադարձել են արձակուրդից</w:t>
             </w:r>
           </w:p>
           <w:p>
@@ -2478,7 +2478,7 @@
                 <w:color w:val="000000"/>
                 <w:lang w:val="hy-AM" w:bidi="hy-AM"/>
               </w:rPr>
-              <w:t>Ô´Õ¸Ö‚Ö€Õ½Õ£Ö€Õ¾Õ¡Õ®-Õ¹Õ¿Õ¡Ö€Õ¾Õ¡Õ®</w:t>
+              <w:t>Դուրսգրված-չտարված</w:t>
             </w:r>
           </w:p>
           <w:p>
@@ -2582,7 +2582,7 @@
                 <w:color w:val="000000"/>
                 <w:lang w:val="hy-AM" w:bidi="hy-AM"/>
               </w:rPr>
-              <w:t>Ô³Õ¶Õ¡ÖÕ¥Õ¬ Õ¥Õ¶ Õ¡Ö€Õ±Õ¡Õ¯Õ¸Ö‚Ö€Õ¤</w:t>
+              <w:t>Գնացել են արձակուրդ</w:t>
             </w:r>
           </w:p>
           <w:p>
@@ -2702,7 +2702,7 @@
                       <w:color w:val="000000"/>
                       <w:sz w:val="18"/>
                     </w:rPr>
-                    <w:t>Ô±Õ´Õ½Õ¡Õ©Õ«Õ¾</w:t>
+                    <w:t>Ամսաթիվ</w:t>
                   </w:r>
                   <w:proofErr w:type="spellEnd"/>
                   <w:r>
@@ -2720,7 +2720,7 @@
                       <w:color w:val="000000"/>
                       <w:sz w:val="18"/>
                     </w:rPr>
-                    <w:t>Õ€Õ¥Ö€Õ©Õ¡ÕºÕ¡Õ°</w:t>
+                    <w:t>Հերթապահ</w:t>
                   </w:r>
                   <w:proofErr w:type="spellEnd"/>
                   <w:r>

</xml_diff>